<commit_message>
add many invoices -> analysis -> summary report
</commit_message>
<xml_diff>
--- a/Info_project/AI + ML + Automation + Data Project.docx
+++ b/Info_project/AI + ML + Automation + Data Project.docx
@@ -4437,7 +4437,6 @@
       <w:pPr>
         <w:rPr>
           <w:b/>
-          <w:lang w:val="en-US"/>
         </w:rPr>
       </w:pPr>
       <w:proofErr w:type="spellStart"/>
@@ -4445,71 +4444,69 @@
       <w:r>
         <w:rPr>
           <w:b/>
-          <w:lang w:val="en-US"/>
         </w:rPr>
         <w:t>main</w:t>
       </w:r>
       <w:proofErr w:type="spellEnd"/>
-      <w:r>
-        <w:rPr>
-          <w:b/>
-          <w:lang w:val="en-US"/>
+      <w:proofErr w:type="gramEnd"/>
+      <w:r>
+        <w:rPr>
+          <w:b/>
         </w:rPr>
         <w:t>()</w:t>
       </w:r>
+    </w:p>
+    <w:p>
+      <w:pPr>
+        <w:rPr>
+          <w:lang w:val="en-US"/>
+        </w:rPr>
+      </w:pPr>
+      <w:r>
+        <w:t xml:space="preserve">Pensa nela como a “gerente” do programa. </w:t>
+      </w:r>
+      <w:proofErr w:type="spellStart"/>
+      <w:r>
+        <w:rPr>
+          <w:lang w:val="en-US"/>
+        </w:rPr>
+        <w:t>Em</w:t>
+      </w:r>
+      <w:proofErr w:type="spellEnd"/>
+      <w:r>
+        <w:rPr>
+          <w:lang w:val="en-US"/>
+        </w:rPr>
+        <w:t xml:space="preserve"> </w:t>
+      </w:r>
+      <w:proofErr w:type="spellStart"/>
+      <w:r>
+        <w:rPr>
+          <w:lang w:val="en-US"/>
+        </w:rPr>
+        <w:t>inglês</w:t>
+      </w:r>
+      <w:proofErr w:type="spellEnd"/>
+      <w:r>
+        <w:rPr>
+          <w:lang w:val="en-US"/>
+        </w:rPr>
+        <w:t xml:space="preserve"> A2:</w:t>
+      </w:r>
+      <w:r>
+        <w:rPr>
+          <w:lang w:val="en-US"/>
+        </w:rPr>
+        <w:t xml:space="preserve"> </w:t>
+      </w:r>
+      <w:proofErr w:type="gramStart"/>
+      <w:r>
+        <w:rPr>
+          <w:lang w:val="en-US"/>
+        </w:rPr>
+        <w:t>main(</w:t>
+      </w:r>
       <w:proofErr w:type="gramEnd"/>
-    </w:p>
-    <w:p>
-      <w:pPr>
-        <w:rPr>
-          <w:lang w:val="en-US"/>
-        </w:rPr>
-      </w:pPr>
-      <w:r>
-        <w:t xml:space="preserve">Pensa nela como a “gerente” do programa. </w:t>
-      </w:r>
-      <w:proofErr w:type="spellStart"/>
-      <w:r>
-        <w:rPr>
-          <w:lang w:val="en-US"/>
-        </w:rPr>
-        <w:t>Em</w:t>
-      </w:r>
-      <w:proofErr w:type="spellEnd"/>
-      <w:r>
-        <w:rPr>
-          <w:lang w:val="en-US"/>
-        </w:rPr>
-        <w:t xml:space="preserve"> </w:t>
-      </w:r>
-      <w:proofErr w:type="spellStart"/>
-      <w:r>
-        <w:rPr>
-          <w:lang w:val="en-US"/>
-        </w:rPr>
-        <w:t>inglês</w:t>
-      </w:r>
-      <w:proofErr w:type="spellEnd"/>
-      <w:r>
-        <w:rPr>
-          <w:lang w:val="en-US"/>
-        </w:rPr>
-        <w:t xml:space="preserve"> A2:</w:t>
-      </w:r>
-      <w:r>
-        <w:rPr>
-          <w:lang w:val="en-US"/>
-        </w:rPr>
-        <w:t xml:space="preserve"> </w:t>
-      </w:r>
-      <w:proofErr w:type="gramStart"/>
-      <w:r>
-        <w:rPr>
-          <w:lang w:val="en-US"/>
-        </w:rPr>
-        <w:t>main(</w:t>
-      </w:r>
-      <w:proofErr w:type="gramEnd"/>
       <w:r>
         <w:rPr>
           <w:lang w:val="en-US"/>
@@ -4517,7 +4514,13 @@
         <w:t>) controls the program flow. It calls the other functions.</w:t>
       </w:r>
     </w:p>
-    <w:p/>
+    <w:p>
+      <w:pPr>
+        <w:rPr>
+          <w:lang w:val="en-US"/>
+        </w:rPr>
+      </w:pPr>
+    </w:p>
     <w:p>
       <w:pPr>
         <w:pBdr>
@@ -4528,16 +4531,64 @@
         </w:pBdr>
         <w:shd w:val="clear" w:color="auto" w:fill="181818"/>
         <w:spacing w:before="100" w:beforeAutospacing="1" w:after="100" w:afterAutospacing="1" w:line="330" w:lineRule="atLeast"/>
-      </w:pPr>
-      <w:r>
-        <w:t>Mas pense assim:</w:t>
+        <w:rPr>
+          <w:lang w:val="en-US"/>
+        </w:rPr>
+      </w:pPr>
+      <w:proofErr w:type="gramStart"/>
+      <w:r>
+        <w:rPr>
+          <w:lang w:val="en-US"/>
+        </w:rPr>
+        <w:t>Mas</w:t>
+      </w:r>
+      <w:proofErr w:type="gramEnd"/>
+      <w:r>
+        <w:rPr>
+          <w:lang w:val="en-US"/>
+        </w:rPr>
+        <w:t xml:space="preserve"> </w:t>
+      </w:r>
+      <w:proofErr w:type="spellStart"/>
+      <w:r>
+        <w:rPr>
+          <w:lang w:val="en-US"/>
+        </w:rPr>
+        <w:t>pense</w:t>
+      </w:r>
+      <w:proofErr w:type="spellEnd"/>
+      <w:r>
+        <w:rPr>
+          <w:lang w:val="en-US"/>
+        </w:rPr>
+        <w:t xml:space="preserve"> </w:t>
+      </w:r>
+      <w:proofErr w:type="spellStart"/>
+      <w:r>
+        <w:rPr>
+          <w:lang w:val="en-US"/>
+        </w:rPr>
+        <w:t>assim</w:t>
+      </w:r>
+      <w:proofErr w:type="spellEnd"/>
+      <w:r>
+        <w:rPr>
+          <w:lang w:val="en-US"/>
+        </w:rPr>
+        <w:t>:</w:t>
       </w:r>
     </w:p>
     <w:p>
       <w:pPr>
         <w:spacing w:line="240" w:lineRule="auto"/>
-      </w:pPr>
-      <w:r>
+        <w:rPr>
+          <w:lang w:val="en-US"/>
+        </w:rPr>
+      </w:pPr>
+      <w:r>
+        <w:rPr>
+          <w:lang w:val="en-US"/>
+        </w:rPr>
         <w:t>If this file is the main file, run the program.</w:t>
       </w:r>
     </w:p>
@@ -4611,46 +4662,267 @@
         </w:pBdr>
         <w:shd w:val="clear" w:color="auto" w:fill="181818"/>
         <w:spacing w:before="100" w:beforeAutospacing="1" w:after="100" w:afterAutospacing="1" w:line="330" w:lineRule="atLeast"/>
-      </w:pPr>
-      <w:proofErr w:type="spellStart"/>
-      <w:r>
+        <w:rPr>
+          <w:lang w:val="en-US"/>
+        </w:rPr>
+      </w:pPr>
+      <w:proofErr w:type="spellStart"/>
+      <w:r>
+        <w:rPr>
+          <w:lang w:val="en-US"/>
+        </w:rPr>
         <w:t>Exemplo</w:t>
       </w:r>
       <w:proofErr w:type="spellEnd"/>
       <w:r>
+        <w:rPr>
+          <w:lang w:val="en-US"/>
+        </w:rPr>
         <w:t xml:space="preserve"> </w:t>
       </w:r>
       <w:proofErr w:type="spellStart"/>
       <w:r>
+        <w:rPr>
+          <w:lang w:val="en-US"/>
+        </w:rPr>
         <w:t>futuro</w:t>
       </w:r>
       <w:proofErr w:type="spellEnd"/>
       <w:r>
+        <w:rPr>
+          <w:lang w:val="en-US"/>
+        </w:rPr>
         <w:t>:</w:t>
       </w:r>
     </w:p>
     <w:p>
       <w:pPr>
         <w:spacing w:line="240" w:lineRule="auto"/>
-      </w:pPr>
-      <w:r>
+        <w:rPr>
+          <w:lang w:val="en-US"/>
+        </w:rPr>
+      </w:pPr>
+      <w:r>
+        <w:rPr>
+          <w:lang w:val="en-US"/>
+        </w:rPr>
         <w:t xml:space="preserve">Flask imports </w:t>
       </w:r>
       <w:proofErr w:type="spellStart"/>
       <w:r>
-        <w:t>extract_invoice_fields</w:t>
-      </w:r>
-      <w:proofErr w:type="spellEnd"/>
-      <w:r>
-        <w:t xml:space="preserve">() Flask imports </w:t>
-      </w:r>
-      <w:proofErr w:type="spellStart"/>
-      <w:r>
+        <w:rPr>
+          <w:lang w:val="en-US"/>
+        </w:rPr>
+        <w:t>extract_invoice_</w:t>
+      </w:r>
+      <w:proofErr w:type="gramStart"/>
+      <w:r>
+        <w:rPr>
+          <w:lang w:val="en-US"/>
+        </w:rPr>
+        <w:t>fields</w:t>
+      </w:r>
+      <w:proofErr w:type="spellEnd"/>
+      <w:r>
+        <w:rPr>
+          <w:lang w:val="en-US"/>
+        </w:rPr>
+        <w:t>(</w:t>
+      </w:r>
+      <w:proofErr w:type="gramEnd"/>
+      <w:r>
+        <w:rPr>
+          <w:lang w:val="en-US"/>
+        </w:rPr>
+        <w:t xml:space="preserve">) Flask imports </w:t>
+      </w:r>
+      <w:proofErr w:type="spellStart"/>
+      <w:r>
+        <w:rPr>
+          <w:lang w:val="en-US"/>
+        </w:rPr>
         <w:t>validate_invoice</w:t>
       </w:r>
       <w:proofErr w:type="spellEnd"/>
       <w:r>
+        <w:rPr>
+          <w:lang w:val="en-US"/>
+        </w:rPr>
         <w:t>()</w:t>
+      </w:r>
+    </w:p>
+    <w:p>
+      <w:pPr>
+        <w:spacing w:line="240" w:lineRule="auto"/>
+        <w:rPr>
+          <w:lang w:val="en-US"/>
+        </w:rPr>
+      </w:pPr>
+      <w:r>
+        <w:rPr>
+          <w:lang w:val="en-US"/>
+        </w:rPr>
+        <w:t>Se não usarmos </w:t>
+      </w:r>
+      <w:proofErr w:type="spellStart"/>
+      <w:proofErr w:type="gramStart"/>
+      <w:r>
+        <w:rPr>
+          <w:lang w:val="en-US"/>
+        </w:rPr>
+        <w:t>if</w:t>
+      </w:r>
+      <w:proofErr w:type="spellEnd"/>
+      <w:proofErr w:type="gramEnd"/>
+      <w:r>
+        <w:rPr>
+          <w:lang w:val="en-US"/>
+        </w:rPr>
+        <w:t xml:space="preserve"> __</w:t>
+      </w:r>
+      <w:proofErr w:type="spellStart"/>
+      <w:r>
+        <w:rPr>
+          <w:lang w:val="en-US"/>
+        </w:rPr>
+        <w:t>name</w:t>
+      </w:r>
+      <w:proofErr w:type="spellEnd"/>
+      <w:r>
+        <w:rPr>
+          <w:lang w:val="en-US"/>
+        </w:rPr>
+        <w:t>__ == "__</w:t>
+      </w:r>
+      <w:proofErr w:type="spellStart"/>
+      <w:r>
+        <w:rPr>
+          <w:lang w:val="en-US"/>
+        </w:rPr>
+        <w:t>main</w:t>
+      </w:r>
+      <w:proofErr w:type="spellEnd"/>
+      <w:r>
+        <w:rPr>
+          <w:lang w:val="en-US"/>
+        </w:rPr>
+        <w:t>__":, o código pode rodar na hora errada.</w:t>
+      </w:r>
+    </w:p>
+    <w:p>
+      <w:pPr>
+        <w:spacing w:line="240" w:lineRule="auto"/>
+        <w:rPr>
+          <w:lang w:val="en-US"/>
+        </w:rPr>
+      </w:pPr>
+      <w:r>
+        <w:rPr>
+          <w:lang w:val="en-US"/>
+        </w:rPr>
+        <w:lastRenderedPageBreak/>
+        <w:t>Então isso é base profissional.</w:t>
+      </w:r>
+    </w:p>
+    <w:p>
+      <w:pPr>
+        <w:spacing w:line="240" w:lineRule="auto"/>
+        <w:rPr>
+          <w:b/>
+          <w:lang w:val="en-US"/>
+        </w:rPr>
+      </w:pPr>
+      <w:r>
+        <w:rPr>
+          <w:b/>
+          <w:lang w:val="en-US"/>
+        </w:rPr>
+        <w:t xml:space="preserve">Hoje o sistema mostra cada </w:t>
+      </w:r>
+      <w:proofErr w:type="spellStart"/>
+      <w:r>
+        <w:rPr>
+          <w:b/>
+          <w:lang w:val="en-US"/>
+        </w:rPr>
+        <w:t>invoice</w:t>
+      </w:r>
+      <w:proofErr w:type="spellEnd"/>
+      <w:r>
+        <w:rPr>
+          <w:b/>
+          <w:lang w:val="en-US"/>
+        </w:rPr>
+        <w:t xml:space="preserve"> separada. Agora queremos responder perguntas de empresa:</w:t>
+      </w:r>
+    </w:p>
+    <w:p>
+      <w:pPr>
+        <w:spacing w:line="240" w:lineRule="auto"/>
+        <w:rPr>
+          <w:lang w:val="en-US"/>
+        </w:rPr>
+      </w:pPr>
+      <w:r>
+        <w:rPr>
+          <w:lang w:val="en-US"/>
+        </w:rPr>
+        <w:t>How many invoices were processed? How many were approved? How many need review? How many are high risk? What is the average risk score?</w:t>
+      </w:r>
+    </w:p>
+    <w:p>
+      <w:pPr>
+        <w:spacing w:line="240" w:lineRule="auto"/>
+        <w:rPr>
+          <w:lang w:val="en-US"/>
+        </w:rPr>
+      </w:pPr>
+    </w:p>
+    <w:p>
+      <w:pPr>
+        <w:pBdr>
+          <w:bottom w:val="single" w:sz="12" w:space="1" w:color="auto"/>
+        </w:pBdr>
+        <w:spacing w:line="240" w:lineRule="auto"/>
+        <w:rPr>
+          <w:rFonts w:ascii="Segoe UI" w:hAnsi="Segoe UI" w:cs="Segoe UI"/>
+          <w:color w:val="FFFFFF"/>
+          <w:sz w:val="21"/>
+          <w:szCs w:val="21"/>
+          <w:shd w:val="clear" w:color="auto" w:fill="181818"/>
+        </w:rPr>
+      </w:pPr>
+      <w:r>
+        <w:rPr>
+          <w:rFonts w:ascii="Segoe UI" w:hAnsi="Segoe UI" w:cs="Segoe UI"/>
+          <w:color w:val="FFFFFF"/>
+          <w:sz w:val="21"/>
+          <w:szCs w:val="21"/>
+          <w:shd w:val="clear" w:color="auto" w:fill="181818"/>
+        </w:rPr>
+        <w:t xml:space="preserve">Isso é o começo do nosso futuro </w:t>
+      </w:r>
+      <w:proofErr w:type="spellStart"/>
+      <w:r>
+        <w:rPr>
+          <w:rFonts w:ascii="Segoe UI" w:hAnsi="Segoe UI" w:cs="Segoe UI"/>
+          <w:color w:val="FFFFFF"/>
+          <w:sz w:val="21"/>
+          <w:szCs w:val="21"/>
+          <w:shd w:val="clear" w:color="auto" w:fill="181818"/>
+        </w:rPr>
+        <w:t>dashboard</w:t>
+      </w:r>
+      <w:proofErr w:type="spellEnd"/>
+      <w:r>
+        <w:rPr>
+          <w:rFonts w:ascii="Segoe UI" w:hAnsi="Segoe UI" w:cs="Segoe UI"/>
+          <w:color w:val="FFFFFF"/>
+          <w:sz w:val="21"/>
+          <w:szCs w:val="21"/>
+          <w:shd w:val="clear" w:color="auto" w:fill="181818"/>
+        </w:rPr>
+        <w:t>.</w:t>
       </w:r>
     </w:p>
     <w:p>
@@ -4663,57 +4935,271 @@
         </w:pBdr>
         <w:shd w:val="clear" w:color="auto" w:fill="181818"/>
         <w:spacing w:beforeAutospacing="1" w:after="0" w:afterAutospacing="1" w:line="330" w:lineRule="atLeast"/>
-      </w:pPr>
-      <w:r>
-        <w:t>Se não usarmos </w:t>
-      </w:r>
-      <w:proofErr w:type="spellStart"/>
+        <w:rPr>
+          <w:lang w:val="en-US"/>
+        </w:rPr>
+      </w:pPr>
+      <w:r>
+        <w:rPr>
+          <w:b/>
+        </w:rPr>
+        <w:t xml:space="preserve">Passo </w:t>
+      </w:r>
       <w:proofErr w:type="gramStart"/>
       <w:r>
-        <w:t>if</w:t>
-      </w:r>
-      <w:proofErr w:type="spellEnd"/>
+        <w:rPr>
+          <w:b/>
+        </w:rPr>
+        <w:t>1</w:t>
+      </w:r>
       <w:proofErr w:type="gramEnd"/>
       <w:r>
-        <w:t xml:space="preserve"> __</w:t>
-      </w:r>
-      <w:proofErr w:type="spellStart"/>
-      <w:r>
-        <w:t>name</w:t>
-      </w:r>
-      <w:proofErr w:type="spellEnd"/>
-      <w:r>
-        <w:t>__ == "__</w:t>
-      </w:r>
-      <w:proofErr w:type="spellStart"/>
-      <w:r>
+        <w:rPr>
+          <w:b/>
+        </w:rPr>
+        <w:t>: Criar Uma Lista Para Guardar Resultados</w:t>
+      </w:r>
+      <w:r>
+        <w:rPr>
+          <w:b/>
+        </w:rPr>
+        <w:br/>
+        <w:t>Dentro da função </w:t>
+      </w:r>
+      <w:proofErr w:type="spellStart"/>
+      <w:r>
+        <w:rPr>
+          <w:b/>
+        </w:rPr>
         <w:t>main</w:t>
       </w:r>
       <w:proofErr w:type="spellEnd"/>
       <w:r>
-        <w:t>__":, o código pode rodar na hora errada.</w:t>
-      </w:r>
-    </w:p>
-    <w:p>
-      <w:pPr>
-        <w:pBdr>
-          <w:top w:val="single" w:sz="2" w:space="0" w:color="auto"/>
-          <w:left w:val="single" w:sz="2" w:space="0" w:color="auto"/>
-          <w:bottom w:val="single" w:sz="2" w:space="0" w:color="auto"/>
-          <w:right w:val="single" w:sz="2" w:space="0" w:color="auto"/>
-        </w:pBdr>
-        <w:shd w:val="clear" w:color="auto" w:fill="181818"/>
-        <w:spacing w:before="100" w:beforeAutospacing="1" w:after="100" w:afterAutospacing="1" w:line="330" w:lineRule="atLeast"/>
-      </w:pPr>
-      <w:r>
-        <w:lastRenderedPageBreak/>
-        <w:t>Então isso é base profissional.</w:t>
-      </w:r>
-    </w:p>
-    <w:p>
-      <w:pPr>
-        <w:rPr>
-          <w:u w:val="single"/>
+        <w:rPr>
+          <w:b/>
+        </w:rPr>
+        <w:t>()</w:t>
+      </w:r>
+      <w:r>
+        <w:rPr>
+          <w:b/>
+        </w:rPr>
+        <w:t>,</w:t>
+      </w:r>
+    </w:p>
+    <w:p>
+      <w:pPr>
+        <w:spacing w:line="240" w:lineRule="auto"/>
+        <w:rPr>
+          <w:lang w:val="en-US"/>
+        </w:rPr>
+      </w:pPr>
+      <w:proofErr w:type="spellStart"/>
+      <w:r>
+        <w:rPr>
+          <w:lang w:val="en-US"/>
+        </w:rPr>
+        <w:t>risk_score</w:t>
+      </w:r>
+      <w:proofErr w:type="spellEnd"/>
+      <w:r>
+        <w:rPr>
+          <w:lang w:val="en-US"/>
+        </w:rPr>
+        <w:t xml:space="preserve"> = 0 -&gt; approved</w:t>
+      </w:r>
+    </w:p>
+    <w:p>
+      <w:pPr>
+        <w:spacing w:line="240" w:lineRule="auto"/>
+        <w:rPr>
+          <w:lang w:val="en-US"/>
+        </w:rPr>
+      </w:pPr>
+      <w:proofErr w:type="spellStart"/>
+      <w:proofErr w:type="gramStart"/>
+      <w:r>
+        <w:rPr>
+          <w:lang w:val="en-US"/>
+        </w:rPr>
+        <w:t>risk_score</w:t>
+      </w:r>
+      <w:proofErr w:type="spellEnd"/>
+      <w:proofErr w:type="gramEnd"/>
+      <w:r>
+        <w:rPr>
+          <w:lang w:val="en-US"/>
+        </w:rPr>
+        <w:t xml:space="preserve"> de 1 </w:t>
+      </w:r>
+      <w:proofErr w:type="spellStart"/>
+      <w:r>
+        <w:rPr>
+          <w:lang w:val="en-US"/>
+        </w:rPr>
+        <w:t>até</w:t>
+      </w:r>
+      <w:proofErr w:type="spellEnd"/>
+      <w:r>
+        <w:rPr>
+          <w:lang w:val="en-US"/>
+        </w:rPr>
+        <w:t xml:space="preserve"> 49 -&gt; </w:t>
+      </w:r>
+      <w:proofErr w:type="spellStart"/>
+      <w:r>
+        <w:rPr>
+          <w:lang w:val="en-US"/>
+        </w:rPr>
+        <w:t>needs_review</w:t>
+      </w:r>
+      <w:proofErr w:type="spellEnd"/>
+    </w:p>
+    <w:p>
+      <w:pPr>
+        <w:spacing w:line="240" w:lineRule="auto"/>
+        <w:rPr>
+          <w:lang w:val="en-US"/>
+        </w:rPr>
+      </w:pPr>
+      <w:proofErr w:type="spellStart"/>
+      <w:r>
+        <w:rPr>
+          <w:lang w:val="en-US"/>
+        </w:rPr>
+        <w:t>risk_score</w:t>
+      </w:r>
+      <w:proofErr w:type="spellEnd"/>
+      <w:r>
+        <w:rPr>
+          <w:lang w:val="en-US"/>
+        </w:rPr>
+        <w:t xml:space="preserve"> 50 </w:t>
+      </w:r>
+      <w:proofErr w:type="spellStart"/>
+      <w:r>
+        <w:rPr>
+          <w:lang w:val="en-US"/>
+        </w:rPr>
+        <w:t>ou</w:t>
+      </w:r>
+      <w:proofErr w:type="spellEnd"/>
+      <w:r>
+        <w:rPr>
+          <w:lang w:val="en-US"/>
+        </w:rPr>
+        <w:t xml:space="preserve"> </w:t>
+      </w:r>
+      <w:proofErr w:type="spellStart"/>
+      <w:r>
+        <w:rPr>
+          <w:lang w:val="en-US"/>
+        </w:rPr>
+        <w:t>mais</w:t>
+      </w:r>
+      <w:proofErr w:type="spellEnd"/>
+      <w:r>
+        <w:rPr>
+          <w:lang w:val="en-US"/>
+        </w:rPr>
+        <w:t xml:space="preserve"> -&gt; </w:t>
+      </w:r>
+      <w:proofErr w:type="spellStart"/>
+      <w:r>
+        <w:rPr>
+          <w:lang w:val="en-US"/>
+        </w:rPr>
+        <w:t>high_risk</w:t>
+      </w:r>
+      <w:proofErr w:type="spellEnd"/>
+    </w:p>
+    <w:p>
+      <w:pPr>
+        <w:spacing w:line="240" w:lineRule="auto"/>
+      </w:pPr>
+      <w:proofErr w:type="gramStart"/>
+      <w:r>
+        <w:t>abaixo</w:t>
+      </w:r>
+      <w:proofErr w:type="gramEnd"/>
+      <w:r>
+        <w:t xml:space="preserve"> de 50 = precisa revisão</w:t>
+      </w:r>
+      <w:r>
+        <w:t xml:space="preserve"> / </w:t>
+      </w:r>
+      <w:r>
+        <w:t>50 ou mais = alto risco</w:t>
+      </w:r>
+    </w:p>
+    <w:p>
+      <w:pPr>
+        <w:spacing w:line="240" w:lineRule="auto"/>
+        <w:rPr>
+          <w:b/>
+          <w:lang w:val="en-US"/>
+        </w:rPr>
+      </w:pPr>
+      <w:r>
+        <w:rPr>
+          <w:b/>
+          <w:lang w:val="en-US"/>
+        </w:rPr>
+        <w:t>Now the app stores results in memory.</w:t>
+      </w:r>
+      <w:r>
+        <w:rPr>
+          <w:b/>
+          <w:lang w:val="en-US"/>
+        </w:rPr>
+        <w:t xml:space="preserve"> / </w:t>
+      </w:r>
+      <w:r>
+        <w:rPr>
+          <w:b/>
+          <w:lang w:val="en-US"/>
+        </w:rPr>
+        <w:t>Later the app will store results in a database.</w:t>
+      </w:r>
+      <w:r>
+        <w:rPr>
+          <w:b/>
+          <w:lang w:val="en-US"/>
+        </w:rPr>
+        <w:t xml:space="preserve"> / </w:t>
+      </w:r>
+      <w:r>
+        <w:rPr>
+          <w:b/>
+          <w:lang w:val="en-US"/>
+        </w:rPr>
+        <w:t>Memory is temporary.</w:t>
+      </w:r>
+    </w:p>
+    <w:p>
+      <w:pPr>
+        <w:pBdr>
+          <w:bottom w:val="single" w:sz="12" w:space="1" w:color="auto"/>
+        </w:pBdr>
+        <w:spacing w:line="240" w:lineRule="auto"/>
+        <w:rPr>
+          <w:b/>
+          <w:lang w:val="en-US"/>
+        </w:rPr>
+      </w:pPr>
+      <w:r>
+        <w:rPr>
+          <w:b/>
+          <w:lang w:val="en-US"/>
+        </w:rPr>
+        <w:t>Database is permanent.</w:t>
+      </w:r>
+    </w:p>
+    <w:p>
+      <w:pPr>
+        <w:spacing w:line="240" w:lineRule="auto"/>
+        <w:rPr>
+          <w:lang w:val="en-US"/>
         </w:rPr>
       </w:pPr>
       <w:bookmarkStart w:id="0" w:name="_GoBack"/>
@@ -5591,6 +6077,11 @@
     <w:basedOn w:val="Fontepargpadro"/>
     <w:rsid w:val="00E00D5E"/>
   </w:style>
+  <w:style w:type="character" w:customStyle="1" w:styleId="hljs-comment">
+    <w:name w:val="hljs-comment"/>
+    <w:basedOn w:val="Fontepargpadro"/>
+    <w:rsid w:val="00F174E6"/>
+  </w:style>
 </w:styles>
 </file>
 
@@ -5842,6 +6333,11 @@
     <w:name w:val="inline-markdown"/>
     <w:basedOn w:val="Fontepargpadro"/>
     <w:rsid w:val="00E00D5E"/>
+  </w:style>
+  <w:style w:type="character" w:customStyle="1" w:styleId="hljs-comment">
+    <w:name w:val="hljs-comment"/>
+    <w:basedOn w:val="Fontepargpadro"/>
+    <w:rsid w:val="00F174E6"/>
   </w:style>
 </w:styles>
 </file>

</xml_diff>

<commit_message>
add rounds score 2 decimal places and img project
</commit_message>
<xml_diff>
--- a/Info_project/AI + ML + Automation + Data Project.docx
+++ b/Info_project/AI + ML + Automation + Data Project.docx
@@ -5194,6 +5194,219 @@
         </w:rPr>
         <w:t>Database is permanent.</w:t>
       </w:r>
+    </w:p>
+    <w:p>
+      <w:pPr>
+        <w:spacing w:line="240" w:lineRule="auto"/>
+        <w:rPr>
+          <w:lang w:val="en-US"/>
+        </w:rPr>
+      </w:pPr>
+      <w:proofErr w:type="gramStart"/>
+      <w:r>
+        <w:rPr>
+          <w:lang w:val="en-US"/>
+        </w:rPr>
+        <w:t>many</w:t>
+      </w:r>
+      <w:proofErr w:type="gramEnd"/>
+      <w:r>
+        <w:rPr>
+          <w:lang w:val="en-US"/>
+        </w:rPr>
+        <w:t xml:space="preserve"> invoices</w:t>
+      </w:r>
+    </w:p>
+    <w:p>
+      <w:pPr>
+        <w:spacing w:line="240" w:lineRule="auto"/>
+        <w:rPr>
+          <w:lang w:val="en-US"/>
+        </w:rPr>
+      </w:pPr>
+      <w:r>
+        <w:rPr>
+          <w:lang w:val="en-US"/>
+        </w:rPr>
+        <w:t>↓</w:t>
+      </w:r>
+    </w:p>
+    <w:p>
+      <w:pPr>
+        <w:spacing w:line="240" w:lineRule="auto"/>
+        <w:rPr>
+          <w:lang w:val="en-US"/>
+        </w:rPr>
+      </w:pPr>
+      <w:proofErr w:type="gramStart"/>
+      <w:r>
+        <w:rPr>
+          <w:lang w:val="en-US"/>
+        </w:rPr>
+        <w:t>validate</w:t>
+      </w:r>
+      <w:proofErr w:type="gramEnd"/>
+      <w:r>
+        <w:rPr>
+          <w:lang w:val="en-US"/>
+        </w:rPr>
+        <w:t xml:space="preserve"> invoices</w:t>
+      </w:r>
+    </w:p>
+    <w:p>
+      <w:pPr>
+        <w:spacing w:line="240" w:lineRule="auto"/>
+        <w:rPr>
+          <w:lang w:val="en-US"/>
+        </w:rPr>
+      </w:pPr>
+      <w:r>
+        <w:rPr>
+          <w:lang w:val="en-US"/>
+        </w:rPr>
+        <w:t>↓</w:t>
+      </w:r>
+    </w:p>
+    <w:p>
+      <w:pPr>
+        <w:spacing w:line="240" w:lineRule="auto"/>
+        <w:rPr>
+          <w:lang w:val="en-US"/>
+        </w:rPr>
+      </w:pPr>
+      <w:proofErr w:type="gramStart"/>
+      <w:r>
+        <w:rPr>
+          <w:lang w:val="en-US"/>
+        </w:rPr>
+        <w:t>save</w:t>
+      </w:r>
+      <w:proofErr w:type="gramEnd"/>
+      <w:r>
+        <w:rPr>
+          <w:lang w:val="en-US"/>
+        </w:rPr>
+        <w:t xml:space="preserve"> results in memory</w:t>
+      </w:r>
+    </w:p>
+    <w:p>
+      <w:pPr>
+        <w:spacing w:line="240" w:lineRule="auto"/>
+        <w:rPr>
+          <w:lang w:val="en-US"/>
+        </w:rPr>
+      </w:pPr>
+      <w:r>
+        <w:rPr>
+          <w:lang w:val="en-US"/>
+        </w:rPr>
+        <w:t>↓</w:t>
+      </w:r>
+    </w:p>
+    <w:p>
+      <w:pPr>
+        <w:spacing w:line="240" w:lineRule="auto"/>
+        <w:rPr>
+          <w:lang w:val="en-US"/>
+        </w:rPr>
+      </w:pPr>
+      <w:proofErr w:type="gramStart"/>
+      <w:r>
+        <w:rPr>
+          <w:lang w:val="en-US"/>
+        </w:rPr>
+        <w:t>calculate</w:t>
+      </w:r>
+      <w:proofErr w:type="gramEnd"/>
+      <w:r>
+        <w:rPr>
+          <w:lang w:val="en-US"/>
+        </w:rPr>
+        <w:t xml:space="preserve"> summary</w:t>
+      </w:r>
+    </w:p>
+    <w:p>
+      <w:pPr>
+        <w:spacing w:line="240" w:lineRule="auto"/>
+        <w:rPr>
+          <w:lang w:val="en-US"/>
+        </w:rPr>
+      </w:pPr>
+      <w:r>
+        <w:rPr>
+          <w:lang w:val="en-US"/>
+        </w:rPr>
+        <w:t>↓</w:t>
+      </w:r>
+    </w:p>
+    <w:p>
+      <w:pPr>
+        <w:spacing w:line="240" w:lineRule="auto"/>
+        <w:rPr>
+          <w:lang w:val="en-US"/>
+        </w:rPr>
+      </w:pPr>
+      <w:proofErr w:type="gramStart"/>
+      <w:r>
+        <w:rPr>
+          <w:lang w:val="en-US"/>
+        </w:rPr>
+        <w:t>round</w:t>
+      </w:r>
+      <w:proofErr w:type="gramEnd"/>
+      <w:r>
+        <w:rPr>
+          <w:lang w:val="en-US"/>
+        </w:rPr>
+        <w:t xml:space="preserve"> average risk score</w:t>
+      </w:r>
+    </w:p>
+    <w:p>
+      <w:pPr>
+        <w:spacing w:line="240" w:lineRule="auto"/>
+        <w:rPr>
+          <w:lang w:val="en-US"/>
+        </w:rPr>
+      </w:pPr>
+      <w:r>
+        <w:rPr>
+          <w:lang w:val="en-US"/>
+        </w:rPr>
+        <w:t>↓</w:t>
+      </w:r>
+    </w:p>
+    <w:p>
+      <w:pPr>
+        <w:spacing w:line="240" w:lineRule="auto"/>
+        <w:rPr>
+          <w:lang w:val="en-US"/>
+        </w:rPr>
+      </w:pPr>
+      <w:proofErr w:type="gramStart"/>
+      <w:r>
+        <w:rPr>
+          <w:lang w:val="en-US"/>
+        </w:rPr>
+        <w:t>show</w:t>
+      </w:r>
+      <w:proofErr w:type="gramEnd"/>
+      <w:r>
+        <w:rPr>
+          <w:lang w:val="en-US"/>
+        </w:rPr>
+        <w:t xml:space="preserve"> clean report</w:t>
+      </w:r>
+    </w:p>
+    <w:p>
+      <w:pPr>
+        <w:pBdr>
+          <w:bottom w:val="single" w:sz="12" w:space="1" w:color="auto"/>
+        </w:pBdr>
+        <w:spacing w:line="240" w:lineRule="auto"/>
+        <w:rPr>
+          <w:lang w:val="en-US"/>
+        </w:rPr>
+      </w:pPr>
     </w:p>
     <w:p>
       <w:pPr>

</xml_diff>

<commit_message>
add info projec document
</commit_message>
<xml_diff>
--- a/Info_project/AI + ML + Automation + Data Project.docx
+++ b/Info_project/AI + ML + Automation + Data Project.docx
@@ -7,9 +7,8 @@
         <w:spacing w:after="100" w:line="240" w:lineRule="auto"/>
         <w:ind w:left="-142" w:firstLine="142"/>
         <w:rPr>
-          <w:rFonts w:ascii="Segoe UI" w:eastAsia="Segoe UI" w:hAnsi="Segoe UI" w:cs="Segoe UI"/>
-          <w:b/>
-          <w:bCs/>
+          <w:rFonts w:eastAsia="Segoe UI"/>
+          <w:b/>
           <w:color w:val="232330"/>
           <w:sz w:val="34"/>
           <w:szCs w:val="34"/>
@@ -39,6 +38,1686 @@
         </w:rPr>
         <w:t>IA + ML + automação + dados</w:t>
       </w:r>
+    </w:p>
+    <w:p>
+      <w:pPr>
+        <w:spacing w:after="100" w:line="240" w:lineRule="auto"/>
+        <w:ind w:left="-142" w:firstLine="142"/>
+        <w:rPr>
+          <w:rFonts w:ascii="Segoe UI" w:eastAsia="Segoe UI" w:hAnsi="Segoe UI" w:cs="Segoe UI"/>
+          <w:bCs/>
+          <w:color w:val="232330"/>
+          <w:lang w:eastAsia="pt-BR"/>
+        </w:rPr>
+      </w:pPr>
+    </w:p>
+    <w:p>
+      <w:pPr>
+        <w:spacing w:after="100" w:line="240" w:lineRule="auto"/>
+        <w:ind w:left="-142" w:firstLine="142"/>
+        <w:rPr>
+          <w:rFonts w:ascii="Segoe UI" w:eastAsia="Segoe UI" w:hAnsi="Segoe UI" w:cs="Segoe UI"/>
+          <w:bCs/>
+          <w:color w:val="232330"/>
+          <w:lang w:eastAsia="pt-BR"/>
+        </w:rPr>
+      </w:pPr>
+      <w:proofErr w:type="spellStart"/>
+      <w:r>
+        <w:rPr>
+          <w:rFonts w:ascii="Segoe UI" w:eastAsia="Segoe UI" w:hAnsi="Segoe UI" w:cs="Segoe UI"/>
+          <w:bCs/>
+          <w:color w:val="232330"/>
+          <w:lang w:eastAsia="pt-BR"/>
+        </w:rPr>
+        <w:t>Document</w:t>
+      </w:r>
+      <w:proofErr w:type="spellEnd"/>
+    </w:p>
+    <w:p>
+      <w:pPr>
+        <w:spacing w:after="100" w:line="240" w:lineRule="auto"/>
+        <w:ind w:left="-142" w:firstLine="142"/>
+        <w:rPr>
+          <w:rFonts w:ascii="Segoe UI" w:eastAsia="Segoe UI" w:hAnsi="Segoe UI" w:cs="Segoe UI"/>
+          <w:bCs/>
+          <w:color w:val="232330"/>
+          <w:lang w:eastAsia="pt-BR"/>
+        </w:rPr>
+      </w:pPr>
+      <w:r>
+        <w:rPr>
+          <w:rFonts w:ascii="Segoe UI" w:eastAsia="Segoe UI" w:hAnsi="Segoe UI" w:cs="Segoe UI"/>
+          <w:bCs/>
+          <w:color w:val="232330"/>
+          <w:lang w:eastAsia="pt-BR"/>
+        </w:rPr>
+        <w:t>↓</w:t>
+      </w:r>
+    </w:p>
+    <w:p>
+      <w:pPr>
+        <w:spacing w:after="100" w:line="240" w:lineRule="auto"/>
+        <w:ind w:left="-142" w:firstLine="142"/>
+        <w:rPr>
+          <w:rFonts w:ascii="Segoe UI" w:eastAsia="Segoe UI" w:hAnsi="Segoe UI" w:cs="Segoe UI"/>
+          <w:bCs/>
+          <w:color w:val="232330"/>
+          <w:lang w:eastAsia="pt-BR"/>
+        </w:rPr>
+      </w:pPr>
+      <w:r>
+        <w:rPr>
+          <w:rFonts w:ascii="Segoe UI" w:eastAsia="Segoe UI" w:hAnsi="Segoe UI" w:cs="Segoe UI"/>
+          <w:bCs/>
+          <w:color w:val="232330"/>
+          <w:lang w:eastAsia="pt-BR"/>
+        </w:rPr>
+        <w:t xml:space="preserve">OCR </w:t>
+      </w:r>
+      <w:proofErr w:type="spellStart"/>
+      <w:r>
+        <w:rPr>
+          <w:rFonts w:ascii="Segoe UI" w:eastAsia="Segoe UI" w:hAnsi="Segoe UI" w:cs="Segoe UI"/>
+          <w:bCs/>
+          <w:color w:val="232330"/>
+          <w:lang w:eastAsia="pt-BR"/>
+        </w:rPr>
+        <w:t>reads</w:t>
+      </w:r>
+      <w:proofErr w:type="spellEnd"/>
+      <w:r>
+        <w:rPr>
+          <w:rFonts w:ascii="Segoe UI" w:eastAsia="Segoe UI" w:hAnsi="Segoe UI" w:cs="Segoe UI"/>
+          <w:bCs/>
+          <w:color w:val="232330"/>
+          <w:lang w:eastAsia="pt-BR"/>
+        </w:rPr>
+        <w:t xml:space="preserve"> </w:t>
+      </w:r>
+      <w:proofErr w:type="spellStart"/>
+      <w:r>
+        <w:rPr>
+          <w:rFonts w:ascii="Segoe UI" w:eastAsia="Segoe UI" w:hAnsi="Segoe UI" w:cs="Segoe UI"/>
+          <w:bCs/>
+          <w:color w:val="232330"/>
+          <w:lang w:eastAsia="pt-BR"/>
+        </w:rPr>
+        <w:t>document</w:t>
+      </w:r>
+      <w:proofErr w:type="spellEnd"/>
+      <w:r>
+        <w:rPr>
+          <w:rFonts w:ascii="Segoe UI" w:eastAsia="Segoe UI" w:hAnsi="Segoe UI" w:cs="Segoe UI"/>
+          <w:bCs/>
+          <w:color w:val="232330"/>
+          <w:lang w:eastAsia="pt-BR"/>
+        </w:rPr>
+        <w:t xml:space="preserve"> </w:t>
+      </w:r>
+      <w:proofErr w:type="spellStart"/>
+      <w:r>
+        <w:rPr>
+          <w:rFonts w:ascii="Segoe UI" w:eastAsia="Segoe UI" w:hAnsi="Segoe UI" w:cs="Segoe UI"/>
+          <w:bCs/>
+          <w:color w:val="232330"/>
+          <w:lang w:eastAsia="pt-BR"/>
+        </w:rPr>
+        <w:t>text</w:t>
+      </w:r>
+      <w:proofErr w:type="spellEnd"/>
+    </w:p>
+    <w:p>
+      <w:pPr>
+        <w:spacing w:after="100" w:line="240" w:lineRule="auto"/>
+        <w:ind w:left="-142" w:firstLine="142"/>
+        <w:rPr>
+          <w:rFonts w:ascii="Segoe UI" w:eastAsia="Segoe UI" w:hAnsi="Segoe UI" w:cs="Segoe UI"/>
+          <w:bCs/>
+          <w:color w:val="232330"/>
+          <w:lang w:val="en-US" w:eastAsia="pt-BR"/>
+        </w:rPr>
+      </w:pPr>
+      <w:r>
+        <w:rPr>
+          <w:rFonts w:ascii="Segoe UI" w:eastAsia="Segoe UI" w:hAnsi="Segoe UI" w:cs="Segoe UI"/>
+          <w:bCs/>
+          <w:color w:val="232330"/>
+          <w:lang w:val="en-US" w:eastAsia="pt-BR"/>
+        </w:rPr>
+        <w:t>↓</w:t>
+      </w:r>
+    </w:p>
+    <w:p>
+      <w:pPr>
+        <w:spacing w:after="100" w:line="240" w:lineRule="auto"/>
+        <w:ind w:left="-142" w:firstLine="142"/>
+        <w:rPr>
+          <w:rFonts w:ascii="Segoe UI" w:eastAsia="Segoe UI" w:hAnsi="Segoe UI" w:cs="Segoe UI"/>
+          <w:bCs/>
+          <w:color w:val="232330"/>
+          <w:lang w:val="en-US" w:eastAsia="pt-BR"/>
+        </w:rPr>
+      </w:pPr>
+      <w:r>
+        <w:rPr>
+          <w:rFonts w:ascii="Segoe UI" w:eastAsia="Segoe UI" w:hAnsi="Segoe UI" w:cs="Segoe UI"/>
+          <w:bCs/>
+          <w:color w:val="232330"/>
+          <w:lang w:val="en-US" w:eastAsia="pt-BR"/>
+        </w:rPr>
+        <w:t>Python extracts fields</w:t>
+      </w:r>
+    </w:p>
+    <w:p>
+      <w:pPr>
+        <w:spacing w:after="100" w:line="240" w:lineRule="auto"/>
+        <w:ind w:left="-142" w:firstLine="142"/>
+        <w:rPr>
+          <w:rFonts w:ascii="Segoe UI" w:eastAsia="Segoe UI" w:hAnsi="Segoe UI" w:cs="Segoe UI"/>
+          <w:bCs/>
+          <w:color w:val="232330"/>
+          <w:lang w:val="en-US" w:eastAsia="pt-BR"/>
+        </w:rPr>
+      </w:pPr>
+      <w:r>
+        <w:rPr>
+          <w:rFonts w:ascii="Segoe UI" w:eastAsia="Segoe UI" w:hAnsi="Segoe UI" w:cs="Segoe UI"/>
+          <w:bCs/>
+          <w:color w:val="232330"/>
+          <w:lang w:val="en-US" w:eastAsia="pt-BR"/>
+        </w:rPr>
+        <w:t>↓</w:t>
+      </w:r>
+    </w:p>
+    <w:p>
+      <w:pPr>
+        <w:spacing w:after="100" w:line="240" w:lineRule="auto"/>
+        <w:ind w:left="-142" w:firstLine="142"/>
+        <w:rPr>
+          <w:rFonts w:ascii="Segoe UI" w:eastAsia="Segoe UI" w:hAnsi="Segoe UI" w:cs="Segoe UI"/>
+          <w:bCs/>
+          <w:color w:val="232330"/>
+          <w:lang w:val="en-US" w:eastAsia="pt-BR"/>
+        </w:rPr>
+      </w:pPr>
+      <w:r>
+        <w:rPr>
+          <w:rFonts w:ascii="Segoe UI" w:eastAsia="Segoe UI" w:hAnsi="Segoe UI" w:cs="Segoe UI"/>
+          <w:bCs/>
+          <w:color w:val="232330"/>
+          <w:lang w:val="en-US" w:eastAsia="pt-BR"/>
+        </w:rPr>
+        <w:t>Python validates fields</w:t>
+      </w:r>
+    </w:p>
+    <w:p>
+      <w:pPr>
+        <w:spacing w:after="100" w:line="240" w:lineRule="auto"/>
+        <w:ind w:left="-142" w:firstLine="142"/>
+        <w:rPr>
+          <w:rFonts w:ascii="Segoe UI" w:eastAsia="Segoe UI" w:hAnsi="Segoe UI" w:cs="Segoe UI"/>
+          <w:bCs/>
+          <w:color w:val="232330"/>
+          <w:lang w:val="en-US" w:eastAsia="pt-BR"/>
+        </w:rPr>
+      </w:pPr>
+      <w:r>
+        <w:rPr>
+          <w:rFonts w:ascii="Segoe UI" w:eastAsia="Segoe UI" w:hAnsi="Segoe UI" w:cs="Segoe UI"/>
+          <w:bCs/>
+          <w:color w:val="232330"/>
+          <w:lang w:val="en-US" w:eastAsia="pt-BR"/>
+        </w:rPr>
+        <w:t>↓</w:t>
+      </w:r>
+    </w:p>
+    <w:p>
+      <w:pPr>
+        <w:spacing w:after="100" w:line="240" w:lineRule="auto"/>
+        <w:ind w:left="-142" w:firstLine="142"/>
+        <w:rPr>
+          <w:rFonts w:ascii="Segoe UI" w:eastAsia="Segoe UI" w:hAnsi="Segoe UI" w:cs="Segoe UI"/>
+          <w:bCs/>
+          <w:color w:val="232330"/>
+          <w:lang w:val="en-US" w:eastAsia="pt-BR"/>
+        </w:rPr>
+      </w:pPr>
+      <w:r>
+        <w:rPr>
+          <w:rFonts w:ascii="Segoe UI" w:eastAsia="Segoe UI" w:hAnsi="Segoe UI" w:cs="Segoe UI"/>
+          <w:bCs/>
+          <w:color w:val="232330"/>
+          <w:lang w:val="en-US" w:eastAsia="pt-BR"/>
+        </w:rPr>
+        <w:t>Python creates risk score</w:t>
+      </w:r>
+    </w:p>
+    <w:p>
+      <w:pPr>
+        <w:spacing w:after="100" w:line="240" w:lineRule="auto"/>
+        <w:ind w:left="-142" w:firstLine="142"/>
+        <w:rPr>
+          <w:rFonts w:ascii="Segoe UI" w:eastAsia="Segoe UI" w:hAnsi="Segoe UI" w:cs="Segoe UI"/>
+          <w:bCs/>
+          <w:color w:val="232330"/>
+          <w:lang w:val="en-US" w:eastAsia="pt-BR"/>
+        </w:rPr>
+      </w:pPr>
+      <w:r>
+        <w:rPr>
+          <w:rFonts w:ascii="Segoe UI" w:eastAsia="Segoe UI" w:hAnsi="Segoe UI" w:cs="Segoe UI"/>
+          <w:bCs/>
+          <w:color w:val="232330"/>
+          <w:lang w:val="en-US" w:eastAsia="pt-BR"/>
+        </w:rPr>
+        <w:t>↓</w:t>
+      </w:r>
+    </w:p>
+    <w:p>
+      <w:pPr>
+        <w:spacing w:after="100" w:line="240" w:lineRule="auto"/>
+        <w:ind w:left="-142" w:firstLine="142"/>
+        <w:rPr>
+          <w:rFonts w:ascii="Segoe UI" w:eastAsia="Segoe UI" w:hAnsi="Segoe UI" w:cs="Segoe UI"/>
+          <w:bCs/>
+          <w:color w:val="232330"/>
+          <w:lang w:val="en-US" w:eastAsia="pt-BR"/>
+        </w:rPr>
+      </w:pPr>
+      <w:r>
+        <w:rPr>
+          <w:rFonts w:ascii="Segoe UI" w:eastAsia="Segoe UI" w:hAnsi="Segoe UI" w:cs="Segoe UI"/>
+          <w:bCs/>
+          <w:color w:val="232330"/>
+          <w:lang w:val="en-US" w:eastAsia="pt-BR"/>
+        </w:rPr>
+        <w:t>Python saves results in CSV / database</w:t>
+      </w:r>
+    </w:p>
+    <w:p>
+      <w:pPr>
+        <w:spacing w:after="100" w:line="240" w:lineRule="auto"/>
+        <w:ind w:left="-142" w:firstLine="142"/>
+        <w:rPr>
+          <w:rFonts w:ascii="Segoe UI" w:eastAsia="Segoe UI" w:hAnsi="Segoe UI" w:cs="Segoe UI"/>
+          <w:bCs/>
+          <w:color w:val="232330"/>
+          <w:lang w:val="en-US" w:eastAsia="pt-BR"/>
+        </w:rPr>
+      </w:pPr>
+      <w:r>
+        <w:rPr>
+          <w:rFonts w:ascii="Segoe UI" w:eastAsia="Segoe UI" w:hAnsi="Segoe UI" w:cs="Segoe UI"/>
+          <w:bCs/>
+          <w:color w:val="232330"/>
+          <w:lang w:val="en-US" w:eastAsia="pt-BR"/>
+        </w:rPr>
+        <w:t>↓</w:t>
+      </w:r>
+    </w:p>
+    <w:p>
+      <w:pPr>
+        <w:spacing w:after="100" w:line="240" w:lineRule="auto"/>
+        <w:ind w:left="-142" w:firstLine="142"/>
+        <w:rPr>
+          <w:rFonts w:ascii="Segoe UI" w:eastAsia="Segoe UI" w:hAnsi="Segoe UI" w:cs="Segoe UI"/>
+          <w:bCs/>
+          <w:color w:val="232330"/>
+          <w:lang w:val="en-US" w:eastAsia="pt-BR"/>
+        </w:rPr>
+      </w:pPr>
+      <w:proofErr w:type="gramStart"/>
+      <w:r>
+        <w:rPr>
+          <w:rFonts w:ascii="Segoe UI" w:eastAsia="Segoe UI" w:hAnsi="Segoe UI" w:cs="Segoe UI"/>
+          <w:bCs/>
+          <w:color w:val="232330"/>
+          <w:lang w:val="en-US" w:eastAsia="pt-BR"/>
+        </w:rPr>
+        <w:t>Pandas analyzes</w:t>
+      </w:r>
+      <w:proofErr w:type="gramEnd"/>
+      <w:r>
+        <w:rPr>
+          <w:rFonts w:ascii="Segoe UI" w:eastAsia="Segoe UI" w:hAnsi="Segoe UI" w:cs="Segoe UI"/>
+          <w:bCs/>
+          <w:color w:val="232330"/>
+          <w:lang w:val="en-US" w:eastAsia="pt-BR"/>
+        </w:rPr>
+        <w:t xml:space="preserve"> the saved data</w:t>
+      </w:r>
+    </w:p>
+    <w:p>
+      <w:pPr>
+        <w:spacing w:after="100" w:line="240" w:lineRule="auto"/>
+        <w:ind w:left="-142" w:firstLine="142"/>
+        <w:rPr>
+          <w:rFonts w:ascii="Segoe UI" w:eastAsia="Segoe UI" w:hAnsi="Segoe UI" w:cs="Segoe UI"/>
+          <w:bCs/>
+          <w:color w:val="232330"/>
+          <w:lang w:val="en-US" w:eastAsia="pt-BR"/>
+        </w:rPr>
+      </w:pPr>
+      <w:r>
+        <w:rPr>
+          <w:rFonts w:ascii="Segoe UI" w:eastAsia="Segoe UI" w:hAnsi="Segoe UI" w:cs="Segoe UI"/>
+          <w:bCs/>
+          <w:color w:val="232330"/>
+          <w:lang w:val="en-US" w:eastAsia="pt-BR"/>
+        </w:rPr>
+        <w:t>↓</w:t>
+      </w:r>
+    </w:p>
+    <w:p>
+      <w:pPr>
+        <w:spacing w:after="100" w:line="240" w:lineRule="auto"/>
+        <w:ind w:left="-142" w:firstLine="142"/>
+        <w:rPr>
+          <w:rFonts w:ascii="Segoe UI" w:eastAsia="Segoe UI" w:hAnsi="Segoe UI" w:cs="Segoe UI"/>
+          <w:bCs/>
+          <w:color w:val="232330"/>
+          <w:lang w:val="en-US" w:eastAsia="pt-BR"/>
+        </w:rPr>
+      </w:pPr>
+      <w:r>
+        <w:rPr>
+          <w:rFonts w:ascii="Segoe UI" w:eastAsia="Segoe UI" w:hAnsi="Segoe UI" w:cs="Segoe UI"/>
+          <w:bCs/>
+          <w:color w:val="232330"/>
+          <w:lang w:val="en-US" w:eastAsia="pt-BR"/>
+        </w:rPr>
+        <w:t>Flask shows dashboard and charts on a web page</w:t>
+      </w:r>
+    </w:p>
+    <w:p>
+      <w:pPr>
+        <w:pBdr>
+          <w:bottom w:val="single" w:sz="12" w:space="1" w:color="auto"/>
+        </w:pBdr>
+        <w:spacing w:after="100" w:line="240" w:lineRule="auto"/>
+        <w:ind w:left="-142" w:firstLine="142"/>
+        <w:rPr>
+          <w:rFonts w:ascii="Segoe UI" w:eastAsia="Segoe UI" w:hAnsi="Segoe UI" w:cs="Segoe UI"/>
+          <w:bCs/>
+          <w:color w:val="232330"/>
+          <w:lang w:val="en-US" w:eastAsia="pt-BR"/>
+        </w:rPr>
+      </w:pPr>
+    </w:p>
+    <w:p>
+      <w:pPr>
+        <w:spacing w:after="100" w:line="240" w:lineRule="auto"/>
+        <w:ind w:left="-142" w:firstLine="142"/>
+        <w:rPr>
+          <w:rFonts w:ascii="Segoe UI" w:eastAsia="Segoe UI" w:hAnsi="Segoe UI" w:cs="Segoe UI"/>
+          <w:bCs/>
+          <w:color w:val="232330"/>
+          <w:lang w:val="en-US" w:eastAsia="pt-BR"/>
+        </w:rPr>
+      </w:pPr>
+    </w:p>
+    <w:p>
+      <w:pPr>
+        <w:spacing w:after="100" w:line="240" w:lineRule="auto"/>
+        <w:ind w:left="-142" w:firstLine="142"/>
+        <w:rPr>
+          <w:rFonts w:ascii="Segoe UI" w:hAnsi="Segoe UI" w:cs="Segoe UI"/>
+          <w:color w:val="FFFFFF"/>
+          <w:sz w:val="21"/>
+          <w:szCs w:val="21"/>
+          <w:shd w:val="clear" w:color="auto" w:fill="181818"/>
+        </w:rPr>
+      </w:pPr>
+      <w:r>
+        <w:rPr>
+          <w:rStyle w:val="Forte"/>
+          <w:rFonts w:ascii="Segoe UI" w:hAnsi="Segoe UI" w:cs="Segoe UI"/>
+          <w:color w:val="FFFFFF"/>
+          <w:sz w:val="21"/>
+          <w:szCs w:val="21"/>
+          <w:bdr w:val="single" w:sz="2" w:space="0" w:color="auto" w:frame="1"/>
+          <w:shd w:val="clear" w:color="auto" w:fill="181818"/>
+        </w:rPr>
+        <w:t xml:space="preserve">Web Page E </w:t>
+      </w:r>
+      <w:proofErr w:type="spellStart"/>
+      <w:r>
+        <w:rPr>
+          <w:rStyle w:val="Forte"/>
+          <w:rFonts w:ascii="Segoe UI" w:hAnsi="Segoe UI" w:cs="Segoe UI"/>
+          <w:color w:val="FFFFFF"/>
+          <w:sz w:val="21"/>
+          <w:szCs w:val="21"/>
+          <w:bdr w:val="single" w:sz="2" w:space="0" w:color="auto" w:frame="1"/>
+          <w:shd w:val="clear" w:color="auto" w:fill="181818"/>
+        </w:rPr>
+        <w:t>Dashboard</w:t>
+      </w:r>
+      <w:proofErr w:type="spellEnd"/>
+      <w:r>
+        <w:rPr>
+          <w:rFonts w:ascii="Segoe UI" w:hAnsi="Segoe UI" w:cs="Segoe UI"/>
+          <w:color w:val="FFFFFF"/>
+          <w:sz w:val="21"/>
+          <w:szCs w:val="21"/>
+        </w:rPr>
+        <w:br/>
+      </w:r>
+      <w:r>
+        <w:rPr>
+          <w:rFonts w:ascii="Segoe UI" w:hAnsi="Segoe UI" w:cs="Segoe UI"/>
+          <w:color w:val="FFFFFF"/>
+          <w:sz w:val="21"/>
+          <w:szCs w:val="21"/>
+          <w:shd w:val="clear" w:color="auto" w:fill="181818"/>
+        </w:rPr>
+        <w:t xml:space="preserve">Sim. Depois teremos uma página web com </w:t>
+      </w:r>
+      <w:proofErr w:type="spellStart"/>
+      <w:r>
+        <w:rPr>
+          <w:rFonts w:ascii="Segoe UI" w:hAnsi="Segoe UI" w:cs="Segoe UI"/>
+          <w:color w:val="FFFFFF"/>
+          <w:sz w:val="21"/>
+          <w:szCs w:val="21"/>
+          <w:shd w:val="clear" w:color="auto" w:fill="181818"/>
+        </w:rPr>
+        <w:t>Flask</w:t>
+      </w:r>
+      <w:proofErr w:type="spellEnd"/>
+      <w:r>
+        <w:rPr>
+          <w:rFonts w:ascii="Segoe UI" w:hAnsi="Segoe UI" w:cs="Segoe UI"/>
+          <w:color w:val="FFFFFF"/>
+          <w:sz w:val="21"/>
+          <w:szCs w:val="21"/>
+          <w:shd w:val="clear" w:color="auto" w:fill="181818"/>
+        </w:rPr>
+        <w:t>:</w:t>
+      </w:r>
+    </w:p>
+    <w:p>
+      <w:pPr>
+        <w:spacing w:after="100" w:line="240" w:lineRule="auto"/>
+        <w:ind w:left="-142" w:firstLine="142"/>
+        <w:rPr>
+          <w:rFonts w:ascii="Segoe UI" w:eastAsia="Segoe UI" w:hAnsi="Segoe UI" w:cs="Segoe UI"/>
+          <w:bCs/>
+          <w:color w:val="232330"/>
+          <w:lang w:val="en-US" w:eastAsia="pt-BR"/>
+        </w:rPr>
+      </w:pPr>
+      <w:r>
+        <w:rPr>
+          <w:rFonts w:ascii="Segoe UI" w:eastAsia="Segoe UI" w:hAnsi="Segoe UI" w:cs="Segoe UI"/>
+          <w:bCs/>
+          <w:color w:val="232330"/>
+          <w:lang w:val="en-US" w:eastAsia="pt-BR"/>
+        </w:rPr>
+        <w:t>Browser page</w:t>
+      </w:r>
+    </w:p>
+    <w:p>
+      <w:pPr>
+        <w:spacing w:after="100" w:line="240" w:lineRule="auto"/>
+        <w:ind w:left="-142" w:firstLine="142"/>
+        <w:rPr>
+          <w:rFonts w:ascii="Segoe UI" w:eastAsia="Segoe UI" w:hAnsi="Segoe UI" w:cs="Segoe UI"/>
+          <w:bCs/>
+          <w:color w:val="232330"/>
+          <w:lang w:val="en-US" w:eastAsia="pt-BR"/>
+        </w:rPr>
+      </w:pPr>
+      <w:r>
+        <w:rPr>
+          <w:rFonts w:ascii="Segoe UI" w:eastAsia="Segoe UI" w:hAnsi="Segoe UI" w:cs="Segoe UI"/>
+          <w:bCs/>
+          <w:color w:val="232330"/>
+          <w:lang w:val="en-US" w:eastAsia="pt-BR"/>
+        </w:rPr>
+        <w:t>↓</w:t>
+      </w:r>
+    </w:p>
+    <w:p>
+      <w:pPr>
+        <w:spacing w:after="100" w:line="240" w:lineRule="auto"/>
+        <w:ind w:left="-142" w:firstLine="142"/>
+        <w:rPr>
+          <w:rFonts w:ascii="Segoe UI" w:eastAsia="Segoe UI" w:hAnsi="Segoe UI" w:cs="Segoe UI"/>
+          <w:bCs/>
+          <w:color w:val="232330"/>
+          <w:lang w:val="en-US" w:eastAsia="pt-BR"/>
+        </w:rPr>
+      </w:pPr>
+      <w:r>
+        <w:rPr>
+          <w:rFonts w:ascii="Segoe UI" w:eastAsia="Segoe UI" w:hAnsi="Segoe UI" w:cs="Segoe UI"/>
+          <w:bCs/>
+          <w:color w:val="232330"/>
+          <w:lang w:val="en-US" w:eastAsia="pt-BR"/>
+        </w:rPr>
+        <w:t>Upload document</w:t>
+      </w:r>
+    </w:p>
+    <w:p>
+      <w:pPr>
+        <w:spacing w:after="100" w:line="240" w:lineRule="auto"/>
+        <w:ind w:left="-142" w:firstLine="142"/>
+        <w:rPr>
+          <w:rFonts w:ascii="Segoe UI" w:eastAsia="Segoe UI" w:hAnsi="Segoe UI" w:cs="Segoe UI"/>
+          <w:bCs/>
+          <w:color w:val="232330"/>
+          <w:lang w:val="en-US" w:eastAsia="pt-BR"/>
+        </w:rPr>
+      </w:pPr>
+      <w:r>
+        <w:rPr>
+          <w:rFonts w:ascii="Segoe UI" w:eastAsia="Segoe UI" w:hAnsi="Segoe UI" w:cs="Segoe UI"/>
+          <w:bCs/>
+          <w:color w:val="232330"/>
+          <w:lang w:val="en-US" w:eastAsia="pt-BR"/>
+        </w:rPr>
+        <w:t>↓</w:t>
+      </w:r>
+    </w:p>
+    <w:p>
+      <w:pPr>
+        <w:spacing w:after="100" w:line="240" w:lineRule="auto"/>
+        <w:ind w:left="-142" w:firstLine="142"/>
+        <w:rPr>
+          <w:rFonts w:ascii="Segoe UI" w:eastAsia="Segoe UI" w:hAnsi="Segoe UI" w:cs="Segoe UI"/>
+          <w:bCs/>
+          <w:color w:val="232330"/>
+          <w:lang w:val="en-US" w:eastAsia="pt-BR"/>
+        </w:rPr>
+      </w:pPr>
+      <w:r>
+        <w:rPr>
+          <w:rFonts w:ascii="Segoe UI" w:eastAsia="Segoe UI" w:hAnsi="Segoe UI" w:cs="Segoe UI"/>
+          <w:bCs/>
+          <w:color w:val="232330"/>
+          <w:lang w:val="en-US" w:eastAsia="pt-BR"/>
+        </w:rPr>
+        <w:t>Flask receives file</w:t>
+      </w:r>
+    </w:p>
+    <w:p>
+      <w:pPr>
+        <w:spacing w:after="100" w:line="240" w:lineRule="auto"/>
+        <w:ind w:left="-142" w:firstLine="142"/>
+        <w:rPr>
+          <w:rFonts w:ascii="Segoe UI" w:eastAsia="Segoe UI" w:hAnsi="Segoe UI" w:cs="Segoe UI"/>
+          <w:bCs/>
+          <w:color w:val="232330"/>
+          <w:lang w:val="en-US" w:eastAsia="pt-BR"/>
+        </w:rPr>
+      </w:pPr>
+      <w:r>
+        <w:rPr>
+          <w:rFonts w:ascii="Segoe UI" w:eastAsia="Segoe UI" w:hAnsi="Segoe UI" w:cs="Segoe UI"/>
+          <w:bCs/>
+          <w:color w:val="232330"/>
+          <w:lang w:val="en-US" w:eastAsia="pt-BR"/>
+        </w:rPr>
+        <w:t>↓</w:t>
+      </w:r>
+    </w:p>
+    <w:p>
+      <w:pPr>
+        <w:spacing w:after="100" w:line="240" w:lineRule="auto"/>
+        <w:ind w:left="-142" w:firstLine="142"/>
+        <w:rPr>
+          <w:rFonts w:ascii="Segoe UI" w:eastAsia="Segoe UI" w:hAnsi="Segoe UI" w:cs="Segoe UI"/>
+          <w:bCs/>
+          <w:color w:val="232330"/>
+          <w:lang w:val="en-US" w:eastAsia="pt-BR"/>
+        </w:rPr>
+      </w:pPr>
+      <w:r>
+        <w:rPr>
+          <w:rFonts w:ascii="Segoe UI" w:eastAsia="Segoe UI" w:hAnsi="Segoe UI" w:cs="Segoe UI"/>
+          <w:bCs/>
+          <w:color w:val="232330"/>
+          <w:lang w:val="en-US" w:eastAsia="pt-BR"/>
+        </w:rPr>
+        <w:t>OCR reads text</w:t>
+      </w:r>
+    </w:p>
+    <w:p>
+      <w:pPr>
+        <w:spacing w:after="100" w:line="240" w:lineRule="auto"/>
+        <w:ind w:left="-142" w:firstLine="142"/>
+        <w:rPr>
+          <w:rFonts w:ascii="Segoe UI" w:eastAsia="Segoe UI" w:hAnsi="Segoe UI" w:cs="Segoe UI"/>
+          <w:bCs/>
+          <w:color w:val="232330"/>
+          <w:lang w:val="en-US" w:eastAsia="pt-BR"/>
+        </w:rPr>
+      </w:pPr>
+      <w:r>
+        <w:rPr>
+          <w:rFonts w:ascii="Segoe UI" w:eastAsia="Segoe UI" w:hAnsi="Segoe UI" w:cs="Segoe UI"/>
+          <w:bCs/>
+          <w:color w:val="232330"/>
+          <w:lang w:val="en-US" w:eastAsia="pt-BR"/>
+        </w:rPr>
+        <w:t>↓</w:t>
+      </w:r>
+    </w:p>
+    <w:p>
+      <w:pPr>
+        <w:spacing w:after="100" w:line="240" w:lineRule="auto"/>
+        <w:ind w:left="-142" w:firstLine="142"/>
+        <w:rPr>
+          <w:rFonts w:ascii="Segoe UI" w:eastAsia="Segoe UI" w:hAnsi="Segoe UI" w:cs="Segoe UI"/>
+          <w:bCs/>
+          <w:color w:val="232330"/>
+          <w:lang w:val="en-US" w:eastAsia="pt-BR"/>
+        </w:rPr>
+      </w:pPr>
+      <w:r>
+        <w:rPr>
+          <w:rFonts w:ascii="Segoe UI" w:eastAsia="Segoe UI" w:hAnsi="Segoe UI" w:cs="Segoe UI"/>
+          <w:bCs/>
+          <w:color w:val="232330"/>
+          <w:lang w:val="en-US" w:eastAsia="pt-BR"/>
+        </w:rPr>
+        <w:t>Python processes invoice</w:t>
+      </w:r>
+    </w:p>
+    <w:p>
+      <w:pPr>
+        <w:spacing w:after="100" w:line="240" w:lineRule="auto"/>
+        <w:ind w:left="-142" w:firstLine="142"/>
+        <w:rPr>
+          <w:rFonts w:ascii="Segoe UI" w:eastAsia="Segoe UI" w:hAnsi="Segoe UI" w:cs="Segoe UI"/>
+          <w:bCs/>
+          <w:color w:val="232330"/>
+          <w:lang w:eastAsia="pt-BR"/>
+        </w:rPr>
+      </w:pPr>
+      <w:r>
+        <w:rPr>
+          <w:rFonts w:ascii="Segoe UI" w:eastAsia="Segoe UI" w:hAnsi="Segoe UI" w:cs="Segoe UI"/>
+          <w:bCs/>
+          <w:color w:val="232330"/>
+          <w:lang w:eastAsia="pt-BR"/>
+        </w:rPr>
+        <w:t>↓</w:t>
+      </w:r>
+    </w:p>
+    <w:p>
+      <w:pPr>
+        <w:spacing w:after="100" w:line="240" w:lineRule="auto"/>
+        <w:ind w:left="-142" w:firstLine="142"/>
+        <w:rPr>
+          <w:rFonts w:ascii="Segoe UI" w:eastAsia="Segoe UI" w:hAnsi="Segoe UI" w:cs="Segoe UI"/>
+          <w:bCs/>
+          <w:color w:val="232330"/>
+          <w:lang w:eastAsia="pt-BR"/>
+        </w:rPr>
+      </w:pPr>
+      <w:proofErr w:type="spellStart"/>
+      <w:r>
+        <w:rPr>
+          <w:rFonts w:ascii="Segoe UI" w:eastAsia="Segoe UI" w:hAnsi="Segoe UI" w:cs="Segoe UI"/>
+          <w:bCs/>
+          <w:color w:val="232330"/>
+          <w:lang w:eastAsia="pt-BR"/>
+        </w:rPr>
+        <w:t>Save</w:t>
+      </w:r>
+      <w:proofErr w:type="spellEnd"/>
+      <w:r>
+        <w:rPr>
+          <w:rFonts w:ascii="Segoe UI" w:eastAsia="Segoe UI" w:hAnsi="Segoe UI" w:cs="Segoe UI"/>
+          <w:bCs/>
+          <w:color w:val="232330"/>
+          <w:lang w:eastAsia="pt-BR"/>
+        </w:rPr>
+        <w:t xml:space="preserve"> </w:t>
+      </w:r>
+      <w:proofErr w:type="spellStart"/>
+      <w:r>
+        <w:rPr>
+          <w:rFonts w:ascii="Segoe UI" w:eastAsia="Segoe UI" w:hAnsi="Segoe UI" w:cs="Segoe UI"/>
+          <w:bCs/>
+          <w:color w:val="232330"/>
+          <w:lang w:eastAsia="pt-BR"/>
+        </w:rPr>
+        <w:t>to</w:t>
+      </w:r>
+      <w:proofErr w:type="spellEnd"/>
+      <w:r>
+        <w:rPr>
+          <w:rFonts w:ascii="Segoe UI" w:eastAsia="Segoe UI" w:hAnsi="Segoe UI" w:cs="Segoe UI"/>
+          <w:bCs/>
+          <w:color w:val="232330"/>
+          <w:lang w:eastAsia="pt-BR"/>
+        </w:rPr>
+        <w:t xml:space="preserve"> </w:t>
+      </w:r>
+      <w:proofErr w:type="spellStart"/>
+      <w:r>
+        <w:rPr>
+          <w:rFonts w:ascii="Segoe UI" w:eastAsia="Segoe UI" w:hAnsi="Segoe UI" w:cs="Segoe UI"/>
+          <w:bCs/>
+          <w:color w:val="232330"/>
+          <w:lang w:eastAsia="pt-BR"/>
+        </w:rPr>
+        <w:t>database</w:t>
+      </w:r>
+      <w:proofErr w:type="spellEnd"/>
+      <w:r>
+        <w:rPr>
+          <w:rFonts w:ascii="Segoe UI" w:eastAsia="Segoe UI" w:hAnsi="Segoe UI" w:cs="Segoe UI"/>
+          <w:bCs/>
+          <w:color w:val="232330"/>
+          <w:lang w:eastAsia="pt-BR"/>
+        </w:rPr>
+        <w:t>/CSV</w:t>
+      </w:r>
+    </w:p>
+    <w:p>
+      <w:pPr>
+        <w:spacing w:after="100" w:line="240" w:lineRule="auto"/>
+        <w:ind w:left="-142" w:firstLine="142"/>
+        <w:rPr>
+          <w:rFonts w:ascii="Segoe UI" w:eastAsia="Segoe UI" w:hAnsi="Segoe UI" w:cs="Segoe UI"/>
+          <w:bCs/>
+          <w:color w:val="232330"/>
+          <w:lang w:eastAsia="pt-BR"/>
+        </w:rPr>
+      </w:pPr>
+      <w:r>
+        <w:rPr>
+          <w:rFonts w:ascii="Segoe UI" w:eastAsia="Segoe UI" w:hAnsi="Segoe UI" w:cs="Segoe UI"/>
+          <w:bCs/>
+          <w:color w:val="232330"/>
+          <w:lang w:eastAsia="pt-BR"/>
+        </w:rPr>
+        <w:t>↓</w:t>
+      </w:r>
+    </w:p>
+    <w:p>
+      <w:pPr>
+        <w:pBdr>
+          <w:bottom w:val="single" w:sz="12" w:space="1" w:color="auto"/>
+        </w:pBdr>
+        <w:spacing w:after="100" w:line="240" w:lineRule="auto"/>
+        <w:ind w:left="-142" w:firstLine="142"/>
+        <w:rPr>
+          <w:rFonts w:ascii="Segoe UI" w:eastAsia="Segoe UI" w:hAnsi="Segoe UI" w:cs="Segoe UI"/>
+          <w:bCs/>
+          <w:color w:val="232330"/>
+          <w:lang w:eastAsia="pt-BR"/>
+        </w:rPr>
+      </w:pPr>
+      <w:proofErr w:type="spellStart"/>
+      <w:r>
+        <w:rPr>
+          <w:rFonts w:ascii="Segoe UI" w:eastAsia="Segoe UI" w:hAnsi="Segoe UI" w:cs="Segoe UI"/>
+          <w:bCs/>
+          <w:color w:val="232330"/>
+          <w:lang w:eastAsia="pt-BR"/>
+        </w:rPr>
+        <w:t>Dashboard</w:t>
+      </w:r>
+      <w:proofErr w:type="spellEnd"/>
+      <w:r>
+        <w:rPr>
+          <w:rFonts w:ascii="Segoe UI" w:eastAsia="Segoe UI" w:hAnsi="Segoe UI" w:cs="Segoe UI"/>
+          <w:bCs/>
+          <w:color w:val="232330"/>
+          <w:lang w:eastAsia="pt-BR"/>
+        </w:rPr>
+        <w:t xml:space="preserve"> shows </w:t>
+      </w:r>
+      <w:proofErr w:type="spellStart"/>
+      <w:r>
+        <w:rPr>
+          <w:rFonts w:ascii="Segoe UI" w:eastAsia="Segoe UI" w:hAnsi="Segoe UI" w:cs="Segoe UI"/>
+          <w:bCs/>
+          <w:color w:val="232330"/>
+          <w:lang w:eastAsia="pt-BR"/>
+        </w:rPr>
+        <w:t>charts</w:t>
+      </w:r>
+      <w:proofErr w:type="spellEnd"/>
+    </w:p>
+    <w:p>
+      <w:pPr>
+        <w:spacing w:after="100" w:line="240" w:lineRule="auto"/>
+        <w:ind w:left="-142" w:firstLine="142"/>
+        <w:rPr>
+          <w:rFonts w:ascii="Segoe UI" w:eastAsia="Segoe UI" w:hAnsi="Segoe UI" w:cs="Segoe UI"/>
+          <w:bCs/>
+          <w:color w:val="232330"/>
+          <w:lang w:eastAsia="pt-BR"/>
+        </w:rPr>
+      </w:pPr>
+    </w:p>
+    <w:p>
+      <w:pPr>
+        <w:spacing w:after="100" w:line="240" w:lineRule="auto"/>
+        <w:ind w:left="-142" w:firstLine="142"/>
+        <w:rPr>
+          <w:rFonts w:ascii="Segoe UI" w:eastAsia="Segoe UI" w:hAnsi="Segoe UI" w:cs="Segoe UI"/>
+          <w:b/>
+          <w:bCs/>
+          <w:color w:val="232330"/>
+          <w:lang w:eastAsia="pt-BR"/>
+        </w:rPr>
+      </w:pPr>
+      <w:r>
+        <w:rPr>
+          <w:rFonts w:ascii="Segoe UI" w:hAnsi="Segoe UI" w:cs="Segoe UI"/>
+          <w:b/>
+          <w:color w:val="FFFFFF"/>
+          <w:sz w:val="21"/>
+          <w:szCs w:val="21"/>
+          <w:shd w:val="clear" w:color="auto" w:fill="181818"/>
+        </w:rPr>
+        <w:t>Essa é exatamente a linha de aprendizado correta para IA + automação + dados.</w:t>
+      </w:r>
+    </w:p>
+    <w:p>
+      <w:pPr>
+        <w:spacing w:after="100" w:line="240" w:lineRule="auto"/>
+        <w:ind w:left="-142" w:firstLine="142"/>
+        <w:rPr>
+          <w:rFonts w:ascii="Segoe UI" w:eastAsia="Segoe UI" w:hAnsi="Segoe UI" w:cs="Segoe UI"/>
+          <w:bCs/>
+          <w:color w:val="232330"/>
+          <w:lang w:val="en-US" w:eastAsia="pt-BR"/>
+        </w:rPr>
+      </w:pPr>
+      <w:r>
+        <w:rPr>
+          <w:rFonts w:ascii="Segoe UI" w:eastAsia="Segoe UI" w:hAnsi="Segoe UI" w:cs="Segoe UI"/>
+          <w:bCs/>
+          <w:color w:val="232330"/>
+          <w:lang w:val="en-US" w:eastAsia="pt-BR"/>
+        </w:rPr>
+        <w:t>OCR reads the document.</w:t>
+      </w:r>
+    </w:p>
+    <w:p>
+      <w:pPr>
+        <w:spacing w:after="100" w:line="240" w:lineRule="auto"/>
+        <w:ind w:left="-142" w:firstLine="142"/>
+        <w:rPr>
+          <w:rFonts w:ascii="Segoe UI" w:eastAsia="Segoe UI" w:hAnsi="Segoe UI" w:cs="Segoe UI"/>
+          <w:bCs/>
+          <w:color w:val="232330"/>
+          <w:lang w:val="en-US" w:eastAsia="pt-BR"/>
+        </w:rPr>
+      </w:pPr>
+      <w:r>
+        <w:rPr>
+          <w:rFonts w:ascii="Segoe UI" w:eastAsia="Segoe UI" w:hAnsi="Segoe UI" w:cs="Segoe UI"/>
+          <w:bCs/>
+          <w:color w:val="232330"/>
+          <w:lang w:val="en-US" w:eastAsia="pt-BR"/>
+        </w:rPr>
+        <w:t>Python extracts the data.</w:t>
+      </w:r>
+    </w:p>
+    <w:p>
+      <w:pPr>
+        <w:spacing w:after="100" w:line="240" w:lineRule="auto"/>
+        <w:ind w:left="-142" w:firstLine="142"/>
+        <w:rPr>
+          <w:rFonts w:ascii="Segoe UI" w:eastAsia="Segoe UI" w:hAnsi="Segoe UI" w:cs="Segoe UI"/>
+          <w:bCs/>
+          <w:color w:val="232330"/>
+          <w:lang w:val="en-US" w:eastAsia="pt-BR"/>
+        </w:rPr>
+      </w:pPr>
+      <w:r>
+        <w:rPr>
+          <w:rFonts w:ascii="Segoe UI" w:eastAsia="Segoe UI" w:hAnsi="Segoe UI" w:cs="Segoe UI"/>
+          <w:bCs/>
+          <w:color w:val="232330"/>
+          <w:lang w:val="en-US" w:eastAsia="pt-BR"/>
+        </w:rPr>
+        <w:t>Python checks the data.</w:t>
+      </w:r>
+    </w:p>
+    <w:p>
+      <w:pPr>
+        <w:spacing w:after="100" w:line="240" w:lineRule="auto"/>
+        <w:ind w:left="-142" w:firstLine="142"/>
+        <w:rPr>
+          <w:rFonts w:ascii="Segoe UI" w:eastAsia="Segoe UI" w:hAnsi="Segoe UI" w:cs="Segoe UI"/>
+          <w:bCs/>
+          <w:color w:val="232330"/>
+          <w:lang w:val="en-US" w:eastAsia="pt-BR"/>
+        </w:rPr>
+      </w:pPr>
+      <w:r>
+        <w:rPr>
+          <w:rFonts w:ascii="Segoe UI" w:eastAsia="Segoe UI" w:hAnsi="Segoe UI" w:cs="Segoe UI"/>
+          <w:bCs/>
+          <w:color w:val="232330"/>
+          <w:lang w:val="en-US" w:eastAsia="pt-BR"/>
+        </w:rPr>
+        <w:t>CSV saves the result.</w:t>
+      </w:r>
+    </w:p>
+    <w:p>
+      <w:pPr>
+        <w:spacing w:after="100" w:line="240" w:lineRule="auto"/>
+        <w:ind w:left="-142" w:firstLine="142"/>
+        <w:rPr>
+          <w:rFonts w:ascii="Segoe UI" w:eastAsia="Segoe UI" w:hAnsi="Segoe UI" w:cs="Segoe UI"/>
+          <w:bCs/>
+          <w:color w:val="232330"/>
+          <w:lang w:eastAsia="pt-BR"/>
+        </w:rPr>
+      </w:pPr>
+      <w:r>
+        <w:rPr>
+          <w:rFonts w:ascii="Segoe UI" w:eastAsia="Segoe UI" w:hAnsi="Segoe UI" w:cs="Segoe UI"/>
+          <w:bCs/>
+          <w:color w:val="232330"/>
+          <w:lang w:eastAsia="pt-BR"/>
+        </w:rPr>
+        <w:lastRenderedPageBreak/>
+        <w:t xml:space="preserve">Pandas </w:t>
+      </w:r>
+      <w:proofErr w:type="spellStart"/>
+      <w:r>
+        <w:rPr>
+          <w:rFonts w:ascii="Segoe UI" w:eastAsia="Segoe UI" w:hAnsi="Segoe UI" w:cs="Segoe UI"/>
+          <w:bCs/>
+          <w:color w:val="232330"/>
+          <w:lang w:eastAsia="pt-BR"/>
+        </w:rPr>
+        <w:t>analyzes</w:t>
+      </w:r>
+      <w:proofErr w:type="spellEnd"/>
+      <w:r>
+        <w:rPr>
+          <w:rFonts w:ascii="Segoe UI" w:eastAsia="Segoe UI" w:hAnsi="Segoe UI" w:cs="Segoe UI"/>
+          <w:bCs/>
+          <w:color w:val="232330"/>
+          <w:lang w:eastAsia="pt-BR"/>
+        </w:rPr>
+        <w:t xml:space="preserve"> </w:t>
+      </w:r>
+      <w:proofErr w:type="spellStart"/>
+      <w:r>
+        <w:rPr>
+          <w:rFonts w:ascii="Segoe UI" w:eastAsia="Segoe UI" w:hAnsi="Segoe UI" w:cs="Segoe UI"/>
+          <w:bCs/>
+          <w:color w:val="232330"/>
+          <w:lang w:eastAsia="pt-BR"/>
+        </w:rPr>
+        <w:t>the</w:t>
+      </w:r>
+      <w:proofErr w:type="spellEnd"/>
+      <w:r>
+        <w:rPr>
+          <w:rFonts w:ascii="Segoe UI" w:eastAsia="Segoe UI" w:hAnsi="Segoe UI" w:cs="Segoe UI"/>
+          <w:bCs/>
+          <w:color w:val="232330"/>
+          <w:lang w:eastAsia="pt-BR"/>
+        </w:rPr>
+        <w:t xml:space="preserve"> CSV.</w:t>
+      </w:r>
+    </w:p>
+    <w:p>
+      <w:pPr>
+        <w:pBdr>
+          <w:bottom w:val="single" w:sz="12" w:space="1" w:color="auto"/>
+        </w:pBdr>
+        <w:spacing w:after="100" w:line="240" w:lineRule="auto"/>
+        <w:ind w:left="-142" w:firstLine="142"/>
+        <w:rPr>
+          <w:rFonts w:ascii="Segoe UI" w:eastAsia="Segoe UI" w:hAnsi="Segoe UI" w:cs="Segoe UI"/>
+          <w:bCs/>
+          <w:color w:val="232330"/>
+          <w:lang w:eastAsia="pt-BR"/>
+        </w:rPr>
+      </w:pPr>
+      <w:proofErr w:type="spellStart"/>
+      <w:r>
+        <w:rPr>
+          <w:rFonts w:ascii="Segoe UI" w:eastAsia="Segoe UI" w:hAnsi="Segoe UI" w:cs="Segoe UI"/>
+          <w:bCs/>
+          <w:color w:val="232330"/>
+          <w:lang w:eastAsia="pt-BR"/>
+        </w:rPr>
+        <w:t>Flask</w:t>
+      </w:r>
+      <w:proofErr w:type="spellEnd"/>
+      <w:r>
+        <w:rPr>
+          <w:rFonts w:ascii="Segoe UI" w:eastAsia="Segoe UI" w:hAnsi="Segoe UI" w:cs="Segoe UI"/>
+          <w:bCs/>
+          <w:color w:val="232330"/>
+          <w:lang w:eastAsia="pt-BR"/>
+        </w:rPr>
+        <w:t xml:space="preserve"> shows </w:t>
+      </w:r>
+      <w:proofErr w:type="spellStart"/>
+      <w:r>
+        <w:rPr>
+          <w:rFonts w:ascii="Segoe UI" w:eastAsia="Segoe UI" w:hAnsi="Segoe UI" w:cs="Segoe UI"/>
+          <w:bCs/>
+          <w:color w:val="232330"/>
+          <w:lang w:eastAsia="pt-BR"/>
+        </w:rPr>
+        <w:t>the</w:t>
+      </w:r>
+      <w:proofErr w:type="spellEnd"/>
+      <w:r>
+        <w:rPr>
+          <w:rFonts w:ascii="Segoe UI" w:eastAsia="Segoe UI" w:hAnsi="Segoe UI" w:cs="Segoe UI"/>
+          <w:bCs/>
+          <w:color w:val="232330"/>
+          <w:lang w:eastAsia="pt-BR"/>
+        </w:rPr>
+        <w:t xml:space="preserve"> </w:t>
+      </w:r>
+      <w:proofErr w:type="spellStart"/>
+      <w:r>
+        <w:rPr>
+          <w:rFonts w:ascii="Segoe UI" w:eastAsia="Segoe UI" w:hAnsi="Segoe UI" w:cs="Segoe UI"/>
+          <w:bCs/>
+          <w:color w:val="232330"/>
+          <w:lang w:eastAsia="pt-BR"/>
+        </w:rPr>
+        <w:t>dashboard</w:t>
+      </w:r>
+      <w:proofErr w:type="spellEnd"/>
+      <w:r>
+        <w:rPr>
+          <w:rFonts w:ascii="Segoe UI" w:eastAsia="Segoe UI" w:hAnsi="Segoe UI" w:cs="Segoe UI"/>
+          <w:bCs/>
+          <w:color w:val="232330"/>
+          <w:lang w:eastAsia="pt-BR"/>
+        </w:rPr>
+        <w:t>.</w:t>
+      </w:r>
+    </w:p>
+    <w:p>
+      <w:pPr>
+        <w:pBdr>
+          <w:bottom w:val="single" w:sz="12" w:space="1" w:color="auto"/>
+        </w:pBdr>
+        <w:spacing w:after="100" w:line="240" w:lineRule="auto"/>
+        <w:ind w:left="-142" w:firstLine="142"/>
+        <w:rPr>
+          <w:rFonts w:ascii="Segoe UI" w:eastAsia="Segoe UI" w:hAnsi="Segoe UI" w:cs="Segoe UI"/>
+          <w:bCs/>
+          <w:color w:val="232330"/>
+          <w:lang w:eastAsia="pt-BR"/>
+        </w:rPr>
+      </w:pPr>
+      <w:bookmarkStart w:id="0" w:name="_GoBack"/>
+      <w:bookmarkEnd w:id="0"/>
+    </w:p>
+    <w:p>
+      <w:pPr>
+        <w:spacing w:after="100" w:line="240" w:lineRule="auto"/>
+        <w:ind w:left="-142" w:firstLine="142"/>
+        <w:rPr>
+          <w:rFonts w:ascii="Segoe UI" w:eastAsia="Segoe UI" w:hAnsi="Segoe UI" w:cs="Segoe UI"/>
+          <w:bCs/>
+          <w:color w:val="232330"/>
+          <w:lang w:eastAsia="pt-BR"/>
+        </w:rPr>
+      </w:pPr>
+    </w:p>
+    <w:p>
+      <w:pPr>
+        <w:spacing w:after="100" w:line="240" w:lineRule="auto"/>
+        <w:ind w:left="-142" w:firstLine="142"/>
+        <w:rPr>
+          <w:rFonts w:ascii="Segoe UI" w:eastAsia="Segoe UI" w:hAnsi="Segoe UI" w:cs="Segoe UI"/>
+          <w:bCs/>
+          <w:color w:val="232330"/>
+          <w:lang w:eastAsia="pt-BR"/>
+        </w:rPr>
+      </w:pPr>
+    </w:p>
+    <w:p>
+      <w:pPr>
+        <w:spacing w:after="100" w:line="240" w:lineRule="auto"/>
+        <w:ind w:left="-142" w:firstLine="142"/>
+        <w:rPr>
+          <w:rFonts w:ascii="Segoe UI" w:eastAsia="Segoe UI" w:hAnsi="Segoe UI" w:cs="Segoe UI"/>
+          <w:bCs/>
+          <w:color w:val="232330"/>
+          <w:lang w:eastAsia="pt-BR"/>
+        </w:rPr>
+      </w:pPr>
+    </w:p>
+    <w:p>
+      <w:pPr>
+        <w:pStyle w:val="markdowntexteoxv2137"/>
+        <w:pBdr>
+          <w:top w:val="single" w:sz="2" w:space="0" w:color="auto"/>
+          <w:left w:val="single" w:sz="2" w:space="0" w:color="auto"/>
+          <w:bottom w:val="single" w:sz="2" w:space="0" w:color="auto"/>
+          <w:right w:val="single" w:sz="2" w:space="0" w:color="auto"/>
+        </w:pBdr>
+        <w:shd w:val="clear" w:color="auto" w:fill="181818"/>
+        <w:spacing w:before="0" w:after="0" w:line="330" w:lineRule="atLeast"/>
+        <w:rPr>
+          <w:rFonts w:ascii="Segoe UI" w:hAnsi="Segoe UI" w:cs="Segoe UI"/>
+          <w:color w:val="FFFFFF"/>
+          <w:sz w:val="21"/>
+          <w:szCs w:val="21"/>
+        </w:rPr>
+      </w:pPr>
+      <w:r>
+        <w:rPr>
+          <w:rStyle w:val="Forte"/>
+          <w:rFonts w:ascii="Segoe UI" w:hAnsi="Segoe UI" w:cs="Segoe UI"/>
+          <w:color w:val="FFFFFF"/>
+          <w:sz w:val="21"/>
+          <w:szCs w:val="21"/>
+          <w:bdr w:val="single" w:sz="2" w:space="0" w:color="auto" w:frame="1"/>
+        </w:rPr>
+        <w:t>A Ordem Certa De Aprendizado</w:t>
+      </w:r>
+      <w:r>
+        <w:rPr>
+          <w:rFonts w:ascii="Segoe UI" w:hAnsi="Segoe UI" w:cs="Segoe UI"/>
+          <w:color w:val="FFFFFF"/>
+          <w:sz w:val="21"/>
+          <w:szCs w:val="21"/>
+        </w:rPr>
+        <w:br/>
+      </w:r>
+      <w:proofErr w:type="gramStart"/>
+      <w:r>
+        <w:rPr>
+          <w:rFonts w:ascii="Segoe UI" w:hAnsi="Segoe UI" w:cs="Segoe UI"/>
+          <w:color w:val="FFFFFF"/>
+          <w:sz w:val="21"/>
+          <w:szCs w:val="21"/>
+        </w:rPr>
+        <w:t>Estamos</w:t>
+      </w:r>
+      <w:proofErr w:type="gramEnd"/>
+      <w:r>
+        <w:rPr>
+          <w:rFonts w:ascii="Segoe UI" w:hAnsi="Segoe UI" w:cs="Segoe UI"/>
+          <w:color w:val="FFFFFF"/>
+          <w:sz w:val="21"/>
+          <w:szCs w:val="21"/>
+        </w:rPr>
+        <w:t xml:space="preserve"> seguindo uma ordem muito boa:</w:t>
+      </w:r>
+    </w:p>
+    <w:p>
+      <w:pPr>
+        <w:pStyle w:val="markdowntexteoxv2137"/>
+        <w:numPr>
+          <w:ilvl w:val="0"/>
+          <w:numId w:val="5"/>
+        </w:numPr>
+        <w:pBdr>
+          <w:top w:val="single" w:sz="2" w:space="0" w:color="auto"/>
+          <w:left w:val="single" w:sz="2" w:space="0" w:color="auto"/>
+          <w:bottom w:val="single" w:sz="2" w:space="0" w:color="auto"/>
+          <w:right w:val="single" w:sz="2" w:space="0" w:color="auto"/>
+        </w:pBdr>
+        <w:shd w:val="clear" w:color="auto" w:fill="181818"/>
+        <w:spacing w:before="0" w:beforeAutospacing="0" w:after="0" w:afterAutospacing="0" w:line="330" w:lineRule="atLeast"/>
+        <w:ind w:left="0"/>
+        <w:rPr>
+          <w:rFonts w:ascii="Segoe UI" w:hAnsi="Segoe UI" w:cs="Segoe UI"/>
+          <w:color w:val="FFFFFF"/>
+          <w:sz w:val="21"/>
+          <w:szCs w:val="21"/>
+        </w:rPr>
+      </w:pPr>
+      <w:r>
+        <w:rPr>
+          <w:rStyle w:val="Forte"/>
+          <w:rFonts w:ascii="Segoe UI" w:hAnsi="Segoe UI" w:cs="Segoe UI"/>
+          <w:color w:val="FFFFFF"/>
+          <w:sz w:val="21"/>
+          <w:szCs w:val="21"/>
+          <w:bdr w:val="single" w:sz="2" w:space="0" w:color="auto" w:frame="1"/>
+        </w:rPr>
+        <w:t xml:space="preserve">Python </w:t>
+      </w:r>
+      <w:proofErr w:type="spellStart"/>
+      <w:r>
+        <w:rPr>
+          <w:rStyle w:val="Forte"/>
+          <w:rFonts w:ascii="Segoe UI" w:hAnsi="Segoe UI" w:cs="Segoe UI"/>
+          <w:color w:val="FFFFFF"/>
+          <w:sz w:val="21"/>
+          <w:szCs w:val="21"/>
+          <w:bdr w:val="single" w:sz="2" w:space="0" w:color="auto" w:frame="1"/>
+        </w:rPr>
+        <w:t>logic</w:t>
+      </w:r>
+      <w:proofErr w:type="spellEnd"/>
+      <w:r>
+        <w:rPr>
+          <w:rFonts w:ascii="Segoe UI" w:hAnsi="Segoe UI" w:cs="Segoe UI"/>
+          <w:color w:val="FFFFFF"/>
+          <w:sz w:val="21"/>
+          <w:szCs w:val="21"/>
+        </w:rPr>
+        <w:br/>
+        <w:t>Você entende a automação sem distração.</w:t>
+      </w:r>
+    </w:p>
+    <w:p>
+      <w:pPr>
+        <w:pStyle w:val="markdowntexteoxv2137"/>
+        <w:numPr>
+          <w:ilvl w:val="0"/>
+          <w:numId w:val="5"/>
+        </w:numPr>
+        <w:pBdr>
+          <w:top w:val="single" w:sz="2" w:space="0" w:color="auto"/>
+          <w:left w:val="single" w:sz="2" w:space="0" w:color="auto"/>
+          <w:bottom w:val="single" w:sz="2" w:space="0" w:color="auto"/>
+          <w:right w:val="single" w:sz="2" w:space="0" w:color="auto"/>
+        </w:pBdr>
+        <w:shd w:val="clear" w:color="auto" w:fill="181818"/>
+        <w:spacing w:before="0" w:beforeAutospacing="0" w:after="0" w:afterAutospacing="0" w:line="330" w:lineRule="atLeast"/>
+        <w:ind w:left="0"/>
+        <w:rPr>
+          <w:rFonts w:ascii="Segoe UI" w:hAnsi="Segoe UI" w:cs="Segoe UI"/>
+          <w:color w:val="FFFFFF"/>
+          <w:sz w:val="21"/>
+          <w:szCs w:val="21"/>
+        </w:rPr>
+      </w:pPr>
+      <w:r>
+        <w:rPr>
+          <w:rStyle w:val="Forte"/>
+          <w:rFonts w:ascii="Segoe UI" w:hAnsi="Segoe UI" w:cs="Segoe UI"/>
+          <w:color w:val="FFFFFF"/>
+          <w:sz w:val="21"/>
+          <w:szCs w:val="21"/>
+          <w:bdr w:val="single" w:sz="2" w:space="0" w:color="auto" w:frame="1"/>
+        </w:rPr>
+        <w:t xml:space="preserve">CSV </w:t>
+      </w:r>
+      <w:proofErr w:type="spellStart"/>
+      <w:r>
+        <w:rPr>
+          <w:rStyle w:val="Forte"/>
+          <w:rFonts w:ascii="Segoe UI" w:hAnsi="Segoe UI" w:cs="Segoe UI"/>
+          <w:color w:val="FFFFFF"/>
+          <w:sz w:val="21"/>
+          <w:szCs w:val="21"/>
+          <w:bdr w:val="single" w:sz="2" w:space="0" w:color="auto" w:frame="1"/>
+        </w:rPr>
+        <w:t>export</w:t>
+      </w:r>
+      <w:proofErr w:type="spellEnd"/>
+      <w:r>
+        <w:rPr>
+          <w:rFonts w:ascii="Segoe UI" w:hAnsi="Segoe UI" w:cs="Segoe UI"/>
+          <w:color w:val="FFFFFF"/>
+          <w:sz w:val="21"/>
+          <w:szCs w:val="21"/>
+        </w:rPr>
+        <w:br/>
+        <w:t>Você aprende a salvar resultados.</w:t>
+      </w:r>
+    </w:p>
+    <w:p>
+      <w:pPr>
+        <w:pStyle w:val="markdowntexteoxv2137"/>
+        <w:numPr>
+          <w:ilvl w:val="0"/>
+          <w:numId w:val="5"/>
+        </w:numPr>
+        <w:pBdr>
+          <w:top w:val="single" w:sz="2" w:space="0" w:color="auto"/>
+          <w:left w:val="single" w:sz="2" w:space="0" w:color="auto"/>
+          <w:bottom w:val="single" w:sz="2" w:space="0" w:color="auto"/>
+          <w:right w:val="single" w:sz="2" w:space="0" w:color="auto"/>
+        </w:pBdr>
+        <w:shd w:val="clear" w:color="auto" w:fill="181818"/>
+        <w:spacing w:before="0" w:beforeAutospacing="0" w:after="0" w:afterAutospacing="0" w:line="330" w:lineRule="atLeast"/>
+        <w:ind w:left="0"/>
+        <w:rPr>
+          <w:rFonts w:ascii="Segoe UI" w:hAnsi="Segoe UI" w:cs="Segoe UI"/>
+          <w:color w:val="FFFFFF"/>
+          <w:sz w:val="21"/>
+          <w:szCs w:val="21"/>
+        </w:rPr>
+      </w:pPr>
+      <w:r>
+        <w:rPr>
+          <w:rStyle w:val="Forte"/>
+          <w:rFonts w:ascii="Segoe UI" w:hAnsi="Segoe UI" w:cs="Segoe UI"/>
+          <w:color w:val="FFFFFF"/>
+          <w:sz w:val="21"/>
+          <w:szCs w:val="21"/>
+          <w:bdr w:val="single" w:sz="2" w:space="0" w:color="auto" w:frame="1"/>
+        </w:rPr>
+        <w:t>Pandas</w:t>
+      </w:r>
+      <w:r>
+        <w:rPr>
+          <w:rFonts w:ascii="Segoe UI" w:hAnsi="Segoe UI" w:cs="Segoe UI"/>
+          <w:color w:val="FFFFFF"/>
+          <w:sz w:val="21"/>
+          <w:szCs w:val="21"/>
+        </w:rPr>
+        <w:br/>
+        <w:t>Você aprende análise de dados.</w:t>
+      </w:r>
+    </w:p>
+    <w:p>
+      <w:pPr>
+        <w:pStyle w:val="markdowntexteoxv2137"/>
+        <w:numPr>
+          <w:ilvl w:val="0"/>
+          <w:numId w:val="5"/>
+        </w:numPr>
+        <w:pBdr>
+          <w:top w:val="single" w:sz="2" w:space="0" w:color="auto"/>
+          <w:left w:val="single" w:sz="2" w:space="0" w:color="auto"/>
+          <w:bottom w:val="single" w:sz="2" w:space="0" w:color="auto"/>
+          <w:right w:val="single" w:sz="2" w:space="0" w:color="auto"/>
+        </w:pBdr>
+        <w:shd w:val="clear" w:color="auto" w:fill="181818"/>
+        <w:spacing w:before="0" w:beforeAutospacing="0" w:after="0" w:afterAutospacing="0" w:line="330" w:lineRule="atLeast"/>
+        <w:ind w:left="0"/>
+        <w:rPr>
+          <w:rFonts w:ascii="Segoe UI" w:hAnsi="Segoe UI" w:cs="Segoe UI"/>
+          <w:color w:val="FFFFFF"/>
+          <w:sz w:val="21"/>
+          <w:szCs w:val="21"/>
+        </w:rPr>
+      </w:pPr>
+      <w:r>
+        <w:rPr>
+          <w:rStyle w:val="Forte"/>
+          <w:rFonts w:ascii="Segoe UI" w:hAnsi="Segoe UI" w:cs="Segoe UI"/>
+          <w:color w:val="FFFFFF"/>
+          <w:sz w:val="21"/>
+          <w:szCs w:val="21"/>
+          <w:bdr w:val="single" w:sz="2" w:space="0" w:color="auto" w:frame="1"/>
+        </w:rPr>
+        <w:t>Project folders</w:t>
+      </w:r>
+      <w:r>
+        <w:rPr>
+          <w:rFonts w:ascii="Segoe UI" w:hAnsi="Segoe UI" w:cs="Segoe UI"/>
+          <w:color w:val="FFFFFF"/>
+          <w:sz w:val="21"/>
+          <w:szCs w:val="21"/>
+        </w:rPr>
+        <w:br/>
+        <w:t>Você aprende organização profissional.</w:t>
+      </w:r>
+    </w:p>
+    <w:p>
+      <w:pPr>
+        <w:pStyle w:val="markdowntexteoxv2137"/>
+        <w:numPr>
+          <w:ilvl w:val="0"/>
+          <w:numId w:val="5"/>
+        </w:numPr>
+        <w:pBdr>
+          <w:top w:val="single" w:sz="2" w:space="0" w:color="auto"/>
+          <w:left w:val="single" w:sz="2" w:space="0" w:color="auto"/>
+          <w:bottom w:val="single" w:sz="2" w:space="0" w:color="auto"/>
+          <w:right w:val="single" w:sz="2" w:space="0" w:color="auto"/>
+        </w:pBdr>
+        <w:shd w:val="clear" w:color="auto" w:fill="181818"/>
+        <w:spacing w:before="0" w:beforeAutospacing="0" w:after="0" w:afterAutospacing="0" w:line="330" w:lineRule="atLeast"/>
+        <w:ind w:left="0"/>
+        <w:rPr>
+          <w:rFonts w:ascii="Segoe UI" w:hAnsi="Segoe UI" w:cs="Segoe UI"/>
+          <w:color w:val="FFFFFF"/>
+          <w:sz w:val="21"/>
+          <w:szCs w:val="21"/>
+        </w:rPr>
+      </w:pPr>
+      <w:proofErr w:type="spellStart"/>
+      <w:r>
+        <w:rPr>
+          <w:rStyle w:val="Forte"/>
+          <w:rFonts w:ascii="Segoe UI" w:hAnsi="Segoe UI" w:cs="Segoe UI"/>
+          <w:color w:val="FFFFFF"/>
+          <w:sz w:val="21"/>
+          <w:szCs w:val="21"/>
+          <w:bdr w:val="single" w:sz="2" w:space="0" w:color="auto" w:frame="1"/>
+        </w:rPr>
+        <w:t>Flask</w:t>
+      </w:r>
+      <w:proofErr w:type="spellEnd"/>
+      <w:r>
+        <w:rPr>
+          <w:rFonts w:ascii="Segoe UI" w:hAnsi="Segoe UI" w:cs="Segoe UI"/>
+          <w:color w:val="FFFFFF"/>
+          <w:sz w:val="21"/>
+          <w:szCs w:val="21"/>
+        </w:rPr>
+        <w:br/>
+        <w:t>Você coloca a lógica na web.</w:t>
+      </w:r>
+    </w:p>
+    <w:p>
+      <w:pPr>
+        <w:pStyle w:val="markdowntexteoxv2137"/>
+        <w:numPr>
+          <w:ilvl w:val="0"/>
+          <w:numId w:val="5"/>
+        </w:numPr>
+        <w:pBdr>
+          <w:top w:val="single" w:sz="2" w:space="0" w:color="auto"/>
+          <w:left w:val="single" w:sz="2" w:space="0" w:color="auto"/>
+          <w:bottom w:val="single" w:sz="2" w:space="0" w:color="auto"/>
+          <w:right w:val="single" w:sz="2" w:space="0" w:color="auto"/>
+        </w:pBdr>
+        <w:shd w:val="clear" w:color="auto" w:fill="181818"/>
+        <w:spacing w:before="0" w:beforeAutospacing="0" w:after="0" w:afterAutospacing="0" w:line="330" w:lineRule="atLeast"/>
+        <w:ind w:left="0"/>
+        <w:rPr>
+          <w:rFonts w:ascii="Segoe UI" w:hAnsi="Segoe UI" w:cs="Segoe UI"/>
+          <w:color w:val="FFFFFF"/>
+          <w:sz w:val="21"/>
+          <w:szCs w:val="21"/>
+        </w:rPr>
+      </w:pPr>
+      <w:proofErr w:type="spellStart"/>
+      <w:r>
+        <w:rPr>
+          <w:rStyle w:val="Forte"/>
+          <w:rFonts w:ascii="Segoe UI" w:hAnsi="Segoe UI" w:cs="Segoe UI"/>
+          <w:color w:val="FFFFFF"/>
+          <w:sz w:val="21"/>
+          <w:szCs w:val="21"/>
+          <w:bdr w:val="single" w:sz="2" w:space="0" w:color="auto" w:frame="1"/>
+        </w:rPr>
+        <w:t>Database</w:t>
+      </w:r>
+      <w:proofErr w:type="spellEnd"/>
+      <w:r>
+        <w:rPr>
+          <w:rFonts w:ascii="Segoe UI" w:hAnsi="Segoe UI" w:cs="Segoe UI"/>
+          <w:color w:val="FFFFFF"/>
+          <w:sz w:val="21"/>
+          <w:szCs w:val="21"/>
+        </w:rPr>
+        <w:br/>
+        <w:t>Você cria histórico real.</w:t>
+      </w:r>
+    </w:p>
+    <w:p>
+      <w:pPr>
+        <w:pStyle w:val="markdowntexteoxv2137"/>
+        <w:numPr>
+          <w:ilvl w:val="0"/>
+          <w:numId w:val="5"/>
+        </w:numPr>
+        <w:pBdr>
+          <w:top w:val="single" w:sz="2" w:space="0" w:color="auto"/>
+          <w:left w:val="single" w:sz="2" w:space="0" w:color="auto"/>
+          <w:bottom w:val="single" w:sz="2" w:space="0" w:color="auto"/>
+          <w:right w:val="single" w:sz="2" w:space="0" w:color="auto"/>
+        </w:pBdr>
+        <w:shd w:val="clear" w:color="auto" w:fill="181818"/>
+        <w:spacing w:before="0" w:beforeAutospacing="0" w:after="0" w:afterAutospacing="0" w:line="330" w:lineRule="atLeast"/>
+        <w:ind w:left="0"/>
+        <w:rPr>
+          <w:rFonts w:ascii="Segoe UI" w:hAnsi="Segoe UI" w:cs="Segoe UI"/>
+          <w:color w:val="FFFFFF"/>
+          <w:sz w:val="21"/>
+          <w:szCs w:val="21"/>
+        </w:rPr>
+      </w:pPr>
+      <w:proofErr w:type="spellStart"/>
+      <w:r>
+        <w:rPr>
+          <w:rStyle w:val="Forte"/>
+          <w:rFonts w:ascii="Segoe UI" w:hAnsi="Segoe UI" w:cs="Segoe UI"/>
+          <w:color w:val="FFFFFF"/>
+          <w:sz w:val="21"/>
+          <w:szCs w:val="21"/>
+          <w:bdr w:val="single" w:sz="2" w:space="0" w:color="auto" w:frame="1"/>
+        </w:rPr>
+        <w:t>Dashboard</w:t>
+      </w:r>
+      <w:proofErr w:type="spellEnd"/>
+      <w:r>
+        <w:rPr>
+          <w:rFonts w:ascii="Segoe UI" w:hAnsi="Segoe UI" w:cs="Segoe UI"/>
+          <w:color w:val="FFFFFF"/>
+          <w:sz w:val="21"/>
+          <w:szCs w:val="21"/>
+        </w:rPr>
+        <w:br/>
+        <w:t>Você apresenta os dados.</w:t>
+      </w:r>
+    </w:p>
+    <w:p>
+      <w:pPr>
+        <w:pStyle w:val="markdowntexteoxv2137"/>
+        <w:numPr>
+          <w:ilvl w:val="0"/>
+          <w:numId w:val="5"/>
+        </w:numPr>
+        <w:pBdr>
+          <w:top w:val="single" w:sz="2" w:space="0" w:color="auto"/>
+          <w:left w:val="single" w:sz="2" w:space="0" w:color="auto"/>
+          <w:bottom w:val="single" w:sz="2" w:space="0" w:color="auto"/>
+          <w:right w:val="single" w:sz="2" w:space="0" w:color="auto"/>
+        </w:pBdr>
+        <w:shd w:val="clear" w:color="auto" w:fill="181818"/>
+        <w:spacing w:before="0" w:beforeAutospacing="0" w:after="0" w:afterAutospacing="0" w:line="330" w:lineRule="atLeast"/>
+        <w:ind w:left="0"/>
+        <w:rPr>
+          <w:rFonts w:ascii="Segoe UI" w:hAnsi="Segoe UI" w:cs="Segoe UI"/>
+          <w:color w:val="FFFFFF"/>
+          <w:sz w:val="21"/>
+          <w:szCs w:val="21"/>
+        </w:rPr>
+      </w:pPr>
+      <w:r>
+        <w:rPr>
+          <w:rStyle w:val="Forte"/>
+          <w:rFonts w:ascii="Segoe UI" w:hAnsi="Segoe UI" w:cs="Segoe UI"/>
+          <w:color w:val="FFFFFF"/>
+          <w:sz w:val="21"/>
+          <w:szCs w:val="21"/>
+          <w:bdr w:val="single" w:sz="2" w:space="0" w:color="auto" w:frame="1"/>
+        </w:rPr>
+        <w:t>OCR</w:t>
+      </w:r>
+      <w:r>
+        <w:rPr>
+          <w:rFonts w:ascii="Segoe UI" w:hAnsi="Segoe UI" w:cs="Segoe UI"/>
+          <w:color w:val="FFFFFF"/>
+          <w:sz w:val="21"/>
+          <w:szCs w:val="21"/>
+        </w:rPr>
+        <w:br/>
+        <w:t>Você automatiza entrada de documentos reais.</w:t>
+      </w:r>
+    </w:p>
+    <w:p>
+      <w:pPr>
+        <w:pStyle w:val="markdowntexteoxv2137"/>
+        <w:numPr>
+          <w:ilvl w:val="0"/>
+          <w:numId w:val="5"/>
+        </w:numPr>
+        <w:pBdr>
+          <w:top w:val="single" w:sz="2" w:space="0" w:color="auto"/>
+          <w:left w:val="single" w:sz="2" w:space="0" w:color="auto"/>
+          <w:bottom w:val="single" w:sz="2" w:space="0" w:color="auto"/>
+          <w:right w:val="single" w:sz="2" w:space="0" w:color="auto"/>
+        </w:pBdr>
+        <w:shd w:val="clear" w:color="auto" w:fill="181818"/>
+        <w:spacing w:before="0" w:beforeAutospacing="0" w:after="0" w:afterAutospacing="0" w:line="330" w:lineRule="atLeast"/>
+        <w:ind w:left="0"/>
+        <w:rPr>
+          <w:rFonts w:ascii="Segoe UI" w:hAnsi="Segoe UI" w:cs="Segoe UI"/>
+          <w:color w:val="FFFFFF"/>
+          <w:sz w:val="21"/>
+          <w:szCs w:val="21"/>
+        </w:rPr>
+      </w:pPr>
+      <w:r>
+        <w:rPr>
+          <w:rStyle w:val="Forte"/>
+          <w:rFonts w:ascii="Segoe UI" w:hAnsi="Segoe UI" w:cs="Segoe UI"/>
+          <w:color w:val="FFFFFF"/>
+          <w:sz w:val="21"/>
+          <w:szCs w:val="21"/>
+          <w:bdr w:val="single" w:sz="2" w:space="0" w:color="auto" w:frame="1"/>
+        </w:rPr>
+        <w:t>ML</w:t>
+      </w:r>
+      <w:r>
+        <w:rPr>
+          <w:rFonts w:ascii="Segoe UI" w:hAnsi="Segoe UI" w:cs="Segoe UI"/>
+          <w:color w:val="FFFFFF"/>
+          <w:sz w:val="21"/>
+          <w:szCs w:val="21"/>
+        </w:rPr>
+        <w:br/>
+        <w:t>Você classifica tipos de documentos.</w:t>
+      </w:r>
+    </w:p>
+    <w:p>
+      <w:pPr>
+        <w:pBdr>
+          <w:bottom w:val="single" w:sz="12" w:space="1" w:color="auto"/>
+        </w:pBdr>
+        <w:spacing w:after="100" w:line="240" w:lineRule="auto"/>
+        <w:ind w:left="-142" w:firstLine="142"/>
+        <w:rPr>
+          <w:rFonts w:ascii="Segoe UI" w:eastAsia="Segoe UI" w:hAnsi="Segoe UI" w:cs="Segoe UI"/>
+          <w:bCs/>
+          <w:color w:val="232330"/>
+          <w:lang w:eastAsia="pt-BR"/>
+        </w:rPr>
+      </w:pPr>
+    </w:p>
+    <w:p>
+      <w:pPr>
+        <w:spacing w:after="100" w:line="240" w:lineRule="auto"/>
+        <w:ind w:left="-142" w:firstLine="142"/>
+        <w:rPr>
+          <w:rFonts w:ascii="Segoe UI" w:eastAsia="Segoe UI" w:hAnsi="Segoe UI" w:cs="Segoe UI"/>
+          <w:bCs/>
+          <w:color w:val="232330"/>
+          <w:lang w:eastAsia="pt-BR"/>
+        </w:rPr>
+      </w:pPr>
     </w:p>
     <w:p/>
     <w:p>
@@ -882,6 +2561,7 @@
           <w:bdr w:val="single" w:sz="2" w:space="0" w:color="auto" w:frame="1"/>
           <w:lang w:eastAsia="pt-BR"/>
         </w:rPr>
+        <w:lastRenderedPageBreak/>
         <w:t xml:space="preserve">Render / Railway / </w:t>
       </w:r>
       <w:proofErr w:type="spellStart"/>
@@ -2102,7 +3782,6 @@
           <w:szCs w:val="21"/>
           <w:lang w:eastAsia="pt-BR"/>
         </w:rPr>
-        <w:lastRenderedPageBreak/>
         <w:t>Depois, se quiser, podemos adicionar resumo automático com modelo local ou uma versão opcional usando API. Mas o projeto não depende disso.</w:t>
       </w:r>
     </w:p>
@@ -2968,6 +4647,7 @@
           <w:szCs w:val="21"/>
           <w:lang w:eastAsia="pt-BR"/>
         </w:rPr>
+        <w:lastRenderedPageBreak/>
         <w:t>A proposta final:</w:t>
       </w:r>
     </w:p>
@@ -3527,7 +5207,6 @@
           <w:rFonts w:ascii="Arial" w:hAnsi="Arial" w:cs="Arial"/>
           <w:lang w:val="en-US"/>
         </w:rPr>
-        <w:lastRenderedPageBreak/>
         <w:t>├</w:t>
       </w:r>
       <w:r>
@@ -3762,6 +5441,7 @@
         <w:rPr>
           <w:u w:val="single"/>
         </w:rPr>
+        <w:lastRenderedPageBreak/>
         <w:t>7. ML</w:t>
       </w:r>
     </w:p>
@@ -4102,7 +5782,6 @@
         <w:rPr>
           <w:lang w:val="en-US"/>
         </w:rPr>
-        <w:lastRenderedPageBreak/>
         <w:t xml:space="preserve">   ↓</w:t>
       </w:r>
     </w:p>
@@ -4370,6 +6049,7 @@
           <w:u w:val="single"/>
           <w:lang w:val="en-US"/>
         </w:rPr>
+        <w:lastRenderedPageBreak/>
         <w:t>services/reporter.py</w:t>
       </w:r>
       <w:proofErr w:type="gramEnd"/>
@@ -4820,7 +6500,6 @@
         <w:rPr>
           <w:lang w:val="en-US"/>
         </w:rPr>
-        <w:lastRenderedPageBreak/>
         <w:t>Então isso é base profissional.</w:t>
       </w:r>
     </w:p>
@@ -5207,6 +6886,7 @@
         <w:rPr>
           <w:lang w:val="en-US"/>
         </w:rPr>
+        <w:lastRenderedPageBreak/>
         <w:t>many</w:t>
       </w:r>
       <w:proofErr w:type="gramEnd"/>
@@ -5415,8 +7095,909 @@
           <w:lang w:val="en-US"/>
         </w:rPr>
       </w:pPr>
-      <w:bookmarkStart w:id="0" w:name="_GoBack"/>
-      <w:bookmarkEnd w:id="0"/>
+    </w:p>
+    <w:p>
+      <w:pPr>
+        <w:shd w:val="clear" w:color="auto" w:fill="121314"/>
+        <w:spacing w:after="0" w:line="405" w:lineRule="atLeast"/>
+        <w:rPr>
+          <w:rFonts w:ascii="JetBrains Mono" w:eastAsia="Times New Roman" w:hAnsi="JetBrains Mono" w:cs="JetBrains Mono"/>
+          <w:color w:val="BBBEBF"/>
+          <w:sz w:val="23"/>
+          <w:szCs w:val="23"/>
+          <w:lang w:val="en-US" w:eastAsia="pt-BR"/>
+        </w:rPr>
+      </w:pPr>
+      <w:r>
+        <w:rPr>
+          <w:rFonts w:ascii="JetBrains Mono" w:eastAsia="Times New Roman" w:hAnsi="JetBrains Mono" w:cs="JetBrains Mono"/>
+          <w:color w:val="BBBEBF"/>
+          <w:sz w:val="23"/>
+          <w:szCs w:val="23"/>
+          <w:lang w:val="en-US" w:eastAsia="pt-BR"/>
+        </w:rPr>
+        <w:t>   </w:t>
+      </w:r>
+      <w:r>
+        <w:rPr>
+          <w:rFonts w:ascii="JetBrains Mono" w:eastAsia="Times New Roman" w:hAnsi="JetBrains Mono" w:cs="JetBrains Mono"/>
+          <w:color w:val="8B949E"/>
+          <w:sz w:val="23"/>
+          <w:szCs w:val="23"/>
+          <w:lang w:val="en-US" w:eastAsia="pt-BR"/>
+        </w:rPr>
+        <w:t xml:space="preserve"># </w:t>
+      </w:r>
+      <w:proofErr w:type="gramStart"/>
+      <w:r>
+        <w:rPr>
+          <w:rFonts w:ascii="JetBrains Mono" w:eastAsia="Times New Roman" w:hAnsi="JetBrains Mono" w:cs="JetBrains Mono"/>
+          <w:color w:val="8B949E"/>
+          <w:sz w:val="23"/>
+          <w:szCs w:val="23"/>
+          <w:lang w:val="en-US" w:eastAsia="pt-BR"/>
+        </w:rPr>
+        <w:t>This</w:t>
+      </w:r>
+      <w:proofErr w:type="gramEnd"/>
+      <w:r>
+        <w:rPr>
+          <w:rFonts w:ascii="JetBrains Mono" w:eastAsia="Times New Roman" w:hAnsi="JetBrains Mono" w:cs="JetBrains Mono"/>
+          <w:color w:val="8B949E"/>
+          <w:sz w:val="23"/>
+          <w:szCs w:val="23"/>
+          <w:lang w:val="en-US" w:eastAsia="pt-BR"/>
+        </w:rPr>
+        <w:t xml:space="preserve"> rounds the average risk score to 2 decimal places.</w:t>
+      </w:r>
+    </w:p>
+    <w:p>
+      <w:pPr>
+        <w:shd w:val="clear" w:color="auto" w:fill="121314"/>
+        <w:spacing w:after="0" w:line="405" w:lineRule="atLeast"/>
+        <w:rPr>
+          <w:rFonts w:ascii="JetBrains Mono" w:eastAsia="Times New Roman" w:hAnsi="JetBrains Mono" w:cs="JetBrains Mono"/>
+          <w:color w:val="BBBEBF"/>
+          <w:sz w:val="23"/>
+          <w:szCs w:val="23"/>
+          <w:lang w:val="en-US" w:eastAsia="pt-BR"/>
+        </w:rPr>
+      </w:pPr>
+      <w:r>
+        <w:rPr>
+          <w:rFonts w:ascii="JetBrains Mono" w:eastAsia="Times New Roman" w:hAnsi="JetBrains Mono" w:cs="JetBrains Mono"/>
+          <w:color w:val="BBBEBF"/>
+          <w:sz w:val="23"/>
+          <w:szCs w:val="23"/>
+          <w:lang w:val="en-US" w:eastAsia="pt-BR"/>
+        </w:rPr>
+        <w:t xml:space="preserve">    </w:t>
+      </w:r>
+      <w:r>
+        <w:rPr>
+          <w:rFonts w:ascii="JetBrains Mono" w:eastAsia="Times New Roman" w:hAnsi="JetBrains Mono" w:cs="JetBrains Mono"/>
+          <w:color w:val="8B949E"/>
+          <w:sz w:val="23"/>
+          <w:szCs w:val="23"/>
+          <w:lang w:val="en-US" w:eastAsia="pt-BR"/>
+        </w:rPr>
+        <w:t># Example: 18.333333 becomes 18.33</w:t>
+      </w:r>
+    </w:p>
+    <w:p>
+      <w:pPr>
+        <w:shd w:val="clear" w:color="auto" w:fill="121314"/>
+        <w:spacing w:after="0" w:line="405" w:lineRule="atLeast"/>
+        <w:rPr>
+          <w:rFonts w:ascii="JetBrains Mono" w:eastAsia="Times New Roman" w:hAnsi="JetBrains Mono" w:cs="JetBrains Mono"/>
+          <w:color w:val="BBBEBF"/>
+          <w:sz w:val="23"/>
+          <w:szCs w:val="23"/>
+          <w:lang w:val="en-US" w:eastAsia="pt-BR"/>
+        </w:rPr>
+      </w:pPr>
+      <w:r>
+        <w:rPr>
+          <w:rFonts w:ascii="JetBrains Mono" w:eastAsia="Times New Roman" w:hAnsi="JetBrains Mono" w:cs="JetBrains Mono"/>
+          <w:color w:val="BBBEBF"/>
+          <w:sz w:val="23"/>
+          <w:szCs w:val="23"/>
+          <w:lang w:val="en-US" w:eastAsia="pt-BR"/>
+        </w:rPr>
+        <w:t xml:space="preserve">    </w:t>
+      </w:r>
+      <w:proofErr w:type="spellStart"/>
+      <w:r>
+        <w:rPr>
+          <w:rFonts w:ascii="JetBrains Mono" w:eastAsia="Times New Roman" w:hAnsi="JetBrains Mono" w:cs="JetBrains Mono"/>
+          <w:color w:val="BBBEBF"/>
+          <w:sz w:val="23"/>
+          <w:szCs w:val="23"/>
+          <w:lang w:val="en-US" w:eastAsia="pt-BR"/>
+        </w:rPr>
+        <w:t>average_risk_score</w:t>
+      </w:r>
+      <w:proofErr w:type="spellEnd"/>
+      <w:r>
+        <w:rPr>
+          <w:rFonts w:ascii="JetBrains Mono" w:eastAsia="Times New Roman" w:hAnsi="JetBrains Mono" w:cs="JetBrains Mono"/>
+          <w:color w:val="BBBEBF"/>
+          <w:sz w:val="23"/>
+          <w:szCs w:val="23"/>
+          <w:lang w:val="en-US" w:eastAsia="pt-BR"/>
+        </w:rPr>
+        <w:t xml:space="preserve"> </w:t>
+      </w:r>
+      <w:r>
+        <w:rPr>
+          <w:rFonts w:ascii="JetBrains Mono" w:eastAsia="Times New Roman" w:hAnsi="JetBrains Mono" w:cs="JetBrains Mono"/>
+          <w:color w:val="D4D4D4"/>
+          <w:sz w:val="23"/>
+          <w:szCs w:val="23"/>
+          <w:lang w:val="en-US" w:eastAsia="pt-BR"/>
+        </w:rPr>
+        <w:t>=</w:t>
+      </w:r>
+      <w:r>
+        <w:rPr>
+          <w:rFonts w:ascii="JetBrains Mono" w:eastAsia="Times New Roman" w:hAnsi="JetBrains Mono" w:cs="JetBrains Mono"/>
+          <w:color w:val="BBBEBF"/>
+          <w:sz w:val="23"/>
+          <w:szCs w:val="23"/>
+          <w:lang w:val="en-US" w:eastAsia="pt-BR"/>
+        </w:rPr>
+        <w:t xml:space="preserve"> </w:t>
+      </w:r>
+      <w:proofErr w:type="gramStart"/>
+      <w:r>
+        <w:rPr>
+          <w:rFonts w:ascii="JetBrains Mono" w:eastAsia="Times New Roman" w:hAnsi="JetBrains Mono" w:cs="JetBrains Mono"/>
+          <w:color w:val="DCDCAA"/>
+          <w:sz w:val="23"/>
+          <w:szCs w:val="23"/>
+          <w:lang w:val="en-US" w:eastAsia="pt-BR"/>
+        </w:rPr>
+        <w:t>round</w:t>
+      </w:r>
+      <w:r>
+        <w:rPr>
+          <w:rFonts w:ascii="JetBrains Mono" w:eastAsia="Times New Roman" w:hAnsi="JetBrains Mono" w:cs="JetBrains Mono"/>
+          <w:color w:val="BBBEBF"/>
+          <w:sz w:val="23"/>
+          <w:szCs w:val="23"/>
+          <w:lang w:val="en-US" w:eastAsia="pt-BR"/>
+        </w:rPr>
+        <w:t>(</w:t>
+      </w:r>
+      <w:proofErr w:type="spellStart"/>
+      <w:proofErr w:type="gramEnd"/>
+      <w:r>
+        <w:rPr>
+          <w:rFonts w:ascii="JetBrains Mono" w:eastAsia="Times New Roman" w:hAnsi="JetBrains Mono" w:cs="JetBrains Mono"/>
+          <w:color w:val="BBBEBF"/>
+          <w:sz w:val="23"/>
+          <w:szCs w:val="23"/>
+          <w:lang w:val="en-US" w:eastAsia="pt-BR"/>
+        </w:rPr>
+        <w:t>average_risk_score</w:t>
+      </w:r>
+      <w:proofErr w:type="spellEnd"/>
+      <w:r>
+        <w:rPr>
+          <w:rFonts w:ascii="JetBrains Mono" w:eastAsia="Times New Roman" w:hAnsi="JetBrains Mono" w:cs="JetBrains Mono"/>
+          <w:color w:val="BBBEBF"/>
+          <w:sz w:val="23"/>
+          <w:szCs w:val="23"/>
+          <w:lang w:val="en-US" w:eastAsia="pt-BR"/>
+        </w:rPr>
+        <w:t xml:space="preserve">, </w:t>
+      </w:r>
+      <w:r>
+        <w:rPr>
+          <w:rFonts w:ascii="JetBrains Mono" w:eastAsia="Times New Roman" w:hAnsi="JetBrains Mono" w:cs="JetBrains Mono"/>
+          <w:color w:val="B5CEA8"/>
+          <w:sz w:val="23"/>
+          <w:szCs w:val="23"/>
+          <w:lang w:val="en-US" w:eastAsia="pt-BR"/>
+        </w:rPr>
+        <w:t>2</w:t>
+      </w:r>
+      <w:r>
+        <w:rPr>
+          <w:rFonts w:ascii="JetBrains Mono" w:eastAsia="Times New Roman" w:hAnsi="JetBrains Mono" w:cs="JetBrains Mono"/>
+          <w:color w:val="BBBEBF"/>
+          <w:sz w:val="23"/>
+          <w:szCs w:val="23"/>
+          <w:lang w:val="en-US" w:eastAsia="pt-BR"/>
+        </w:rPr>
+        <w:t>)</w:t>
+      </w:r>
+    </w:p>
+    <w:p>
+      <w:pPr>
+        <w:pBdr>
+          <w:bottom w:val="single" w:sz="12" w:space="1" w:color="auto"/>
+        </w:pBdr>
+        <w:spacing w:line="240" w:lineRule="auto"/>
+        <w:rPr>
+          <w:lang w:val="en-US"/>
+        </w:rPr>
+      </w:pPr>
+    </w:p>
+    <w:p>
+      <w:pPr>
+        <w:spacing w:line="240" w:lineRule="auto"/>
+        <w:rPr>
+          <w:b/>
+          <w:lang w:val="en-US"/>
+        </w:rPr>
+      </w:pPr>
+      <w:r>
+        <w:rPr>
+          <w:b/>
+          <w:lang w:val="en-US"/>
+        </w:rPr>
+        <w:t xml:space="preserve">Dados </w:t>
+      </w:r>
+      <w:proofErr w:type="spellStart"/>
+      <w:r>
+        <w:rPr>
+          <w:b/>
+          <w:lang w:val="en-US"/>
+        </w:rPr>
+        <w:t>estruturados</w:t>
+      </w:r>
+      <w:proofErr w:type="spellEnd"/>
+    </w:p>
+    <w:p>
+      <w:pPr>
+        <w:spacing w:line="240" w:lineRule="auto"/>
+        <w:rPr>
+          <w:u w:val="single"/>
+          <w:lang w:val="en-US"/>
+        </w:rPr>
+      </w:pPr>
+      <w:proofErr w:type="spellStart"/>
+      <w:r>
+        <w:rPr>
+          <w:u w:val="single"/>
+          <w:lang w:val="en-US"/>
+        </w:rPr>
+        <w:t>total_amount</w:t>
+      </w:r>
+      <w:proofErr w:type="spellEnd"/>
+      <w:r>
+        <w:rPr>
+          <w:u w:val="single"/>
+          <w:lang w:val="en-US"/>
+        </w:rPr>
+        <w:t>: 8900.00</w:t>
+      </w:r>
+    </w:p>
+    <w:p>
+      <w:pPr>
+        <w:spacing w:line="240" w:lineRule="auto"/>
+        <w:rPr>
+          <w:u w:val="single"/>
+          <w:lang w:val="en-US"/>
+        </w:rPr>
+      </w:pPr>
+      <w:proofErr w:type="gramStart"/>
+      <w:r>
+        <w:rPr>
+          <w:u w:val="single"/>
+          <w:lang w:val="en-US"/>
+        </w:rPr>
+        <w:t>currency</w:t>
+      </w:r>
+      <w:proofErr w:type="gramEnd"/>
+      <w:r>
+        <w:rPr>
+          <w:u w:val="single"/>
+          <w:lang w:val="en-US"/>
+        </w:rPr>
+        <w:t>: EUR</w:t>
+      </w:r>
+    </w:p>
+    <w:p>
+      <w:pPr>
+        <w:spacing w:line="240" w:lineRule="auto"/>
+        <w:rPr>
+          <w:u w:val="single"/>
+          <w:lang w:val="en-US"/>
+        </w:rPr>
+      </w:pPr>
+    </w:p>
+    <w:p>
+      <w:pPr>
+        <w:spacing w:line="240" w:lineRule="auto"/>
+        <w:rPr>
+          <w:lang w:val="en-US"/>
+        </w:rPr>
+      </w:pPr>
+      <w:r>
+        <w:rPr>
+          <w:lang w:val="en-US"/>
+        </w:rPr>
+        <w:t>SQL</w:t>
+      </w:r>
+      <w:r>
+        <w:rPr>
+          <w:lang w:val="en-US"/>
+        </w:rPr>
+        <w:t xml:space="preserve">, </w:t>
+      </w:r>
+      <w:r>
+        <w:rPr>
+          <w:lang w:val="en-US"/>
+        </w:rPr>
+        <w:t>Pandas</w:t>
+      </w:r>
+      <w:r>
+        <w:rPr>
+          <w:lang w:val="en-US"/>
+        </w:rPr>
+        <w:t xml:space="preserve">, </w:t>
+      </w:r>
+      <w:r>
+        <w:rPr>
+          <w:lang w:val="en-US"/>
+        </w:rPr>
+        <w:t>Dashboard</w:t>
+      </w:r>
+      <w:r>
+        <w:rPr>
+          <w:lang w:val="en-US"/>
+        </w:rPr>
+        <w:t xml:space="preserve"> and </w:t>
+      </w:r>
+      <w:r>
+        <w:rPr>
+          <w:lang w:val="en-US"/>
+        </w:rPr>
+        <w:t>Machine Learning</w:t>
+      </w:r>
+    </w:p>
+    <w:p>
+      <w:pPr>
+        <w:pBdr>
+          <w:bottom w:val="single" w:sz="12" w:space="1" w:color="auto"/>
+        </w:pBdr>
+        <w:spacing w:line="240" w:lineRule="auto"/>
+        <w:rPr>
+          <w:lang w:val="en-US"/>
+        </w:rPr>
+      </w:pPr>
+    </w:p>
+    <w:p>
+      <w:pPr>
+        <w:spacing w:line="240" w:lineRule="auto"/>
+        <w:rPr>
+          <w:b/>
+          <w:sz w:val="30"/>
+          <w:szCs w:val="30"/>
+          <w:lang w:val="en-US"/>
+        </w:rPr>
+      </w:pPr>
+      <w:proofErr w:type="spellStart"/>
+      <w:r>
+        <w:rPr>
+          <w:b/>
+          <w:sz w:val="30"/>
+          <w:szCs w:val="30"/>
+          <w:lang w:val="en-US"/>
+        </w:rPr>
+        <w:t>Estrutura</w:t>
+      </w:r>
+      <w:proofErr w:type="spellEnd"/>
+      <w:r>
+        <w:rPr>
+          <w:b/>
+          <w:sz w:val="30"/>
+          <w:szCs w:val="30"/>
+          <w:lang w:val="en-US"/>
+        </w:rPr>
+        <w:t xml:space="preserve"> do </w:t>
+      </w:r>
+      <w:proofErr w:type="spellStart"/>
+      <w:r>
+        <w:rPr>
+          <w:b/>
+          <w:sz w:val="30"/>
+          <w:szCs w:val="30"/>
+          <w:lang w:val="en-US"/>
+        </w:rPr>
+        <w:t>projeto</w:t>
+      </w:r>
+      <w:proofErr w:type="spellEnd"/>
+    </w:p>
+    <w:p>
+      <w:pPr>
+        <w:spacing w:line="240" w:lineRule="auto"/>
+        <w:rPr>
+          <w:u w:val="single"/>
+          <w:lang w:val="en-US"/>
+        </w:rPr>
+      </w:pPr>
+      <w:r>
+        <w:rPr>
+          <w:u w:val="single"/>
+          <w:lang w:val="en-US"/>
+        </w:rPr>
+        <w:t>Session 1: Python logic, invoice analysis, risk score</w:t>
+      </w:r>
+    </w:p>
+    <w:p>
+      <w:pPr>
+        <w:spacing w:line="240" w:lineRule="auto"/>
+        <w:rPr>
+          <w:u w:val="single"/>
+          <w:lang w:val="en-US"/>
+        </w:rPr>
+      </w:pPr>
+      <w:r>
+        <w:rPr>
+          <w:u w:val="single"/>
+          <w:lang w:val="en-US"/>
+        </w:rPr>
+        <w:t>Session 2: Save/read CSV</w:t>
+      </w:r>
+    </w:p>
+    <w:p>
+      <w:pPr>
+        <w:spacing w:line="240" w:lineRule="auto"/>
+        <w:rPr>
+          <w:u w:val="single"/>
+          <w:lang w:val="en-US"/>
+        </w:rPr>
+      </w:pPr>
+      <w:r>
+        <w:rPr>
+          <w:u w:val="single"/>
+          <w:lang w:val="en-US"/>
+        </w:rPr>
+        <w:t>Session 3: Organize folders and modules</w:t>
+      </w:r>
+    </w:p>
+    <w:p>
+      <w:pPr>
+        <w:spacing w:line="240" w:lineRule="auto"/>
+        <w:rPr>
+          <w:u w:val="single"/>
+          <w:lang w:val="en-US"/>
+        </w:rPr>
+      </w:pPr>
+      <w:r>
+        <w:rPr>
+          <w:u w:val="single"/>
+          <w:lang w:val="en-US"/>
+        </w:rPr>
+        <w:t>Session 4: Flask web app</w:t>
+      </w:r>
+    </w:p>
+    <w:p>
+      <w:pPr>
+        <w:spacing w:line="240" w:lineRule="auto"/>
+        <w:rPr>
+          <w:u w:val="single"/>
+          <w:lang w:val="en-US"/>
+        </w:rPr>
+      </w:pPr>
+      <w:r>
+        <w:rPr>
+          <w:u w:val="single"/>
+          <w:lang w:val="en-US"/>
+        </w:rPr>
+        <w:t>Session 5: SQLite database</w:t>
+      </w:r>
+    </w:p>
+    <w:p>
+      <w:pPr>
+        <w:spacing w:line="240" w:lineRule="auto"/>
+        <w:rPr>
+          <w:u w:val="single"/>
+          <w:lang w:val="en-US"/>
+        </w:rPr>
+      </w:pPr>
+      <w:r>
+        <w:rPr>
+          <w:u w:val="single"/>
+          <w:lang w:val="en-US"/>
+        </w:rPr>
+        <w:t>Session 6: Dashboard</w:t>
+      </w:r>
+    </w:p>
+    <w:p>
+      <w:pPr>
+        <w:spacing w:line="240" w:lineRule="auto"/>
+        <w:rPr>
+          <w:u w:val="single"/>
+          <w:lang w:val="en-US"/>
+        </w:rPr>
+      </w:pPr>
+      <w:r>
+        <w:rPr>
+          <w:u w:val="single"/>
+          <w:lang w:val="en-US"/>
+        </w:rPr>
+        <w:t>Session 7: Upload files</w:t>
+      </w:r>
+    </w:p>
+    <w:p>
+      <w:pPr>
+        <w:spacing w:line="240" w:lineRule="auto"/>
+        <w:rPr>
+          <w:u w:val="single"/>
+          <w:lang w:val="en-US"/>
+        </w:rPr>
+      </w:pPr>
+      <w:r>
+        <w:rPr>
+          <w:u w:val="single"/>
+          <w:lang w:val="en-US"/>
+        </w:rPr>
+        <w:t>Session 8: OCR basic</w:t>
+      </w:r>
+    </w:p>
+    <w:p>
+      <w:pPr>
+        <w:spacing w:line="240" w:lineRule="auto"/>
+        <w:rPr>
+          <w:u w:val="single"/>
+          <w:lang w:val="en-US"/>
+        </w:rPr>
+      </w:pPr>
+      <w:r>
+        <w:rPr>
+          <w:u w:val="single"/>
+          <w:lang w:val="en-US"/>
+        </w:rPr>
+        <w:t>Session 9: ML classifier</w:t>
+      </w:r>
+    </w:p>
+    <w:p>
+      <w:pPr>
+        <w:spacing w:line="240" w:lineRule="auto"/>
+        <w:rPr>
+          <w:u w:val="single"/>
+          <w:lang w:val="en-US"/>
+        </w:rPr>
+      </w:pPr>
+      <w:r>
+        <w:rPr>
+          <w:u w:val="single"/>
+          <w:lang w:val="en-US"/>
+        </w:rPr>
+        <w:t xml:space="preserve">Session 10: README + </w:t>
+      </w:r>
+      <w:proofErr w:type="spellStart"/>
+      <w:r>
+        <w:rPr>
+          <w:u w:val="single"/>
+          <w:lang w:val="en-US"/>
+        </w:rPr>
+        <w:t>GitHub</w:t>
+      </w:r>
+      <w:proofErr w:type="spellEnd"/>
+      <w:r>
+        <w:rPr>
+          <w:u w:val="single"/>
+          <w:lang w:val="en-US"/>
+        </w:rPr>
+        <w:t xml:space="preserve"> portfolio</w:t>
+      </w:r>
+    </w:p>
+    <w:p>
+      <w:pPr>
+        <w:pBdr>
+          <w:bottom w:val="single" w:sz="12" w:space="1" w:color="auto"/>
+        </w:pBdr>
+        <w:spacing w:line="240" w:lineRule="auto"/>
+        <w:rPr>
+          <w:u w:val="single"/>
+          <w:lang w:val="en-US"/>
+        </w:rPr>
+      </w:pPr>
+    </w:p>
+    <w:p>
+      <w:pPr>
+        <w:spacing w:line="240" w:lineRule="auto"/>
+        <w:rPr>
+          <w:u w:val="single"/>
+          <w:lang w:val="en-US"/>
+        </w:rPr>
+      </w:pPr>
+    </w:p>
+    <w:p>
+      <w:pPr>
+        <w:spacing w:line="240" w:lineRule="auto"/>
+        <w:rPr>
+          <w:lang w:val="en-US"/>
+        </w:rPr>
+      </w:pPr>
+      <w:r>
+        <w:rPr>
+          <w:lang w:val="en-US"/>
+        </w:rPr>
+        <w:t>CSV is a table file.</w:t>
+      </w:r>
+    </w:p>
+    <w:p>
+      <w:pPr>
+        <w:spacing w:line="240" w:lineRule="auto"/>
+        <w:rPr>
+          <w:lang w:val="en-US"/>
+        </w:rPr>
+      </w:pPr>
+      <w:r>
+        <w:rPr>
+          <w:lang w:val="en-US"/>
+        </w:rPr>
+        <w:t>Excel can open CSV.</w:t>
+      </w:r>
+    </w:p>
+    <w:p>
+      <w:pPr>
+        <w:spacing w:line="240" w:lineRule="auto"/>
+        <w:rPr>
+          <w:lang w:val="en-US"/>
+        </w:rPr>
+      </w:pPr>
+      <w:r>
+        <w:rPr>
+          <w:lang w:val="en-US"/>
+        </w:rPr>
+        <w:t>Pandas can read CSV.</w:t>
+      </w:r>
+    </w:p>
+    <w:p>
+      <w:pPr>
+        <w:spacing w:line="240" w:lineRule="auto"/>
+        <w:rPr>
+          <w:lang w:val="en-US"/>
+        </w:rPr>
+      </w:pPr>
+      <w:r>
+        <w:rPr>
+          <w:lang w:val="en-US"/>
+        </w:rPr>
+        <w:t>The app saves invoice results in CSV.</w:t>
+      </w:r>
+    </w:p>
+    <w:p>
+      <w:pPr>
+        <w:spacing w:line="240" w:lineRule="auto"/>
+        <w:rPr>
+          <w:lang w:val="en-US"/>
+        </w:rPr>
+      </w:pPr>
+    </w:p>
+    <w:p>
+      <w:pPr>
+        <w:pBdr>
+          <w:top w:val="single" w:sz="2" w:space="0" w:color="auto"/>
+          <w:left w:val="single" w:sz="2" w:space="0" w:color="auto"/>
+          <w:bottom w:val="single" w:sz="2" w:space="0" w:color="auto"/>
+          <w:right w:val="single" w:sz="2" w:space="0" w:color="auto"/>
+        </w:pBdr>
+        <w:shd w:val="clear" w:color="auto" w:fill="181818"/>
+        <w:spacing w:beforeAutospacing="1" w:after="0" w:afterAutospacing="1" w:line="330" w:lineRule="atLeast"/>
+        <w:rPr>
+          <w:rFonts w:ascii="Segoe UI" w:eastAsia="Times New Roman" w:hAnsi="Segoe UI" w:cs="Segoe UI"/>
+          <w:b/>
+          <w:color w:val="FFFFFF"/>
+          <w:lang w:eastAsia="pt-BR"/>
+        </w:rPr>
+      </w:pPr>
+      <w:proofErr w:type="gramStart"/>
+      <w:r>
+        <w:rPr>
+          <w:rFonts w:ascii="Segoe UI" w:eastAsia="Times New Roman" w:hAnsi="Segoe UI" w:cs="Segoe UI"/>
+          <w:b/>
+          <w:bCs/>
+          <w:color w:val="FFFFFF"/>
+          <w:bdr w:val="single" w:sz="2" w:space="0" w:color="auto" w:frame="1"/>
+          <w:lang w:eastAsia="pt-BR"/>
+        </w:rPr>
+        <w:t>Pandas Entra</w:t>
+      </w:r>
+      <w:proofErr w:type="gramEnd"/>
+      <w:r>
+        <w:rPr>
+          <w:rFonts w:ascii="Segoe UI" w:eastAsia="Times New Roman" w:hAnsi="Segoe UI" w:cs="Segoe UI"/>
+          <w:b/>
+          <w:bCs/>
+          <w:color w:val="FFFFFF"/>
+          <w:bdr w:val="single" w:sz="2" w:space="0" w:color="auto" w:frame="1"/>
+          <w:lang w:eastAsia="pt-BR"/>
+        </w:rPr>
+        <w:t xml:space="preserve"> Depois</w:t>
+      </w:r>
+      <w:r>
+        <w:rPr>
+          <w:rFonts w:ascii="Segoe UI" w:eastAsia="Times New Roman" w:hAnsi="Segoe UI" w:cs="Segoe UI"/>
+          <w:b/>
+          <w:color w:val="FFFFFF"/>
+          <w:lang w:eastAsia="pt-BR"/>
+        </w:rPr>
+        <w:br/>
+        <w:t>O Pandas não é obrigatório para criar CSV, porque Python puro já consegue salvar CSV.</w:t>
+      </w:r>
+    </w:p>
+    <w:p>
+      <w:pPr>
+        <w:pBdr>
+          <w:top w:val="single" w:sz="2" w:space="0" w:color="auto"/>
+          <w:left w:val="single" w:sz="2" w:space="0" w:color="auto"/>
+          <w:bottom w:val="single" w:sz="2" w:space="0" w:color="auto"/>
+          <w:right w:val="single" w:sz="2" w:space="0" w:color="auto"/>
+        </w:pBdr>
+        <w:shd w:val="clear" w:color="auto" w:fill="181818"/>
+        <w:spacing w:before="100" w:beforeAutospacing="1" w:after="100" w:afterAutospacing="1" w:line="330" w:lineRule="atLeast"/>
+        <w:rPr>
+          <w:rFonts w:ascii="Segoe UI" w:eastAsia="Times New Roman" w:hAnsi="Segoe UI" w:cs="Segoe UI"/>
+          <w:b/>
+          <w:color w:val="FFFFFF"/>
+          <w:lang w:eastAsia="pt-BR"/>
+        </w:rPr>
+      </w:pPr>
+      <w:r>
+        <w:rPr>
+          <w:rFonts w:ascii="Segoe UI" w:eastAsia="Times New Roman" w:hAnsi="Segoe UI" w:cs="Segoe UI"/>
+          <w:b/>
+          <w:color w:val="FFFFFF"/>
+          <w:lang w:eastAsia="pt-BR"/>
+        </w:rPr>
+        <w:t xml:space="preserve">Mas depois </w:t>
+      </w:r>
+      <w:proofErr w:type="gramStart"/>
+      <w:r>
+        <w:rPr>
+          <w:rFonts w:ascii="Segoe UI" w:eastAsia="Times New Roman" w:hAnsi="Segoe UI" w:cs="Segoe UI"/>
+          <w:b/>
+          <w:color w:val="FFFFFF"/>
+          <w:lang w:eastAsia="pt-BR"/>
+        </w:rPr>
+        <w:t>o Pandas</w:t>
+      </w:r>
+      <w:proofErr w:type="gramEnd"/>
+      <w:r>
+        <w:rPr>
+          <w:rFonts w:ascii="Segoe UI" w:eastAsia="Times New Roman" w:hAnsi="Segoe UI" w:cs="Segoe UI"/>
+          <w:b/>
+          <w:color w:val="FFFFFF"/>
+          <w:lang w:eastAsia="pt-BR"/>
+        </w:rPr>
+        <w:t xml:space="preserve"> vai ler esse CSV para fazer análise:</w:t>
+      </w:r>
+    </w:p>
+    <w:p>
+      <w:pPr>
+        <w:spacing w:line="240" w:lineRule="auto"/>
+        <w:rPr>
+          <w:lang w:val="en-US"/>
+        </w:rPr>
+      </w:pPr>
+      <w:proofErr w:type="gramStart"/>
+      <w:r>
+        <w:rPr>
+          <w:lang w:val="en-US"/>
+        </w:rPr>
+        <w:t>pandas</w:t>
+      </w:r>
+      <w:proofErr w:type="gramEnd"/>
+      <w:r>
+        <w:rPr>
+          <w:lang w:val="en-US"/>
+        </w:rPr>
+        <w:t xml:space="preserve"> reads CSV</w:t>
+      </w:r>
+    </w:p>
+    <w:p>
+      <w:pPr>
+        <w:spacing w:line="240" w:lineRule="auto"/>
+        <w:rPr>
+          <w:lang w:val="en-US"/>
+        </w:rPr>
+      </w:pPr>
+      <w:proofErr w:type="gramStart"/>
+      <w:r>
+        <w:rPr>
+          <w:lang w:val="en-US"/>
+        </w:rPr>
+        <w:t>pandas</w:t>
+      </w:r>
+      <w:proofErr w:type="gramEnd"/>
+      <w:r>
+        <w:rPr>
+          <w:lang w:val="en-US"/>
+        </w:rPr>
+        <w:t xml:space="preserve"> counts statuses</w:t>
+      </w:r>
+    </w:p>
+    <w:p>
+      <w:pPr>
+        <w:spacing w:line="240" w:lineRule="auto"/>
+      </w:pPr>
+      <w:proofErr w:type="gramStart"/>
+      <w:r>
+        <w:t>pandas</w:t>
+      </w:r>
+      <w:proofErr w:type="gramEnd"/>
+      <w:r>
+        <w:t xml:space="preserve"> </w:t>
+      </w:r>
+      <w:proofErr w:type="spellStart"/>
+      <w:r>
+        <w:t>calculates</w:t>
+      </w:r>
+      <w:proofErr w:type="spellEnd"/>
+      <w:r>
+        <w:t xml:space="preserve"> </w:t>
+      </w:r>
+      <w:proofErr w:type="spellStart"/>
+      <w:r>
+        <w:t>totals</w:t>
+      </w:r>
+      <w:proofErr w:type="spellEnd"/>
+    </w:p>
+    <w:p>
+      <w:pPr>
+        <w:spacing w:line="240" w:lineRule="auto"/>
+      </w:pPr>
+      <w:proofErr w:type="gramStart"/>
+      <w:r>
+        <w:t>pandas</w:t>
+      </w:r>
+      <w:proofErr w:type="gramEnd"/>
+      <w:r>
+        <w:t xml:space="preserve"> prepares data for </w:t>
+      </w:r>
+      <w:proofErr w:type="spellStart"/>
+      <w:r>
+        <w:t>charts</w:t>
+      </w:r>
+      <w:proofErr w:type="spellEnd"/>
+    </w:p>
+    <w:p>
+      <w:pPr>
+        <w:spacing w:line="240" w:lineRule="auto"/>
+      </w:pPr>
+    </w:p>
+    <w:p>
+      <w:pPr>
+        <w:spacing w:line="240" w:lineRule="auto"/>
+      </w:pPr>
+      <w:r>
+        <w:t>CSV = onde os dados ficam salvos</w:t>
+      </w:r>
+    </w:p>
+    <w:p>
+      <w:pPr>
+        <w:spacing w:line="240" w:lineRule="auto"/>
+      </w:pPr>
+      <w:r>
+        <w:t>Pandas = ferramenta para analisar esses dados</w:t>
+      </w:r>
+    </w:p>
+    <w:p>
+      <w:pPr>
+        <w:spacing w:line="240" w:lineRule="auto"/>
+      </w:pPr>
+      <w:r>
+        <w:t>O OCR vai ler e passar automático para o arquivo?</w:t>
+      </w:r>
+      <w:r>
+        <w:t xml:space="preserve"> </w:t>
+      </w:r>
+      <w:r>
+        <w:t>Sim</w:t>
+      </w:r>
+    </w:p>
+    <w:p>
+      <w:pPr>
+        <w:spacing w:line="240" w:lineRule="auto"/>
+      </w:pPr>
     </w:p>
     <w:sectPr>
       <w:pgSz w:w="11906" w:h="16838"/>
@@ -5729,6 +8310,119 @@
     </w:lvl>
   </w:abstractNum>
   <w:abstractNum w:abstractNumId="2">
+    <w:nsid w:val="402E6966"/>
+    <w:multiLevelType w:val="multilevel"/>
+    <w:tmpl w:val="76D8CFC6"/>
+    <w:lvl w:ilvl="0">
+      <w:start w:val="1"/>
+      <w:numFmt w:val="decimal"/>
+      <w:lvlText w:val="%1."/>
+      <w:lvlJc w:val="left"/>
+      <w:pPr>
+        <w:tabs>
+          <w:tab w:val="num" w:pos="720"/>
+        </w:tabs>
+        <w:ind w:left="720" w:hanging="360"/>
+      </w:pPr>
+    </w:lvl>
+    <w:lvl w:ilvl="1" w:tentative="1">
+      <w:start w:val="1"/>
+      <w:numFmt w:val="decimal"/>
+      <w:lvlText w:val="%2."/>
+      <w:lvlJc w:val="left"/>
+      <w:pPr>
+        <w:tabs>
+          <w:tab w:val="num" w:pos="1440"/>
+        </w:tabs>
+        <w:ind w:left="1440" w:hanging="360"/>
+      </w:pPr>
+    </w:lvl>
+    <w:lvl w:ilvl="2" w:tentative="1">
+      <w:start w:val="1"/>
+      <w:numFmt w:val="decimal"/>
+      <w:lvlText w:val="%3."/>
+      <w:lvlJc w:val="left"/>
+      <w:pPr>
+        <w:tabs>
+          <w:tab w:val="num" w:pos="2160"/>
+        </w:tabs>
+        <w:ind w:left="2160" w:hanging="360"/>
+      </w:pPr>
+    </w:lvl>
+    <w:lvl w:ilvl="3" w:tentative="1">
+      <w:start w:val="1"/>
+      <w:numFmt w:val="decimal"/>
+      <w:lvlText w:val="%4."/>
+      <w:lvlJc w:val="left"/>
+      <w:pPr>
+        <w:tabs>
+          <w:tab w:val="num" w:pos="2880"/>
+        </w:tabs>
+        <w:ind w:left="2880" w:hanging="360"/>
+      </w:pPr>
+    </w:lvl>
+    <w:lvl w:ilvl="4" w:tentative="1">
+      <w:start w:val="1"/>
+      <w:numFmt w:val="decimal"/>
+      <w:lvlText w:val="%5."/>
+      <w:lvlJc w:val="left"/>
+      <w:pPr>
+        <w:tabs>
+          <w:tab w:val="num" w:pos="3600"/>
+        </w:tabs>
+        <w:ind w:left="3600" w:hanging="360"/>
+      </w:pPr>
+    </w:lvl>
+    <w:lvl w:ilvl="5" w:tentative="1">
+      <w:start w:val="1"/>
+      <w:numFmt w:val="decimal"/>
+      <w:lvlText w:val="%6."/>
+      <w:lvlJc w:val="left"/>
+      <w:pPr>
+        <w:tabs>
+          <w:tab w:val="num" w:pos="4320"/>
+        </w:tabs>
+        <w:ind w:left="4320" w:hanging="360"/>
+      </w:pPr>
+    </w:lvl>
+    <w:lvl w:ilvl="6" w:tentative="1">
+      <w:start w:val="1"/>
+      <w:numFmt w:val="decimal"/>
+      <w:lvlText w:val="%7."/>
+      <w:lvlJc w:val="left"/>
+      <w:pPr>
+        <w:tabs>
+          <w:tab w:val="num" w:pos="5040"/>
+        </w:tabs>
+        <w:ind w:left="5040" w:hanging="360"/>
+      </w:pPr>
+    </w:lvl>
+    <w:lvl w:ilvl="7" w:tentative="1">
+      <w:start w:val="1"/>
+      <w:numFmt w:val="decimal"/>
+      <w:lvlText w:val="%8."/>
+      <w:lvlJc w:val="left"/>
+      <w:pPr>
+        <w:tabs>
+          <w:tab w:val="num" w:pos="5760"/>
+        </w:tabs>
+        <w:ind w:left="5760" w:hanging="360"/>
+      </w:pPr>
+    </w:lvl>
+    <w:lvl w:ilvl="8" w:tentative="1">
+      <w:start w:val="1"/>
+      <w:numFmt w:val="decimal"/>
+      <w:lvlText w:val="%9."/>
+      <w:lvlJc w:val="left"/>
+      <w:pPr>
+        <w:tabs>
+          <w:tab w:val="num" w:pos="6480"/>
+        </w:tabs>
+        <w:ind w:left="6480" w:hanging="360"/>
+      </w:pPr>
+    </w:lvl>
+  </w:abstractNum>
+  <w:abstractNum w:abstractNumId="3">
     <w:nsid w:val="48150978"/>
     <w:multiLevelType w:val="multilevel"/>
     <w:tmpl w:val="C5363878"/>
@@ -5877,7 +8571,7 @@
       </w:rPr>
     </w:lvl>
   </w:abstractNum>
-  <w:abstractNum w:abstractNumId="3">
+  <w:abstractNum w:abstractNumId="4">
     <w:nsid w:val="70AE1711"/>
     <w:multiLevelType w:val="multilevel"/>
     <w:tmpl w:val="3A2C2B54"/>
@@ -6033,9 +8727,12 @@
     <w:abstractNumId w:val="1"/>
   </w:num>
   <w:num w:numId="3">
+    <w:abstractNumId w:val="4"/>
+  </w:num>
+  <w:num w:numId="4">
     <w:abstractNumId w:val="3"/>
   </w:num>
-  <w:num w:numId="4">
+  <w:num w:numId="5">
     <w:abstractNumId w:val="2"/>
   </w:num>
 </w:numbering>

</xml_diff>

<commit_message>
pip install pandas and add codig invoice_data_analysis
</commit_message>
<xml_diff>
--- a/Info_project/AI + ML + Automation + Data Project.docx
+++ b/Info_project/AI + ML + Automation + Data Project.docx
@@ -1157,8 +1157,6 @@
           <w:lang w:eastAsia="pt-BR"/>
         </w:rPr>
       </w:pPr>
-      <w:bookmarkStart w:id="0" w:name="_GoBack"/>
-      <w:bookmarkEnd w:id="0"/>
     </w:p>
     <w:p>
       <w:pPr>
@@ -7998,6 +7996,311 @@
       <w:pPr>
         <w:spacing w:line="240" w:lineRule="auto"/>
       </w:pPr>
+      <w:r>
+        <w:t>Próximo passo: </w:t>
+      </w:r>
+      <w:r>
+        <w:rPr>
+          <w:b/>
+          <w:bCs/>
+        </w:rPr>
+        <w:t>ler esse CSV com Pandas e gerar análise de dados</w:t>
+      </w:r>
+      <w:r>
+        <w:t>.</w:t>
+      </w:r>
+    </w:p>
+    <w:p>
+      <w:pPr>
+        <w:spacing w:line="240" w:lineRule="auto"/>
+      </w:pPr>
+    </w:p>
+    <w:p>
+      <w:pPr>
+        <w:spacing w:line="240" w:lineRule="auto"/>
+      </w:pPr>
+      <w:r>
+        <w:t xml:space="preserve">Automation -&gt; </w:t>
+      </w:r>
+      <w:proofErr w:type="spellStart"/>
+      <w:r>
+        <w:t>saves</w:t>
+      </w:r>
+      <w:proofErr w:type="spellEnd"/>
+      <w:r>
+        <w:t xml:space="preserve"> CSV</w:t>
+      </w:r>
+    </w:p>
+    <w:p>
+      <w:pPr>
+        <w:pBdr>
+          <w:bottom w:val="single" w:sz="12" w:space="1" w:color="auto"/>
+        </w:pBdr>
+        <w:spacing w:line="240" w:lineRule="auto"/>
+        <w:rPr>
+          <w:lang w:val="en-US"/>
+        </w:rPr>
+      </w:pPr>
+      <w:r>
+        <w:rPr>
+          <w:lang w:val="en-US"/>
+        </w:rPr>
+        <w:t>Data Analysis -&gt; reads CSV and creates insights</w:t>
+      </w:r>
+    </w:p>
+    <w:p>
+      <w:pPr>
+        <w:spacing w:line="240" w:lineRule="auto"/>
+        <w:rPr>
+          <w:lang w:val="en-US"/>
+        </w:rPr>
+      </w:pPr>
+    </w:p>
+    <w:p>
+      <w:pPr>
+        <w:spacing w:line="240" w:lineRule="auto"/>
+        <w:rPr>
+          <w:lang w:val="en-US"/>
+        </w:rPr>
+      </w:pPr>
+      <w:r>
+        <w:rPr>
+          <w:lang w:val="en-US"/>
+        </w:rPr>
+        <w:t>invoice_data_analysis.py</w:t>
+      </w:r>
+    </w:p>
+    <w:p>
+      <w:pPr>
+        <w:spacing w:line="240" w:lineRule="auto"/>
+        <w:rPr>
+          <w:lang w:val="en-US"/>
+        </w:rPr>
+      </w:pPr>
+      <w:proofErr w:type="gramStart"/>
+      <w:r>
+        <w:rPr>
+          <w:lang w:val="en-US"/>
+        </w:rPr>
+        <w:t>read</w:t>
+      </w:r>
+      <w:proofErr w:type="gramEnd"/>
+      <w:r>
+        <w:rPr>
+          <w:lang w:val="en-US"/>
+        </w:rPr>
+        <w:t xml:space="preserve"> invoice_results.csv</w:t>
+      </w:r>
+    </w:p>
+    <w:p>
+      <w:pPr>
+        <w:spacing w:line="240" w:lineRule="auto"/>
+        <w:rPr>
+          <w:lang w:val="en-US"/>
+        </w:rPr>
+      </w:pPr>
+      <w:proofErr w:type="gramStart"/>
+      <w:r>
+        <w:rPr>
+          <w:lang w:val="en-US"/>
+        </w:rPr>
+        <w:t>show</w:t>
+      </w:r>
+      <w:proofErr w:type="gramEnd"/>
+      <w:r>
+        <w:rPr>
+          <w:lang w:val="en-US"/>
+        </w:rPr>
+        <w:t xml:space="preserve"> the table</w:t>
+      </w:r>
+    </w:p>
+    <w:p>
+      <w:pPr>
+        <w:spacing w:line="240" w:lineRule="auto"/>
+        <w:rPr>
+          <w:lang w:val="en-US"/>
+        </w:rPr>
+      </w:pPr>
+      <w:proofErr w:type="gramStart"/>
+      <w:r>
+        <w:rPr>
+          <w:lang w:val="en-US"/>
+        </w:rPr>
+        <w:t>count</w:t>
+      </w:r>
+      <w:proofErr w:type="gramEnd"/>
+      <w:r>
+        <w:rPr>
+          <w:lang w:val="en-US"/>
+        </w:rPr>
+        <w:t xml:space="preserve"> statuses</w:t>
+      </w:r>
+    </w:p>
+    <w:p>
+      <w:pPr>
+        <w:spacing w:line="240" w:lineRule="auto"/>
+        <w:rPr>
+          <w:lang w:val="en-US"/>
+        </w:rPr>
+      </w:pPr>
+      <w:proofErr w:type="gramStart"/>
+      <w:r>
+        <w:rPr>
+          <w:lang w:val="en-US"/>
+        </w:rPr>
+        <w:t>calculate</w:t>
+      </w:r>
+      <w:proofErr w:type="gramEnd"/>
+      <w:r>
+        <w:rPr>
+          <w:lang w:val="en-US"/>
+        </w:rPr>
+        <w:t xml:space="preserve"> total amount</w:t>
+      </w:r>
+    </w:p>
+    <w:p>
+      <w:pPr>
+        <w:spacing w:line="240" w:lineRule="auto"/>
+        <w:rPr>
+          <w:lang w:val="en-US"/>
+        </w:rPr>
+      </w:pPr>
+      <w:proofErr w:type="gramStart"/>
+      <w:r>
+        <w:rPr>
+          <w:lang w:val="en-US"/>
+        </w:rPr>
+        <w:t>calculate</w:t>
+      </w:r>
+      <w:proofErr w:type="gramEnd"/>
+      <w:r>
+        <w:rPr>
+          <w:lang w:val="en-US"/>
+        </w:rPr>
+        <w:t xml:space="preserve"> average risk</w:t>
+      </w:r>
+    </w:p>
+    <w:p>
+      <w:pPr>
+        <w:spacing w:line="240" w:lineRule="auto"/>
+        <w:rPr>
+          <w:lang w:val="en-US"/>
+        </w:rPr>
+      </w:pPr>
+    </w:p>
+    <w:p>
+      <w:pPr>
+        <w:spacing w:line="240" w:lineRule="auto"/>
+        <w:rPr>
+          <w:b/>
+          <w:lang w:val="en-US"/>
+        </w:rPr>
+      </w:pPr>
+      <w:proofErr w:type="gramStart"/>
+      <w:r>
+        <w:rPr>
+          <w:b/>
+          <w:lang w:val="en-US"/>
+        </w:rPr>
+        <w:t>Pandas reads</w:t>
+      </w:r>
+      <w:proofErr w:type="gramEnd"/>
+      <w:r>
+        <w:rPr>
+          <w:b/>
+          <w:lang w:val="en-US"/>
+        </w:rPr>
+        <w:t xml:space="preserve"> the CSV.</w:t>
+      </w:r>
+    </w:p>
+    <w:p>
+      <w:pPr>
+        <w:spacing w:line="240" w:lineRule="auto"/>
+        <w:rPr>
+          <w:b/>
+          <w:lang w:val="en-US"/>
+        </w:rPr>
+      </w:pPr>
+      <w:proofErr w:type="gramStart"/>
+      <w:r>
+        <w:rPr>
+          <w:b/>
+          <w:lang w:val="en-US"/>
+        </w:rPr>
+        <w:t>Pandas shows</w:t>
+      </w:r>
+      <w:proofErr w:type="gramEnd"/>
+      <w:r>
+        <w:rPr>
+          <w:b/>
+          <w:lang w:val="en-US"/>
+        </w:rPr>
+        <w:t xml:space="preserve"> the data.</w:t>
+      </w:r>
+    </w:p>
+    <w:p>
+      <w:pPr>
+        <w:spacing w:line="240" w:lineRule="auto"/>
+        <w:rPr>
+          <w:b/>
+          <w:lang w:val="en-US"/>
+        </w:rPr>
+      </w:pPr>
+      <w:proofErr w:type="gramStart"/>
+      <w:r>
+        <w:rPr>
+          <w:b/>
+          <w:lang w:val="en-US"/>
+        </w:rPr>
+        <w:t>Pandas calculates</w:t>
+      </w:r>
+      <w:proofErr w:type="gramEnd"/>
+      <w:r>
+        <w:rPr>
+          <w:b/>
+          <w:lang w:val="en-US"/>
+        </w:rPr>
+        <w:t xml:space="preserve"> business numbers.</w:t>
+      </w:r>
+    </w:p>
+    <w:p>
+      <w:pPr>
+        <w:spacing w:line="240" w:lineRule="auto"/>
+        <w:rPr>
+          <w:b/>
+          <w:color w:val="FF0000"/>
+          <w:lang w:val="en-US"/>
+        </w:rPr>
+      </w:pPr>
+      <w:proofErr w:type="gramStart"/>
+      <w:r>
+        <w:rPr>
+          <w:b/>
+          <w:color w:val="FF0000"/>
+          <w:lang w:val="en-US"/>
+        </w:rPr>
+        <w:lastRenderedPageBreak/>
+        <w:t>pip</w:t>
+      </w:r>
+      <w:proofErr w:type="gramEnd"/>
+      <w:r>
+        <w:rPr>
+          <w:b/>
+          <w:color w:val="FF0000"/>
+          <w:lang w:val="en-US"/>
+        </w:rPr>
+        <w:t xml:space="preserve"> install pandas</w:t>
+      </w:r>
+    </w:p>
+    <w:p>
+      <w:pPr>
+        <w:spacing w:line="240" w:lineRule="auto"/>
+        <w:rPr>
+          <w:lang w:val="en-US"/>
+        </w:rPr>
+      </w:pPr>
+      <w:bookmarkStart w:id="0" w:name="_GoBack"/>
+      <w:bookmarkEnd w:id="0"/>
     </w:p>
     <w:sectPr>
       <w:pgSz w:w="11906" w:h="16838"/>

</xml_diff>

<commit_message>
add Summary CSV created: invoice_summary.csv
</commit_message>
<xml_diff>
--- a/Info_project/AI + ML + Automation + Data Project.docx
+++ b/Info_project/AI + ML + Automation + Data Project.docx
@@ -8060,26 +8060,59 @@
       <w:pPr>
         <w:spacing w:line="240" w:lineRule="auto"/>
         <w:rPr>
-          <w:lang w:val="en-US"/>
-        </w:rPr>
-      </w:pPr>
-      <w:r>
-        <w:rPr>
-          <w:lang w:val="en-US"/>
-        </w:rPr>
-        <w:t>invoice_data_analysis.py</w:t>
-      </w:r>
-    </w:p>
-    <w:p>
-      <w:pPr>
-        <w:spacing w:line="240" w:lineRule="auto"/>
-        <w:rPr>
-          <w:lang w:val="en-US"/>
+          <w:b/>
+          <w:sz w:val="24"/>
+          <w:szCs w:val="24"/>
         </w:rPr>
       </w:pPr>
       <w:proofErr w:type="gramStart"/>
       <w:r>
         <w:rPr>
+          <w:b/>
+          <w:sz w:val="24"/>
+          <w:szCs w:val="24"/>
+        </w:rPr>
+        <w:t>invoice_data_analysis</w:t>
+      </w:r>
+      <w:proofErr w:type="gramEnd"/>
+      <w:r>
+        <w:rPr>
+          <w:b/>
+          <w:sz w:val="24"/>
+          <w:szCs w:val="24"/>
+        </w:rPr>
+        <w:t>.py</w:t>
+      </w:r>
+      <w:r>
+        <w:rPr>
+          <w:b/>
+          <w:sz w:val="24"/>
+          <w:szCs w:val="24"/>
+        </w:rPr>
+        <w:t xml:space="preserve"> =&gt; </w:t>
+      </w:r>
+      <w:r>
+        <w:rPr>
+          <w:rFonts w:ascii="Segoe UI" w:hAnsi="Segoe UI" w:cs="Segoe UI"/>
+          <w:b/>
+          <w:color w:val="FFFFFF"/>
+          <w:sz w:val="24"/>
+          <w:szCs w:val="24"/>
+          <w:shd w:val="clear" w:color="auto" w:fill="181818"/>
+        </w:rPr>
+        <w:t>vamos salvar as métricas em CSV.</w:t>
+      </w:r>
+    </w:p>
+    <w:p>
+      <w:pPr>
+        <w:spacing w:line="240" w:lineRule="auto"/>
+        <w:rPr>
+          <w:lang w:val="en-US"/>
+        </w:rPr>
+      </w:pPr>
+      <w:proofErr w:type="gramStart"/>
+      <w:r>
+        <w:rPr>
           <w:lang w:val="en-US"/>
         </w:rPr>
         <w:t>read</w:t>
@@ -8269,42 +8302,1270 @@
         <w:rPr>
           <w:b/>
           <w:color w:val="FF0000"/>
-          <w:lang w:val="en-US"/>
-        </w:rPr>
-      </w:pPr>
+        </w:rPr>
+      </w:pPr>
+      <w:proofErr w:type="spellStart"/>
       <w:proofErr w:type="gramStart"/>
       <w:r>
         <w:rPr>
           <w:b/>
           <w:color w:val="FF0000"/>
-          <w:lang w:val="en-US"/>
         </w:rPr>
         <w:lastRenderedPageBreak/>
         <w:t>pip</w:t>
       </w:r>
+      <w:proofErr w:type="spellEnd"/>
       <w:proofErr w:type="gramEnd"/>
       <w:r>
         <w:rPr>
           <w:b/>
           <w:color w:val="FF0000"/>
-          <w:lang w:val="en-US"/>
-        </w:rPr>
-        <w:t xml:space="preserve"> install pandas</w:t>
-      </w:r>
-    </w:p>
-    <w:p>
-      <w:pPr>
-        <w:spacing w:line="240" w:lineRule="auto"/>
-        <w:rPr>
-          <w:lang w:val="en-US"/>
-        </w:rPr>
+        </w:rPr>
+        <w:t xml:space="preserve"> </w:t>
+      </w:r>
+      <w:proofErr w:type="spellStart"/>
+      <w:r>
+        <w:rPr>
+          <w:b/>
+          <w:color w:val="FF0000"/>
+        </w:rPr>
+        <w:t>install</w:t>
+      </w:r>
+      <w:proofErr w:type="spellEnd"/>
+      <w:r>
+        <w:rPr>
+          <w:b/>
+          <w:color w:val="FF0000"/>
+        </w:rPr>
+        <w:t xml:space="preserve"> pandas</w:t>
+      </w:r>
+    </w:p>
+    <w:p>
+      <w:pPr>
+        <w:spacing w:line="240" w:lineRule="auto"/>
+        <w:rPr>
+          <w:lang w:val="en-US"/>
+        </w:rPr>
+      </w:pPr>
+      <w:proofErr w:type="spellStart"/>
+      <w:r>
+        <w:rPr>
+          <w:lang w:val="en-US"/>
+        </w:rPr>
+        <w:t>Nosso</w:t>
+      </w:r>
+      <w:proofErr w:type="spellEnd"/>
+      <w:r>
+        <w:rPr>
+          <w:lang w:val="en-US"/>
+        </w:rPr>
+        <w:t xml:space="preserve"> pipeline agora:</w:t>
+      </w:r>
+      <w:r>
+        <w:rPr>
+          <w:lang w:val="en-US"/>
+        </w:rPr>
+        <w:t xml:space="preserve"> </w:t>
+      </w:r>
+      <w:r>
+        <w:rPr>
+          <w:lang w:val="en-US"/>
+        </w:rPr>
+        <w:t>invoice text -&gt; Python automation -&gt; CSV -&gt; Pandas analysis</w:t>
+      </w:r>
+    </w:p>
+    <w:p>
+      <w:pPr>
+        <w:spacing w:line="240" w:lineRule="auto"/>
+        <w:rPr>
+          <w:lang w:val="en-US"/>
+        </w:rPr>
+      </w:pPr>
+    </w:p>
+    <w:p>
+      <w:pPr>
+        <w:spacing w:line="240" w:lineRule="auto"/>
+      </w:pPr>
+      <w:proofErr w:type="gramStart"/>
+      <w:r>
+        <w:t>invoice_analyzer</w:t>
+      </w:r>
+      <w:proofErr w:type="gramEnd"/>
+      <w:r>
+        <w:t>.py</w:t>
+      </w:r>
+    </w:p>
+    <w:p>
+      <w:pPr>
+        <w:spacing w:line="240" w:lineRule="auto"/>
+      </w:pPr>
+      <w:r>
+        <w:t>↓</w:t>
+      </w:r>
+    </w:p>
+    <w:p>
+      <w:pPr>
+        <w:spacing w:line="240" w:lineRule="auto"/>
+      </w:pPr>
+      <w:proofErr w:type="gramStart"/>
+      <w:r>
+        <w:t>processa</w:t>
+      </w:r>
+      <w:proofErr w:type="gramEnd"/>
+      <w:r>
+        <w:t xml:space="preserve"> as </w:t>
+      </w:r>
+      <w:proofErr w:type="spellStart"/>
+      <w:r>
+        <w:t>invoices</w:t>
+      </w:r>
+      <w:proofErr w:type="spellEnd"/>
+    </w:p>
+    <w:p>
+      <w:pPr>
+        <w:spacing w:line="240" w:lineRule="auto"/>
+      </w:pPr>
+      <w:r>
+        <w:t>↓</w:t>
+      </w:r>
+    </w:p>
+    <w:p>
+      <w:pPr>
+        <w:spacing w:line="240" w:lineRule="auto"/>
+      </w:pPr>
+      <w:proofErr w:type="gramStart"/>
+      <w:r>
+        <w:t>cria</w:t>
+      </w:r>
+      <w:proofErr w:type="gramEnd"/>
+      <w:r>
+        <w:t xml:space="preserve"> o arquivo invoice_results.csv</w:t>
+      </w:r>
+    </w:p>
+    <w:p>
+      <w:pPr>
+        <w:spacing w:line="240" w:lineRule="auto"/>
+      </w:pPr>
+      <w:r>
+        <w:t>↓</w:t>
+      </w:r>
+    </w:p>
+    <w:p>
+      <w:pPr>
+        <w:spacing w:line="240" w:lineRule="auto"/>
+      </w:pPr>
+      <w:proofErr w:type="gramStart"/>
+      <w:r>
+        <w:t>invoice_data_analysis</w:t>
+      </w:r>
+      <w:proofErr w:type="gramEnd"/>
+      <w:r>
+        <w:t>.py</w:t>
+      </w:r>
+    </w:p>
+    <w:p>
+      <w:pPr>
+        <w:spacing w:line="240" w:lineRule="auto"/>
+      </w:pPr>
+      <w:r>
+        <w:t>↓</w:t>
+      </w:r>
+    </w:p>
+    <w:p>
+      <w:pPr>
+        <w:spacing w:line="240" w:lineRule="auto"/>
+      </w:pPr>
+      <w:r>
+        <w:t>Pandas lê o CSV</w:t>
+      </w:r>
+    </w:p>
+    <w:p>
+      <w:pPr>
+        <w:spacing w:line="240" w:lineRule="auto"/>
+        <w:rPr>
+          <w:lang w:val="en-US"/>
+        </w:rPr>
+      </w:pPr>
+      <w:r>
+        <w:rPr>
+          <w:lang w:val="en-US"/>
+        </w:rPr>
+        <w:t>↓</w:t>
+      </w:r>
+    </w:p>
+    <w:p>
+      <w:pPr>
+        <w:spacing w:line="240" w:lineRule="auto"/>
+        <w:rPr>
+          <w:lang w:val="en-US"/>
+        </w:rPr>
+      </w:pPr>
+      <w:proofErr w:type="gramStart"/>
+      <w:r>
+        <w:rPr>
+          <w:lang w:val="en-US"/>
+        </w:rPr>
+        <w:t>Pandas</w:t>
+      </w:r>
+      <w:proofErr w:type="gramEnd"/>
+      <w:r>
+        <w:rPr>
+          <w:lang w:val="en-US"/>
+        </w:rPr>
+        <w:t xml:space="preserve"> </w:t>
+      </w:r>
+      <w:proofErr w:type="spellStart"/>
+      <w:r>
+        <w:rPr>
+          <w:lang w:val="en-US"/>
+        </w:rPr>
+        <w:t>transforma</w:t>
+      </w:r>
+      <w:proofErr w:type="spellEnd"/>
+      <w:r>
+        <w:rPr>
+          <w:lang w:val="en-US"/>
+        </w:rPr>
+        <w:t xml:space="preserve"> </w:t>
+      </w:r>
+      <w:proofErr w:type="spellStart"/>
+      <w:r>
+        <w:rPr>
+          <w:lang w:val="en-US"/>
+        </w:rPr>
+        <w:t>em</w:t>
+      </w:r>
+      <w:proofErr w:type="spellEnd"/>
+      <w:r>
+        <w:rPr>
+          <w:lang w:val="en-US"/>
+        </w:rPr>
+        <w:t xml:space="preserve"> </w:t>
+      </w:r>
+      <w:proofErr w:type="spellStart"/>
+      <w:r>
+        <w:rPr>
+          <w:lang w:val="en-US"/>
+        </w:rPr>
+        <w:t>DataFrame</w:t>
+      </w:r>
+      <w:proofErr w:type="spellEnd"/>
+    </w:p>
+    <w:p>
+      <w:pPr>
+        <w:spacing w:line="240" w:lineRule="auto"/>
+        <w:rPr>
+          <w:lang w:val="en-US"/>
+        </w:rPr>
+      </w:pPr>
+      <w:r>
+        <w:rPr>
+          <w:lang w:val="en-US"/>
+        </w:rPr>
+        <w:t>↓</w:t>
+      </w:r>
+    </w:p>
+    <w:p>
+      <w:pPr>
+        <w:spacing w:line="240" w:lineRule="auto"/>
+        <w:rPr>
+          <w:lang w:val="en-US"/>
+        </w:rPr>
+      </w:pPr>
+      <w:proofErr w:type="gramStart"/>
+      <w:r>
+        <w:rPr>
+          <w:lang w:val="en-US"/>
+        </w:rPr>
+        <w:t>Pandas</w:t>
+      </w:r>
+      <w:proofErr w:type="gramEnd"/>
+      <w:r>
+        <w:rPr>
+          <w:lang w:val="en-US"/>
+        </w:rPr>
+        <w:t xml:space="preserve"> </w:t>
+      </w:r>
+      <w:proofErr w:type="spellStart"/>
+      <w:r>
+        <w:rPr>
+          <w:lang w:val="en-US"/>
+        </w:rPr>
+        <w:t>calcula</w:t>
+      </w:r>
+      <w:proofErr w:type="spellEnd"/>
+      <w:r>
+        <w:rPr>
+          <w:lang w:val="en-US"/>
+        </w:rPr>
+        <w:t xml:space="preserve"> </w:t>
+      </w:r>
+      <w:proofErr w:type="spellStart"/>
+      <w:r>
+        <w:rPr>
+          <w:lang w:val="en-US"/>
+        </w:rPr>
+        <w:t>métricas</w:t>
+      </w:r>
+      <w:proofErr w:type="spellEnd"/>
+    </w:p>
+    <w:p>
+      <w:pPr>
+        <w:spacing w:line="240" w:lineRule="auto"/>
+        <w:rPr>
+          <w:lang w:val="en-US"/>
+        </w:rPr>
+      </w:pPr>
+    </w:p>
+    <w:p>
+      <w:pPr>
+        <w:pBdr>
+          <w:bottom w:val="single" w:sz="12" w:space="1" w:color="auto"/>
+        </w:pBdr>
+        <w:spacing w:line="240" w:lineRule="auto"/>
+        <w:rPr>
+          <w:b/>
+          <w:color w:val="FF0000"/>
+          <w:lang w:val="en-US"/>
+        </w:rPr>
+      </w:pPr>
+      <w:proofErr w:type="gramStart"/>
+      <w:r>
+        <w:rPr>
+          <w:b/>
+          <w:color w:val="FF0000"/>
+          <w:lang w:val="en-US"/>
+        </w:rPr>
+        <w:t>Pandas reads</w:t>
+      </w:r>
+      <w:proofErr w:type="gramEnd"/>
+      <w:r>
+        <w:rPr>
+          <w:b/>
+          <w:color w:val="FF0000"/>
+          <w:lang w:val="en-US"/>
+        </w:rPr>
+        <w:t xml:space="preserve"> the CSV file.</w:t>
+      </w:r>
+      <w:r>
+        <w:rPr>
+          <w:b/>
+          <w:color w:val="FF0000"/>
+          <w:lang w:val="en-US"/>
+        </w:rPr>
+        <w:t xml:space="preserve"> </w:t>
+      </w:r>
+      <w:proofErr w:type="gramStart"/>
+      <w:r>
+        <w:rPr>
+          <w:b/>
+          <w:color w:val="FF0000"/>
+          <w:lang w:val="en-US"/>
+        </w:rPr>
+        <w:t>Pandas creates</w:t>
+      </w:r>
+      <w:proofErr w:type="gramEnd"/>
+      <w:r>
+        <w:rPr>
+          <w:b/>
+          <w:color w:val="FF0000"/>
+          <w:lang w:val="en-US"/>
+        </w:rPr>
+        <w:t xml:space="preserve"> a </w:t>
+      </w:r>
+      <w:proofErr w:type="spellStart"/>
+      <w:r>
+        <w:rPr>
+          <w:b/>
+          <w:color w:val="FF0000"/>
+          <w:lang w:val="en-US"/>
+        </w:rPr>
+        <w:t>DataFrame</w:t>
+      </w:r>
+      <w:proofErr w:type="spellEnd"/>
+      <w:r>
+        <w:rPr>
+          <w:b/>
+          <w:color w:val="FF0000"/>
+          <w:lang w:val="en-US"/>
+        </w:rPr>
+        <w:t>.</w:t>
+      </w:r>
+      <w:r>
+        <w:rPr>
+          <w:b/>
+          <w:color w:val="FF0000"/>
+          <w:lang w:val="en-US"/>
+        </w:rPr>
+        <w:t xml:space="preserve"> </w:t>
+      </w:r>
+      <w:r>
+        <w:rPr>
+          <w:b/>
+          <w:color w:val="FF0000"/>
+          <w:lang w:val="en-US"/>
+        </w:rPr>
+        <w:t xml:space="preserve">A </w:t>
+      </w:r>
+      <w:proofErr w:type="spellStart"/>
+      <w:r>
+        <w:rPr>
+          <w:b/>
+          <w:color w:val="FF0000"/>
+          <w:lang w:val="en-US"/>
+        </w:rPr>
+        <w:t>DataFrame</w:t>
+      </w:r>
+      <w:proofErr w:type="spellEnd"/>
+      <w:r>
+        <w:rPr>
+          <w:b/>
+          <w:color w:val="FF0000"/>
+          <w:lang w:val="en-US"/>
+        </w:rPr>
+        <w:t xml:space="preserve"> is a table.</w:t>
+      </w:r>
+    </w:p>
+    <w:p>
+      <w:pPr>
+        <w:spacing w:line="240" w:lineRule="auto"/>
+        <w:rPr>
+          <w:rFonts w:ascii="Segoe UI" w:hAnsi="Segoe UI" w:cs="Segoe UI"/>
+          <w:color w:val="FFFFFF"/>
+          <w:sz w:val="21"/>
+          <w:szCs w:val="21"/>
+          <w:shd w:val="clear" w:color="auto" w:fill="181818"/>
+        </w:rPr>
+      </w:pPr>
+      <w:r>
+        <w:rPr>
+          <w:rFonts w:ascii="Segoe UI" w:hAnsi="Segoe UI" w:cs="Segoe UI"/>
+          <w:color w:val="FFFFFF"/>
+          <w:sz w:val="21"/>
+          <w:szCs w:val="21"/>
+          <w:shd w:val="clear" w:color="auto" w:fill="181818"/>
+        </w:rPr>
+        <w:t>E futuramente ficará assim:</w:t>
+      </w:r>
+    </w:p>
+    <w:p>
+      <w:pPr>
+        <w:spacing w:line="240" w:lineRule="auto"/>
+        <w:rPr>
+          <w:lang w:val="en-US"/>
+        </w:rPr>
+      </w:pPr>
+      <w:r>
+        <w:rPr>
+          <w:lang w:val="en-US"/>
+        </w:rPr>
+        <w:t>OCR reads document</w:t>
+      </w:r>
+    </w:p>
+    <w:p>
+      <w:pPr>
+        <w:spacing w:line="240" w:lineRule="auto"/>
+        <w:rPr>
+          <w:lang w:val="en-US"/>
+        </w:rPr>
+      </w:pPr>
+      <w:r>
+        <w:rPr>
+          <w:lang w:val="en-US"/>
+        </w:rPr>
+        <w:t>↓</w:t>
+      </w:r>
+    </w:p>
+    <w:p>
+      <w:pPr>
+        <w:spacing w:line="240" w:lineRule="auto"/>
+        <w:rPr>
+          <w:lang w:val="en-US"/>
+        </w:rPr>
+      </w:pPr>
+      <w:proofErr w:type="gramStart"/>
+      <w:r>
+        <w:rPr>
+          <w:lang w:val="en-US"/>
+        </w:rPr>
+        <w:t>raw</w:t>
+      </w:r>
+      <w:proofErr w:type="gramEnd"/>
+      <w:r>
+        <w:rPr>
+          <w:lang w:val="en-US"/>
+        </w:rPr>
+        <w:t xml:space="preserve"> invoice text</w:t>
+      </w:r>
+    </w:p>
+    <w:p>
+      <w:pPr>
+        <w:spacing w:line="240" w:lineRule="auto"/>
+        <w:rPr>
+          <w:lang w:val="en-US"/>
+        </w:rPr>
+      </w:pPr>
+      <w:r>
+        <w:rPr>
+          <w:lang w:val="en-US"/>
+        </w:rPr>
+        <w:t>↓</w:t>
+      </w:r>
+    </w:p>
+    <w:p>
+      <w:pPr>
+        <w:spacing w:line="240" w:lineRule="auto"/>
+        <w:rPr>
+          <w:lang w:val="en-US"/>
+        </w:rPr>
+      </w:pPr>
+      <w:r>
+        <w:rPr>
+          <w:lang w:val="en-US"/>
+        </w:rPr>
+        <w:t>Python processes data</w:t>
+      </w:r>
+    </w:p>
+    <w:p>
+      <w:pPr>
+        <w:spacing w:line="240" w:lineRule="auto"/>
+        <w:rPr>
+          <w:lang w:val="en-US"/>
+        </w:rPr>
+      </w:pPr>
+      <w:r>
+        <w:rPr>
+          <w:lang w:val="en-US"/>
+        </w:rPr>
+        <w:t>↓</w:t>
+      </w:r>
+    </w:p>
+    <w:p>
+      <w:pPr>
+        <w:spacing w:line="240" w:lineRule="auto"/>
+        <w:rPr>
+          <w:lang w:val="en-US"/>
+        </w:rPr>
+      </w:pPr>
+      <w:r>
+        <w:rPr>
+          <w:lang w:val="en-US"/>
+        </w:rPr>
+        <w:t>CSV or database saves data</w:t>
+      </w:r>
+    </w:p>
+    <w:p>
+      <w:pPr>
+        <w:spacing w:line="240" w:lineRule="auto"/>
+        <w:rPr>
+          <w:lang w:val="en-US"/>
+        </w:rPr>
+      </w:pPr>
+      <w:r>
+        <w:rPr>
+          <w:lang w:val="en-US"/>
+        </w:rPr>
+        <w:t>↓</w:t>
+      </w:r>
+    </w:p>
+    <w:p>
+      <w:pPr>
+        <w:spacing w:line="240" w:lineRule="auto"/>
+        <w:rPr>
+          <w:lang w:val="en-US"/>
+        </w:rPr>
+      </w:pPr>
+      <w:proofErr w:type="gramStart"/>
+      <w:r>
+        <w:rPr>
+          <w:lang w:val="en-US"/>
+        </w:rPr>
+        <w:t>Pandas analyzes</w:t>
+      </w:r>
+      <w:proofErr w:type="gramEnd"/>
+      <w:r>
+        <w:rPr>
+          <w:lang w:val="en-US"/>
+        </w:rPr>
+        <w:t xml:space="preserve"> data</w:t>
+      </w:r>
+    </w:p>
+    <w:p>
+      <w:pPr>
+        <w:spacing w:line="240" w:lineRule="auto"/>
+        <w:rPr>
+          <w:lang w:val="en-US"/>
+        </w:rPr>
+      </w:pPr>
+      <w:r>
+        <w:rPr>
+          <w:lang w:val="en-US"/>
+        </w:rPr>
+        <w:t>↓</w:t>
+      </w:r>
+    </w:p>
+    <w:p>
+      <w:pPr>
+        <w:spacing w:line="240" w:lineRule="auto"/>
+        <w:rPr>
+          <w:lang w:val="en-US"/>
+        </w:rPr>
+      </w:pPr>
+      <w:r>
+        <w:rPr>
+          <w:lang w:val="en-US"/>
+        </w:rPr>
+        <w:t>Flask dashboard shows metrics and charts</w:t>
+      </w:r>
+    </w:p>
+    <w:p>
+      <w:pPr>
+        <w:pBdr>
+          <w:bottom w:val="single" w:sz="12" w:space="1" w:color="auto"/>
+        </w:pBdr>
+        <w:spacing w:line="240" w:lineRule="auto"/>
+        <w:rPr>
+          <w:b/>
+          <w:lang w:val="en-US"/>
+        </w:rPr>
+      </w:pPr>
+    </w:p>
+    <w:p>
+      <w:pPr>
+        <w:spacing w:line="240" w:lineRule="auto"/>
+        <w:rPr>
+          <w:b/>
+          <w:color w:val="FF0000"/>
+          <w:lang w:val="en-US"/>
+        </w:rPr>
+      </w:pPr>
+      <w:proofErr w:type="spellStart"/>
+      <w:r>
+        <w:rPr>
+          <w:b/>
+          <w:color w:val="FF0000"/>
+          <w:lang w:val="en-US"/>
+        </w:rPr>
+        <w:t>Arquivos</w:t>
+      </w:r>
+      <w:proofErr w:type="spellEnd"/>
+      <w:r>
+        <w:rPr>
+          <w:b/>
+          <w:color w:val="FF0000"/>
+          <w:lang w:val="en-US"/>
+        </w:rPr>
+        <w:t xml:space="preserve"> Python</w:t>
+      </w:r>
+    </w:p>
+    <w:p>
+      <w:pPr>
+        <w:spacing w:line="240" w:lineRule="auto"/>
+        <w:rPr>
+          <w:lang w:val="en-US"/>
+        </w:rPr>
+      </w:pPr>
+      <w:r>
+        <w:rPr>
+          <w:lang w:val="en-US"/>
+        </w:rPr>
+        <w:t>invoice_analyzer.py invoice_data_analysis.py</w:t>
+      </w:r>
+    </w:p>
+    <w:p>
+      <w:pPr>
+        <w:spacing w:line="240" w:lineRule="auto"/>
+        <w:rPr>
+          <w:lang w:val="en-US"/>
+        </w:rPr>
+      </w:pPr>
+      <w:r>
+        <w:rPr>
+          <w:lang w:val="en-US"/>
+        </w:rPr>
+        <w:t>Esses são arquivos de código.</w:t>
+      </w:r>
+    </w:p>
+    <w:p>
+      <w:pPr>
+        <w:spacing w:line="240" w:lineRule="auto"/>
+        <w:rPr>
+          <w:lang w:val="en-US"/>
+        </w:rPr>
+      </w:pPr>
+      <w:r>
+        <w:rPr>
+          <w:lang w:val="en-US"/>
+        </w:rPr>
+        <w:lastRenderedPageBreak/>
+        <w:t>Eles fazem ações.</w:t>
+      </w:r>
+    </w:p>
+    <w:p>
+      <w:pPr>
+        <w:spacing w:line="240" w:lineRule="auto"/>
+        <w:rPr>
+          <w:lang w:val="en-US"/>
+        </w:rPr>
+      </w:pPr>
+      <w:r>
+        <w:rPr>
+          <w:lang w:val="en-US"/>
+        </w:rPr>
+        <w:t>Arquivos CSV</w:t>
+      </w:r>
+    </w:p>
+    <w:p>
+      <w:pPr>
+        <w:spacing w:line="240" w:lineRule="auto"/>
+        <w:rPr>
+          <w:lang w:val="en-US"/>
+        </w:rPr>
+      </w:pPr>
+      <w:proofErr w:type="gramStart"/>
+      <w:r>
+        <w:rPr>
+          <w:lang w:val="en-US"/>
+        </w:rPr>
+        <w:t>invoice_results</w:t>
+      </w:r>
+      <w:proofErr w:type="gramEnd"/>
+      <w:r>
+        <w:rPr>
+          <w:lang w:val="en-US"/>
+        </w:rPr>
+        <w:t>.csv invoice_summary.csv</w:t>
+      </w:r>
+    </w:p>
+    <w:p>
+      <w:pPr>
+        <w:spacing w:line="240" w:lineRule="auto"/>
+        <w:rPr>
+          <w:lang w:val="en-US"/>
+        </w:rPr>
+      </w:pPr>
+      <w:r>
+        <w:rPr>
+          <w:lang w:val="en-US"/>
+        </w:rPr>
+        <w:t>Esses são arquivos de dados.</w:t>
+      </w:r>
+    </w:p>
+    <w:p>
+      <w:pPr>
+        <w:spacing w:line="240" w:lineRule="auto"/>
+        <w:rPr>
+          <w:lang w:val="en-US"/>
+        </w:rPr>
+      </w:pPr>
+      <w:r>
+        <w:rPr>
+          <w:lang w:val="en-US"/>
+        </w:rPr>
+        <w:t>Eles guardam informações.</w:t>
+      </w:r>
+    </w:p>
+    <w:p>
+      <w:pPr>
+        <w:spacing w:line="240" w:lineRule="auto"/>
+        <w:rPr>
+          <w:lang w:val="en-US"/>
+        </w:rPr>
+      </w:pPr>
+      <w:r>
+        <w:rPr>
+          <w:lang w:val="en-US"/>
+        </w:rPr>
+        <w:t>Então hoje temos:</w:t>
+      </w:r>
+    </w:p>
+    <w:p>
+      <w:pPr>
+        <w:spacing w:line="240" w:lineRule="auto"/>
+        <w:rPr>
+          <w:lang w:val="en-US"/>
+        </w:rPr>
+      </w:pPr>
+      <w:proofErr w:type="gramStart"/>
+      <w:r>
+        <w:rPr>
+          <w:lang w:val="en-US"/>
+        </w:rPr>
+        <w:t>invoice_analyzer</w:t>
+      </w:r>
+      <w:proofErr w:type="gramEnd"/>
+      <w:r>
+        <w:rPr>
+          <w:lang w:val="en-US"/>
+        </w:rPr>
+        <w:t>.py</w:t>
+      </w:r>
+    </w:p>
+    <w:p>
+      <w:pPr>
+        <w:spacing w:line="240" w:lineRule="auto"/>
+        <w:rPr>
+          <w:lang w:val="en-US"/>
+        </w:rPr>
+      </w:pPr>
+      <w:r>
+        <w:rPr>
+          <w:lang w:val="en-US"/>
+        </w:rPr>
+        <w:t>Função no projeto:</w:t>
+      </w:r>
+    </w:p>
+    <w:p>
+      <w:pPr>
+        <w:spacing w:line="240" w:lineRule="auto"/>
+        <w:rPr>
+          <w:lang w:val="en-US"/>
+        </w:rPr>
+      </w:pPr>
+      <w:proofErr w:type="gramStart"/>
+      <w:r>
+        <w:rPr>
+          <w:lang w:val="en-US"/>
+        </w:rPr>
+        <w:t>processa</w:t>
+      </w:r>
+      <w:proofErr w:type="gramEnd"/>
+      <w:r>
+        <w:rPr>
+          <w:lang w:val="en-US"/>
+        </w:rPr>
+        <w:t xml:space="preserve"> as </w:t>
+      </w:r>
+      <w:proofErr w:type="spellStart"/>
+      <w:r>
+        <w:rPr>
+          <w:lang w:val="en-US"/>
+        </w:rPr>
+        <w:t>invoices</w:t>
+      </w:r>
+      <w:proofErr w:type="spellEnd"/>
+      <w:r>
+        <w:rPr>
+          <w:lang w:val="en-US"/>
+        </w:rPr>
+        <w:t xml:space="preserve"> e cria invoice_results.csv</w:t>
+      </w:r>
+    </w:p>
+    <w:p>
+      <w:pPr>
+        <w:spacing w:line="240" w:lineRule="auto"/>
+        <w:rPr>
+          <w:lang w:val="en-US"/>
+        </w:rPr>
+      </w:pPr>
+      <w:r>
+        <w:rPr>
+          <w:lang w:val="en-US"/>
+        </w:rPr>
+        <w:t>E temos:</w:t>
+      </w:r>
+    </w:p>
+    <w:p>
+      <w:pPr>
+        <w:spacing w:line="240" w:lineRule="auto"/>
+        <w:rPr>
+          <w:lang w:val="en-US"/>
+        </w:rPr>
+      </w:pPr>
+      <w:proofErr w:type="gramStart"/>
+      <w:r>
+        <w:rPr>
+          <w:lang w:val="en-US"/>
+        </w:rPr>
+        <w:t>invoice_data_analysis</w:t>
+      </w:r>
+      <w:proofErr w:type="gramEnd"/>
+      <w:r>
+        <w:rPr>
+          <w:lang w:val="en-US"/>
+        </w:rPr>
+        <w:t>.py</w:t>
+      </w:r>
+    </w:p>
+    <w:p>
+      <w:pPr>
+        <w:spacing w:line="240" w:lineRule="auto"/>
+        <w:rPr>
+          <w:lang w:val="en-US"/>
+        </w:rPr>
+      </w:pPr>
+      <w:r>
+        <w:rPr>
+          <w:lang w:val="en-US"/>
+        </w:rPr>
+        <w:t>Função no projeto:</w:t>
+      </w:r>
+    </w:p>
+    <w:p>
+      <w:pPr>
+        <w:spacing w:line="240" w:lineRule="auto"/>
+        <w:rPr>
+          <w:lang w:val="en-US"/>
+        </w:rPr>
+      </w:pPr>
+      <w:proofErr w:type="gramStart"/>
+      <w:r>
+        <w:rPr>
+          <w:lang w:val="en-US"/>
+        </w:rPr>
+        <w:t>lê</w:t>
+      </w:r>
+      <w:proofErr w:type="gramEnd"/>
+      <w:r>
+        <w:rPr>
+          <w:lang w:val="en-US"/>
+        </w:rPr>
+        <w:t xml:space="preserve"> invoice_results.csv, analisa com Pandas e cria invoice_summary.csv</w:t>
+      </w:r>
+    </w:p>
+    <w:p>
+      <w:pPr>
+        <w:spacing w:line="240" w:lineRule="auto"/>
+        <w:rPr>
+          <w:lang w:val="en-US"/>
+        </w:rPr>
+      </w:pPr>
+      <w:r>
+        <w:rPr>
+          <w:lang w:val="en-US"/>
+        </w:rPr>
+        <w:t>invoice_analyzer.py</w:t>
+      </w:r>
+    </w:p>
+    <w:p>
+      <w:pPr>
+        <w:spacing w:line="240" w:lineRule="auto"/>
+        <w:rPr>
+          <w:lang w:val="en-US"/>
+        </w:rPr>
+      </w:pPr>
+      <w:r>
+        <w:rPr>
+          <w:lang w:val="en-US"/>
+        </w:rPr>
+        <w:t xml:space="preserve">    ↓</w:t>
+      </w:r>
+    </w:p>
+    <w:p>
+      <w:pPr>
+        <w:spacing w:line="240" w:lineRule="auto"/>
+        <w:rPr>
+          <w:lang w:val="en-US"/>
+        </w:rPr>
+      </w:pPr>
+      <w:proofErr w:type="gramStart"/>
+      <w:r>
+        <w:rPr>
+          <w:lang w:val="en-US"/>
+        </w:rPr>
+        <w:t>creates</w:t>
+      </w:r>
+      <w:proofErr w:type="gramEnd"/>
+      <w:r>
+        <w:rPr>
+          <w:lang w:val="en-US"/>
+        </w:rPr>
+        <w:t xml:space="preserve"> invoice_results.csv</w:t>
+      </w:r>
+    </w:p>
+    <w:p>
+      <w:pPr>
+        <w:spacing w:line="240" w:lineRule="auto"/>
+        <w:rPr>
+          <w:lang w:val="en-US"/>
+        </w:rPr>
+      </w:pPr>
+      <w:r>
+        <w:rPr>
+          <w:lang w:val="en-US"/>
+        </w:rPr>
+        <w:t xml:space="preserve">    ↓</w:t>
+      </w:r>
+    </w:p>
+    <w:p>
+      <w:pPr>
+        <w:spacing w:line="240" w:lineRule="auto"/>
+        <w:rPr>
+          <w:lang w:val="en-US"/>
+        </w:rPr>
+      </w:pPr>
+      <w:r>
+        <w:rPr>
+          <w:lang w:val="en-US"/>
+        </w:rPr>
+        <w:t>invoice_data_analysis.py</w:t>
+      </w:r>
+    </w:p>
+    <w:p>
+      <w:pPr>
+        <w:spacing w:line="240" w:lineRule="auto"/>
+        <w:rPr>
+          <w:lang w:val="en-US"/>
+        </w:rPr>
+      </w:pPr>
+      <w:r>
+        <w:rPr>
+          <w:lang w:val="en-US"/>
+        </w:rPr>
+        <w:t xml:space="preserve">    ↓</w:t>
+      </w:r>
+    </w:p>
+    <w:p>
+      <w:pPr>
+        <w:spacing w:line="240" w:lineRule="auto"/>
+        <w:rPr>
+          <w:lang w:val="en-US"/>
+        </w:rPr>
+      </w:pPr>
+      <w:proofErr w:type="gramStart"/>
+      <w:r>
+        <w:rPr>
+          <w:lang w:val="en-US"/>
+        </w:rPr>
+        <w:t>reads</w:t>
+      </w:r>
+      <w:proofErr w:type="gramEnd"/>
+      <w:r>
+        <w:rPr>
+          <w:lang w:val="en-US"/>
+        </w:rPr>
+        <w:t xml:space="preserve"> invoice_results.csv</w:t>
+      </w:r>
+    </w:p>
+    <w:p>
+      <w:pPr>
+        <w:spacing w:line="240" w:lineRule="auto"/>
+        <w:rPr>
+          <w:lang w:val="en-US"/>
+        </w:rPr>
+      </w:pPr>
+      <w:r>
+        <w:rPr>
+          <w:lang w:val="en-US"/>
+        </w:rPr>
+        <w:t xml:space="preserve">    ↓</w:t>
+      </w:r>
+    </w:p>
+    <w:p>
+      <w:pPr>
+        <w:spacing w:line="240" w:lineRule="auto"/>
+        <w:rPr>
+          <w:lang w:val="en-US"/>
+        </w:rPr>
+      </w:pPr>
+      <w:proofErr w:type="spellStart"/>
+      <w:proofErr w:type="gramStart"/>
+      <w:r>
+        <w:rPr>
+          <w:lang w:val="en-US"/>
+        </w:rPr>
+        <w:t>creates</w:t>
+      </w:r>
+      <w:proofErr w:type="spellEnd"/>
+      <w:proofErr w:type="gramEnd"/>
+      <w:r>
+        <w:rPr>
+          <w:lang w:val="en-US"/>
+        </w:rPr>
+        <w:t xml:space="preserve"> invoice_summary.csv</w:t>
+      </w:r>
+    </w:p>
+    <w:p>
+      <w:pPr>
+        <w:spacing w:line="240" w:lineRule="auto"/>
+      </w:pPr>
+      <w:r>
+        <w:t xml:space="preserve">E em termos de dados, temos: </w:t>
+      </w:r>
+      <w:proofErr w:type="gramStart"/>
+      <w:r>
+        <w:t>1</w:t>
+      </w:r>
+      <w:proofErr w:type="gramEnd"/>
+      <w:r>
+        <w:t xml:space="preserve">. </w:t>
+      </w:r>
+      <w:proofErr w:type="gramStart"/>
+      <w:r>
+        <w:t>invoice_results</w:t>
+      </w:r>
+      <w:proofErr w:type="gramEnd"/>
+      <w:r>
+        <w:t xml:space="preserve">.csv 2. </w:t>
+      </w:r>
+      <w:proofErr w:type="gramStart"/>
+      <w:r>
+        <w:t>invoice_summary</w:t>
+      </w:r>
+      <w:proofErr w:type="gramEnd"/>
+      <w:r>
+        <w:t>.csv</w:t>
+      </w:r>
+    </w:p>
+    <w:p>
+      <w:pPr>
+        <w:spacing w:line="240" w:lineRule="auto"/>
+        <w:rPr>
+          <w:b/>
+          <w:color w:val="FF0000"/>
+          <w:lang w:val="en-US"/>
+        </w:rPr>
+      </w:pPr>
+      <w:proofErr w:type="spellStart"/>
+      <w:proofErr w:type="gramStart"/>
+      <w:r>
+        <w:rPr>
+          <w:b/>
+          <w:color w:val="FF0000"/>
+          <w:lang w:val="en-US"/>
+        </w:rPr>
+        <w:t>Essa</w:t>
+      </w:r>
+      <w:proofErr w:type="spellEnd"/>
+      <w:r>
+        <w:rPr>
+          <w:b/>
+          <w:color w:val="FF0000"/>
+          <w:lang w:val="en-US"/>
+        </w:rPr>
+        <w:t xml:space="preserve"> </w:t>
+      </w:r>
+      <w:proofErr w:type="spellStart"/>
+      <w:r>
+        <w:rPr>
+          <w:b/>
+          <w:color w:val="FF0000"/>
+          <w:lang w:val="en-US"/>
+        </w:rPr>
+        <w:t>distinção</w:t>
+      </w:r>
+      <w:proofErr w:type="spellEnd"/>
+      <w:r>
+        <w:rPr>
+          <w:b/>
+          <w:color w:val="FF0000"/>
+          <w:lang w:val="en-US"/>
+        </w:rPr>
+        <w:t xml:space="preserve"> é </w:t>
+      </w:r>
+      <w:proofErr w:type="spellStart"/>
+      <w:r>
+        <w:rPr>
+          <w:b/>
+          <w:color w:val="FF0000"/>
+          <w:lang w:val="en-US"/>
+        </w:rPr>
+        <w:t>muito</w:t>
+      </w:r>
+      <w:proofErr w:type="spellEnd"/>
+      <w:r>
+        <w:rPr>
+          <w:b/>
+          <w:color w:val="FF0000"/>
+          <w:lang w:val="en-US"/>
+        </w:rPr>
+        <w:t xml:space="preserve"> importante.</w:t>
+      </w:r>
+      <w:proofErr w:type="gramEnd"/>
+      <w:r>
+        <w:rPr>
+          <w:b/>
+          <w:color w:val="FF0000"/>
+          <w:lang w:val="en-US"/>
+        </w:rPr>
+        <w:t xml:space="preserve"> Você está pensando </w:t>
+      </w:r>
+      <w:proofErr w:type="gramStart"/>
+      <w:r>
+        <w:rPr>
+          <w:b/>
+          <w:color w:val="FF0000"/>
+          <w:lang w:val="en-US"/>
+        </w:rPr>
+        <w:t>como</w:t>
+      </w:r>
+      <w:proofErr w:type="gramEnd"/>
+      <w:r>
+        <w:rPr>
+          <w:b/>
+          <w:color w:val="FF0000"/>
+          <w:lang w:val="en-US"/>
+        </w:rPr>
+        <w:t xml:space="preserve"> desenvolvedora agora: código faz, dados guardam.</w:t>
+      </w:r>
+    </w:p>
+    <w:p>
+      <w:pPr>
+        <w:pBdr>
+          <w:bottom w:val="single" w:sz="12" w:space="1" w:color="auto"/>
+        </w:pBdr>
+        <w:spacing w:line="240" w:lineRule="auto"/>
+        <w:rPr>
+          <w:b/>
+          <w:color w:val="FF0000"/>
+          <w:lang w:val="en-US"/>
+        </w:rPr>
+      </w:pPr>
+      <w:r>
+        <w:rPr>
+          <w:b/>
+          <w:color w:val="FF0000"/>
+          <w:lang w:val="en-US"/>
+        </w:rPr>
+        <w:t xml:space="preserve">Empresas normalmente têm dois tipos de dados: </w:t>
+      </w:r>
+      <w:proofErr w:type="spellStart"/>
+      <w:r>
+        <w:rPr>
+          <w:b/>
+          <w:color w:val="FF0000"/>
+          <w:lang w:val="en-US"/>
+        </w:rPr>
+        <w:t>detailed</w:t>
+      </w:r>
+      <w:proofErr w:type="spellEnd"/>
+      <w:r>
+        <w:rPr>
+          <w:b/>
+          <w:color w:val="FF0000"/>
+          <w:lang w:val="en-US"/>
+        </w:rPr>
+        <w:t xml:space="preserve"> data -&gt; </w:t>
+      </w:r>
+      <w:proofErr w:type="spellStart"/>
+      <w:r>
+        <w:rPr>
+          <w:b/>
+          <w:color w:val="FF0000"/>
+          <w:lang w:val="en-US"/>
+        </w:rPr>
+        <w:t>every</w:t>
+      </w:r>
+      <w:proofErr w:type="spellEnd"/>
+      <w:r>
+        <w:rPr>
+          <w:b/>
+          <w:color w:val="FF0000"/>
+          <w:lang w:val="en-US"/>
+        </w:rPr>
+        <w:t xml:space="preserve"> invoice summary data -&gt; business metrics</w:t>
+      </w:r>
+    </w:p>
+    <w:p>
+      <w:pPr>
+        <w:spacing w:line="240" w:lineRule="auto"/>
       </w:pPr>
       <w:bookmarkStart w:id="0" w:name="_GoBack"/>
       <w:bookmarkEnd w:id="0"/>
     </w:p>
     <w:sectPr>
       <w:pgSz w:w="11906" w:h="16838"/>
-      <w:pgMar w:top="567" w:right="849" w:bottom="426" w:left="709" w:header="708" w:footer="708" w:gutter="0"/>
+      <w:pgMar w:top="567" w:right="849" w:bottom="284" w:left="709" w:header="708" w:footer="708" w:gutter="0"/>
       <w:cols w:space="708"/>
       <w:docGrid w:linePitch="360"/>
     </w:sectPr>

</xml_diff>

<commit_message>
add The CSV uses semicolon.
</commit_message>
<xml_diff>
--- a/Info_project/AI + ML + Automation + Data Project.docx
+++ b/Info_project/AI + ML + Automation + Data Project.docx
@@ -9555,6 +9555,417 @@
         </w:rPr>
         <w:t xml:space="preserve"> invoice summary data -&gt; business metrics</w:t>
       </w:r>
+    </w:p>
+    <w:p>
+      <w:pPr>
+        <w:spacing w:line="240" w:lineRule="auto"/>
+      </w:pPr>
+      <w:r>
+        <w:t>CSV -&gt; análise de dados e relatórios</w:t>
+      </w:r>
+    </w:p>
+    <w:p>
+      <w:pPr>
+        <w:spacing w:line="240" w:lineRule="auto"/>
+      </w:pPr>
+      <w:r>
+        <w:t xml:space="preserve">JSON -&gt; API e </w:t>
+      </w:r>
+      <w:proofErr w:type="spellStart"/>
+      <w:r>
+        <w:t>dashboard</w:t>
+      </w:r>
+      <w:proofErr w:type="spellEnd"/>
+      <w:r>
+        <w:t xml:space="preserve"> web</w:t>
+      </w:r>
+    </w:p>
+    <w:p>
+      <w:pPr>
+        <w:spacing w:line="240" w:lineRule="auto"/>
+      </w:pPr>
+      <w:proofErr w:type="spellStart"/>
+      <w:proofErr w:type="gramStart"/>
+      <w:r>
+        <w:t>SQLite</w:t>
+      </w:r>
+      <w:proofErr w:type="spellEnd"/>
+      <w:proofErr w:type="gramEnd"/>
+      <w:r>
+        <w:t xml:space="preserve"> -&gt; histórico permanente</w:t>
+      </w:r>
+    </w:p>
+    <w:p>
+      <w:pPr>
+        <w:pBdr>
+          <w:bottom w:val="single" w:sz="12" w:space="1" w:color="auto"/>
+        </w:pBdr>
+        <w:spacing w:line="240" w:lineRule="auto"/>
+      </w:pPr>
+    </w:p>
+    <w:p>
+      <w:pPr>
+        <w:spacing w:line="240" w:lineRule="auto"/>
+        <w:rPr>
+          <w:lang w:val="en-US"/>
+        </w:rPr>
+      </w:pPr>
+      <w:proofErr w:type="spellStart"/>
+      <w:r>
+        <w:rPr>
+          <w:lang w:val="en-US"/>
+        </w:rPr>
+        <w:t>AI_Document_Intelligence_Hub</w:t>
+      </w:r>
+      <w:proofErr w:type="spellEnd"/>
+      <w:r>
+        <w:rPr>
+          <w:lang w:val="en-US"/>
+        </w:rPr>
+        <w:t>/</w:t>
+      </w:r>
+    </w:p>
+    <w:p>
+      <w:pPr>
+        <w:spacing w:line="240" w:lineRule="auto"/>
+        <w:rPr>
+          <w:lang w:val="en-US"/>
+        </w:rPr>
+      </w:pPr>
+      <w:r>
+        <w:rPr>
+          <w:rFonts w:ascii="Arial" w:hAnsi="Arial" w:cs="Arial"/>
+          <w:lang w:val="en-US"/>
+        </w:rPr>
+        <w:t>├</w:t>
+      </w:r>
+      <w:r>
+        <w:rPr>
+          <w:rFonts w:ascii="Calibri" w:hAnsi="Calibri" w:cs="Calibri"/>
+          <w:lang w:val="en-US"/>
+        </w:rPr>
+        <w:t>──</w:t>
+      </w:r>
+      <w:r>
+        <w:rPr>
+          <w:lang w:val="en-US"/>
+        </w:rPr>
+        <w:t xml:space="preserve"> </w:t>
+      </w:r>
+      <w:proofErr w:type="gramStart"/>
+      <w:r>
+        <w:rPr>
+          <w:lang w:val="en-US"/>
+        </w:rPr>
+        <w:t>data</w:t>
+      </w:r>
+      <w:proofErr w:type="gramEnd"/>
+      <w:r>
+        <w:rPr>
+          <w:lang w:val="en-US"/>
+        </w:rPr>
+        <w:t>/</w:t>
+      </w:r>
+    </w:p>
+    <w:p>
+      <w:pPr>
+        <w:spacing w:line="240" w:lineRule="auto"/>
+        <w:rPr>
+          <w:lang w:val="en-US"/>
+        </w:rPr>
+      </w:pPr>
+      <w:r>
+        <w:rPr>
+          <w:lang w:val="en-US"/>
+        </w:rPr>
+        <w:t xml:space="preserve">│   </w:t>
+      </w:r>
+      <w:r>
+        <w:rPr>
+          <w:rFonts w:ascii="Arial" w:hAnsi="Arial" w:cs="Arial"/>
+          <w:lang w:val="en-US"/>
+        </w:rPr>
+        <w:t>├</w:t>
+      </w:r>
+      <w:r>
+        <w:rPr>
+          <w:rFonts w:ascii="Calibri" w:hAnsi="Calibri" w:cs="Calibri"/>
+          <w:lang w:val="en-US"/>
+        </w:rPr>
+        <w:t>──</w:t>
+      </w:r>
+      <w:r>
+        <w:rPr>
+          <w:lang w:val="en-US"/>
+        </w:rPr>
+        <w:t xml:space="preserve"> invoice_results.csv</w:t>
+      </w:r>
+    </w:p>
+    <w:p>
+      <w:pPr>
+        <w:spacing w:line="240" w:lineRule="auto"/>
+        <w:rPr>
+          <w:lang w:val="en-US"/>
+        </w:rPr>
+      </w:pPr>
+      <w:r>
+        <w:rPr>
+          <w:lang w:val="en-US"/>
+        </w:rPr>
+        <w:t>│   └── invoice_summary.csv</w:t>
+      </w:r>
+    </w:p>
+    <w:p>
+      <w:pPr>
+        <w:spacing w:line="240" w:lineRule="auto"/>
+        <w:rPr>
+          <w:lang w:val="en-US"/>
+        </w:rPr>
+      </w:pPr>
+      <w:r>
+        <w:rPr>
+          <w:rFonts w:ascii="Arial" w:hAnsi="Arial" w:cs="Arial"/>
+          <w:lang w:val="en-US"/>
+        </w:rPr>
+        <w:lastRenderedPageBreak/>
+        <w:t>├</w:t>
+      </w:r>
+      <w:r>
+        <w:rPr>
+          <w:lang w:val="en-US"/>
+        </w:rPr>
+        <w:t xml:space="preserve">── </w:t>
+      </w:r>
+      <w:proofErr w:type="gramStart"/>
+      <w:r>
+        <w:rPr>
+          <w:lang w:val="en-US"/>
+        </w:rPr>
+        <w:t>scripts</w:t>
+      </w:r>
+      <w:proofErr w:type="gramEnd"/>
+      <w:r>
+        <w:rPr>
+          <w:lang w:val="en-US"/>
+        </w:rPr>
+        <w:t>/</w:t>
+      </w:r>
+    </w:p>
+    <w:p>
+      <w:pPr>
+        <w:spacing w:line="240" w:lineRule="auto"/>
+        <w:rPr>
+          <w:lang w:val="en-US"/>
+        </w:rPr>
+      </w:pPr>
+      <w:r>
+        <w:rPr>
+          <w:lang w:val="en-US"/>
+        </w:rPr>
+        <w:t xml:space="preserve">│   </w:t>
+      </w:r>
+      <w:r>
+        <w:rPr>
+          <w:rFonts w:ascii="Arial" w:hAnsi="Arial" w:cs="Arial"/>
+          <w:lang w:val="en-US"/>
+        </w:rPr>
+        <w:t>├</w:t>
+      </w:r>
+      <w:r>
+        <w:rPr>
+          <w:rFonts w:ascii="Calibri" w:hAnsi="Calibri" w:cs="Calibri"/>
+          <w:lang w:val="en-US"/>
+        </w:rPr>
+        <w:t>──</w:t>
+      </w:r>
+      <w:r>
+        <w:rPr>
+          <w:lang w:val="en-US"/>
+        </w:rPr>
+        <w:t xml:space="preserve"> invoice_analyzer.py</w:t>
+      </w:r>
+    </w:p>
+    <w:p>
+      <w:pPr>
+        <w:spacing w:line="240" w:lineRule="auto"/>
+        <w:rPr>
+          <w:lang w:val="en-US"/>
+        </w:rPr>
+      </w:pPr>
+      <w:r>
+        <w:rPr>
+          <w:lang w:val="en-US"/>
+        </w:rPr>
+        <w:t>│   └── invoice_data_analysis.py</w:t>
+      </w:r>
+    </w:p>
+    <w:p>
+      <w:pPr>
+        <w:spacing w:line="240" w:lineRule="auto"/>
+        <w:rPr>
+          <w:lang w:val="en-US"/>
+        </w:rPr>
+      </w:pPr>
+      <w:r>
+        <w:rPr>
+          <w:rFonts w:ascii="Arial" w:hAnsi="Arial" w:cs="Arial"/>
+          <w:lang w:val="en-US"/>
+        </w:rPr>
+        <w:t>├</w:t>
+      </w:r>
+      <w:r>
+        <w:rPr>
+          <w:rFonts w:ascii="Calibri" w:hAnsi="Calibri" w:cs="Calibri"/>
+          <w:lang w:val="en-US"/>
+        </w:rPr>
+        <w:t>──</w:t>
+      </w:r>
+      <w:r>
+        <w:rPr>
+          <w:lang w:val="en-US"/>
+        </w:rPr>
+        <w:t xml:space="preserve"> </w:t>
+      </w:r>
+      <w:proofErr w:type="gramStart"/>
+      <w:r>
+        <w:rPr>
+          <w:lang w:val="en-US"/>
+        </w:rPr>
+        <w:t>services</w:t>
+      </w:r>
+      <w:proofErr w:type="gramEnd"/>
+      <w:r>
+        <w:rPr>
+          <w:lang w:val="en-US"/>
+        </w:rPr>
+        <w:t>/</w:t>
+      </w:r>
+    </w:p>
+    <w:p>
+      <w:pPr>
+        <w:spacing w:line="240" w:lineRule="auto"/>
+        <w:rPr>
+          <w:lang w:val="en-US"/>
+        </w:rPr>
+      </w:pPr>
+      <w:r>
+        <w:rPr>
+          <w:lang w:val="en-US"/>
+        </w:rPr>
+        <w:t xml:space="preserve">│   </w:t>
+      </w:r>
+      <w:r>
+        <w:rPr>
+          <w:rFonts w:ascii="Arial" w:hAnsi="Arial" w:cs="Arial"/>
+          <w:lang w:val="en-US"/>
+        </w:rPr>
+        <w:t>├</w:t>
+      </w:r>
+      <w:r>
+        <w:rPr>
+          <w:rFonts w:ascii="Calibri" w:hAnsi="Calibri" w:cs="Calibri"/>
+          <w:lang w:val="en-US"/>
+        </w:rPr>
+        <w:t>──</w:t>
+      </w:r>
+      <w:r>
+        <w:rPr>
+          <w:lang w:val="en-US"/>
+        </w:rPr>
+        <w:t xml:space="preserve"> extractor.py</w:t>
+      </w:r>
+    </w:p>
+    <w:p>
+      <w:pPr>
+        <w:spacing w:line="240" w:lineRule="auto"/>
+        <w:rPr>
+          <w:lang w:val="en-US"/>
+        </w:rPr>
+      </w:pPr>
+      <w:r>
+        <w:rPr>
+          <w:lang w:val="en-US"/>
+        </w:rPr>
+        <w:t xml:space="preserve">│   </w:t>
+      </w:r>
+      <w:r>
+        <w:rPr>
+          <w:rFonts w:ascii="Arial" w:hAnsi="Arial" w:cs="Arial"/>
+          <w:lang w:val="en-US"/>
+        </w:rPr>
+        <w:t>├</w:t>
+      </w:r>
+      <w:r>
+        <w:rPr>
+          <w:rFonts w:ascii="Calibri" w:hAnsi="Calibri" w:cs="Calibri"/>
+          <w:lang w:val="en-US"/>
+        </w:rPr>
+        <w:t>──</w:t>
+      </w:r>
+      <w:r>
+        <w:rPr>
+          <w:lang w:val="en-US"/>
+        </w:rPr>
+        <w:t xml:space="preserve"> validator.py</w:t>
+      </w:r>
+    </w:p>
+    <w:p>
+      <w:pPr>
+        <w:spacing w:line="240" w:lineRule="auto"/>
+        <w:rPr>
+          <w:lang w:val="en-US"/>
+        </w:rPr>
+      </w:pPr>
+      <w:r>
+        <w:rPr>
+          <w:lang w:val="en-US"/>
+        </w:rPr>
+        <w:t>│   └── exporter.py</w:t>
+      </w:r>
+    </w:p>
+    <w:p>
+      <w:pPr>
+        <w:spacing w:line="240" w:lineRule="auto"/>
+      </w:pPr>
+      <w:r>
+        <w:rPr>
+          <w:rFonts w:ascii="Arial" w:hAnsi="Arial" w:cs="Arial"/>
+        </w:rPr>
+        <w:t>├</w:t>
+      </w:r>
+      <w:r>
+        <w:rPr>
+          <w:rFonts w:ascii="Calibri" w:hAnsi="Calibri" w:cs="Calibri"/>
+        </w:rPr>
+        <w:t>──</w:t>
+      </w:r>
+      <w:r>
+        <w:t xml:space="preserve"> </w:t>
+      </w:r>
+      <w:proofErr w:type="gramStart"/>
+      <w:r>
+        <w:t>README.</w:t>
+      </w:r>
+      <w:proofErr w:type="gramEnd"/>
+      <w:r>
+        <w:t>md</w:t>
+      </w:r>
+    </w:p>
+    <w:p>
+      <w:pPr>
+        <w:spacing w:line="240" w:lineRule="auto"/>
+      </w:pPr>
+      <w:r>
+        <w:t>└── requirements.txt</w:t>
+      </w:r>
+    </w:p>
+    <w:p>
+      <w:pPr>
+        <w:pBdr>
+          <w:bottom w:val="single" w:sz="12" w:space="1" w:color="auto"/>
+        </w:pBdr>
+        <w:spacing w:line="240" w:lineRule="auto"/>
+      </w:pPr>
     </w:p>
     <w:p>
       <w:pPr>

</xml_diff>

<commit_message>
add img project table semicolon
</commit_message>
<xml_diff>
--- a/Info_project/AI + ML + Automation + Data Project.docx
+++ b/Info_project/AI + ML + Automation + Data Project.docx
@@ -9970,9 +9970,118 @@
     <w:p>
       <w:pPr>
         <w:spacing w:line="240" w:lineRule="auto"/>
+        <w:rPr>
+          <w:b/>
+        </w:rPr>
+      </w:pPr>
+      <w:r>
+        <w:rPr>
+          <w:b/>
+        </w:rPr>
+        <w:t>Diferença rápida</w:t>
+      </w:r>
+    </w:p>
+    <w:p>
+      <w:pPr>
+        <w:spacing w:line="240" w:lineRule="auto"/>
+        <w:rPr>
+          <w:b/>
+          <w:color w:val="FF0000"/>
+        </w:rPr>
+      </w:pPr>
+      <w:r>
+        <w:rPr>
+          <w:b/>
+          <w:color w:val="FF0000"/>
+        </w:rPr>
+        <w:t xml:space="preserve">CSV: bom para Excel, Pandas, </w:t>
+      </w:r>
+      <w:proofErr w:type="gramStart"/>
+      <w:r>
+        <w:rPr>
+          <w:b/>
+          <w:color w:val="FF0000"/>
+        </w:rPr>
+        <w:t>tabelas</w:t>
+      </w:r>
+      <w:proofErr w:type="gramEnd"/>
+    </w:p>
+    <w:p>
+      <w:pPr>
+        <w:spacing w:line="240" w:lineRule="auto"/>
+        <w:rPr>
+          <w:b/>
+          <w:color w:val="FF0000"/>
+          <w:lang w:val="en-US"/>
+        </w:rPr>
+      </w:pPr>
+      <w:r>
+        <w:rPr>
+          <w:b/>
+          <w:color w:val="FF0000"/>
+          <w:lang w:val="en-US"/>
+        </w:rPr>
+        <w:t xml:space="preserve">JSON: </w:t>
+      </w:r>
+      <w:proofErr w:type="spellStart"/>
+      <w:r>
+        <w:rPr>
+          <w:b/>
+          <w:color w:val="FF0000"/>
+          <w:lang w:val="en-US"/>
+        </w:rPr>
+        <w:t>bom</w:t>
+      </w:r>
+      <w:proofErr w:type="spellEnd"/>
+      <w:r>
+        <w:rPr>
+          <w:b/>
+          <w:color w:val="FF0000"/>
+          <w:lang w:val="en-US"/>
+        </w:rPr>
+        <w:t xml:space="preserve"> </w:t>
+      </w:r>
+      <w:proofErr w:type="spellStart"/>
+      <w:r>
+        <w:rPr>
+          <w:b/>
+          <w:color w:val="FF0000"/>
+          <w:lang w:val="en-US"/>
+        </w:rPr>
+        <w:t>para</w:t>
+      </w:r>
+      <w:proofErr w:type="spellEnd"/>
+      <w:r>
+        <w:rPr>
+          <w:b/>
+          <w:color w:val="FF0000"/>
+          <w:lang w:val="en-US"/>
+        </w:rPr>
+        <w:t xml:space="preserve"> APIs, web apps, JavaScript, dashboards</w:t>
+      </w:r>
+    </w:p>
+    <w:p>
+      <w:pPr>
+        <w:pBdr>
+          <w:bottom w:val="single" w:sz="12" w:space="1" w:color="auto"/>
+        </w:pBdr>
+        <w:spacing w:line="240" w:lineRule="auto"/>
+      </w:pPr>
+      <w:r>
+        <w:t>Nosso projeto final vai precisar dos dois.</w:t>
+      </w:r>
+    </w:p>
+    <w:p>
+      <w:pPr>
+        <w:spacing w:line="240" w:lineRule="auto"/>
       </w:pPr>
       <w:bookmarkStart w:id="0" w:name="_GoBack"/>
       <w:bookmarkEnd w:id="0"/>
+    </w:p>
+    <w:p>
+      <w:pPr>
+        <w:spacing w:line="240" w:lineRule="auto"/>
+      </w:pPr>
     </w:p>
     <w:sectPr>
       <w:pgSz w:w="11906" w:h="16838"/>

</xml_diff>

<commit_message>
This check belongs to invoice_analyzer.py. This file reads invoice files. If there are no files, the app stops safely.
</commit_message>
<xml_diff>
--- a/Info_project/AI + ML + Automation + Data Project.docx
+++ b/Info_project/AI + ML + Automation + Data Project.docx
@@ -10070,8 +10070,6 @@
       <w:r>
         <w:t>Nosso projeto final vai precisar dos dois.</w:t>
       </w:r>
-      <w:bookmarkStart w:id="0" w:name="_GoBack"/>
-      <w:bookmarkEnd w:id="0"/>
     </w:p>
     <w:p>
       <w:pPr>
@@ -10079,12 +10077,29 @@
           <w:bottom w:val="single" w:sz="12" w:space="1" w:color="auto"/>
         </w:pBdr>
         <w:spacing w:line="240" w:lineRule="auto"/>
-      </w:pPr>
-      <w:r>
-        <w:t xml:space="preserve">Pandas int64 -&gt; Python </w:t>
-      </w:r>
-      <w:proofErr w:type="spellStart"/>
-      <w:r>
+        <w:rPr>
+          <w:lang w:val="en-US"/>
+        </w:rPr>
+      </w:pPr>
+      <w:proofErr w:type="gramStart"/>
+      <w:r>
+        <w:rPr>
+          <w:lang w:val="en-US"/>
+        </w:rPr>
+        <w:t>Pandas</w:t>
+      </w:r>
+      <w:proofErr w:type="gramEnd"/>
+      <w:r>
+        <w:rPr>
+          <w:lang w:val="en-US"/>
+        </w:rPr>
+        <w:t xml:space="preserve"> int64 -&gt; Python </w:t>
+      </w:r>
+      <w:proofErr w:type="spellStart"/>
+      <w:r>
+        <w:rPr>
+          <w:lang w:val="en-US"/>
+        </w:rPr>
         <w:t>int</w:t>
       </w:r>
       <w:proofErr w:type="spellEnd"/>
@@ -10095,24 +10110,216 @@
           <w:bottom w:val="single" w:sz="12" w:space="1" w:color="auto"/>
         </w:pBdr>
         <w:spacing w:line="240" w:lineRule="auto"/>
-      </w:pPr>
-      <w:r>
-        <w:t xml:space="preserve">Pandas float64 -&gt; Python </w:t>
-      </w:r>
-      <w:proofErr w:type="spellStart"/>
-      <w:r>
-        <w:t>float</w:t>
-      </w:r>
-      <w:proofErr w:type="spellEnd"/>
-    </w:p>
-    <w:p>
-      <w:pPr>
-        <w:spacing w:line="240" w:lineRule="auto"/>
-      </w:pPr>
-    </w:p>
-    <w:p>
-      <w:pPr>
-        <w:spacing w:line="240" w:lineRule="auto"/>
+        <w:rPr>
+          <w:lang w:val="en-US"/>
+        </w:rPr>
+      </w:pPr>
+      <w:proofErr w:type="gramStart"/>
+      <w:r>
+        <w:rPr>
+          <w:lang w:val="en-US"/>
+        </w:rPr>
+        <w:t>Pandas</w:t>
+      </w:r>
+      <w:proofErr w:type="gramEnd"/>
+      <w:r>
+        <w:rPr>
+          <w:lang w:val="en-US"/>
+        </w:rPr>
+        <w:t xml:space="preserve"> float64 -&gt; Python float</w:t>
+      </w:r>
+    </w:p>
+    <w:p>
+      <w:pPr>
+        <w:spacing w:line="240" w:lineRule="auto"/>
+        <w:rPr>
+          <w:lang w:val="en-US"/>
+        </w:rPr>
+      </w:pPr>
+    </w:p>
+    <w:p>
+      <w:pPr>
+        <w:spacing w:line="240" w:lineRule="auto"/>
+        <w:rPr>
+          <w:lang w:val="en-US"/>
+        </w:rPr>
+      </w:pPr>
+      <w:r>
+        <w:rPr>
+          <w:lang w:val="en-US"/>
+        </w:rPr>
+        <w:t>Comments explain code lines.</w:t>
+      </w:r>
+    </w:p>
+    <w:p>
+      <w:pPr>
+        <w:spacing w:line="240" w:lineRule="auto"/>
+        <w:rPr>
+          <w:lang w:val="en-US"/>
+        </w:rPr>
+      </w:pPr>
+      <w:proofErr w:type="spellStart"/>
+      <w:r>
+        <w:rPr>
+          <w:lang w:val="en-US"/>
+        </w:rPr>
+        <w:t>Docstrings</w:t>
+      </w:r>
+      <w:proofErr w:type="spellEnd"/>
+      <w:r>
+        <w:rPr>
+          <w:lang w:val="en-US"/>
+        </w:rPr>
+        <w:t xml:space="preserve"> explain functions.</w:t>
+      </w:r>
+    </w:p>
+    <w:p>
+      <w:pPr>
+        <w:spacing w:line="240" w:lineRule="auto"/>
+        <w:rPr>
+          <w:lang w:val="en-US"/>
+        </w:rPr>
+      </w:pPr>
+      <w:proofErr w:type="spellStart"/>
+      <w:r>
+        <w:rPr>
+          <w:lang w:val="en-US"/>
+        </w:rPr>
+        <w:t>Pylint</w:t>
+      </w:r>
+      <w:proofErr w:type="spellEnd"/>
+      <w:r>
+        <w:rPr>
+          <w:lang w:val="en-US"/>
+        </w:rPr>
+        <w:t xml:space="preserve"> likes </w:t>
+      </w:r>
+      <w:proofErr w:type="spellStart"/>
+      <w:r>
+        <w:rPr>
+          <w:lang w:val="en-US"/>
+        </w:rPr>
+        <w:t>docstrings</w:t>
+      </w:r>
+      <w:proofErr w:type="spellEnd"/>
+      <w:r>
+        <w:rPr>
+          <w:lang w:val="en-US"/>
+        </w:rPr>
+        <w:t>.</w:t>
+      </w:r>
+    </w:p>
+    <w:p>
+      <w:pPr>
+        <w:spacing w:line="240" w:lineRule="auto"/>
+        <w:rPr>
+          <w:lang w:val="en-US"/>
+        </w:rPr>
+      </w:pPr>
+    </w:p>
+    <w:p>
+      <w:pPr>
+        <w:spacing w:line="240" w:lineRule="auto"/>
+        <w:rPr>
+          <w:lang w:val="en-US"/>
+        </w:rPr>
+      </w:pPr>
+      <w:proofErr w:type="spellStart"/>
+      <w:r>
+        <w:rPr>
+          <w:lang w:val="en-US"/>
+        </w:rPr>
+        <w:t>Docstring</w:t>
+      </w:r>
+      <w:proofErr w:type="spellEnd"/>
+      <w:r>
+        <w:rPr>
+          <w:lang w:val="en-US"/>
+        </w:rPr>
+        <w:t xml:space="preserve"> </w:t>
+      </w:r>
+      <w:proofErr w:type="spellStart"/>
+      <w:r>
+        <w:rPr>
+          <w:lang w:val="en-US"/>
+        </w:rPr>
+        <w:t>documenta</w:t>
+      </w:r>
+      <w:proofErr w:type="spellEnd"/>
+      <w:r>
+        <w:rPr>
+          <w:lang w:val="en-US"/>
+        </w:rPr>
+        <w:t xml:space="preserve"> a </w:t>
+      </w:r>
+      <w:proofErr w:type="spellStart"/>
+      <w:r>
+        <w:rPr>
+          <w:lang w:val="en-US"/>
+        </w:rPr>
+        <w:t>função</w:t>
+      </w:r>
+      <w:proofErr w:type="spellEnd"/>
+      <w:r>
+        <w:rPr>
+          <w:lang w:val="en-US"/>
+        </w:rPr>
+        <w:t xml:space="preserve"> </w:t>
+      </w:r>
+      <w:proofErr w:type="spellStart"/>
+      <w:r>
+        <w:rPr>
+          <w:lang w:val="en-US"/>
+        </w:rPr>
+        <w:t>oficialmente</w:t>
+      </w:r>
+      <w:proofErr w:type="spellEnd"/>
+      <w:r>
+        <w:rPr>
+          <w:lang w:val="en-US"/>
+        </w:rPr>
+        <w:t>:</w:t>
+      </w:r>
+      <w:r>
+        <w:rPr>
+          <w:lang w:val="en-US"/>
+        </w:rPr>
+        <w:t xml:space="preserve"> </w:t>
+      </w:r>
+      <w:r>
+        <w:rPr>
+          <w:lang w:val="en-US"/>
+        </w:rPr>
+        <w:t>"""Check invoice fields and return status, risk score, and reasons."""</w:t>
+      </w:r>
+    </w:p>
+    <w:p>
+      <w:pPr>
+        <w:pBdr>
+          <w:bottom w:val="single" w:sz="12" w:space="1" w:color="auto"/>
+        </w:pBdr>
+        <w:spacing w:line="240" w:lineRule="auto"/>
+        <w:rPr>
+          <w:lang w:val="en-US"/>
+        </w:rPr>
+      </w:pPr>
+    </w:p>
+    <w:p>
+      <w:pPr>
+        <w:spacing w:line="240" w:lineRule="auto"/>
+        <w:rPr>
+          <w:lang w:val="en-US"/>
+        </w:rPr>
+      </w:pPr>
+      <w:bookmarkStart w:id="0" w:name="_GoBack"/>
+      <w:bookmarkEnd w:id="0"/>
+    </w:p>
+    <w:p>
+      <w:pPr>
+        <w:spacing w:line="240" w:lineRule="auto"/>
+        <w:rPr>
+          <w:lang w:val="en-US"/>
+        </w:rPr>
       </w:pPr>
     </w:p>
     <w:sectPr>
@@ -11108,6 +11315,11 @@
     <w:basedOn w:val="Fontepargpadro"/>
     <w:rsid w:val="00F174E6"/>
   </w:style>
+  <w:style w:type="character" w:customStyle="1" w:styleId="hljs-string">
+    <w:name w:val="hljs-string"/>
+    <w:basedOn w:val="Fontepargpadro"/>
+    <w:rsid w:val="00053F6C"/>
+  </w:style>
 </w:styles>
 </file>
 
@@ -11364,6 +11576,11 @@
     <w:name w:val="hljs-comment"/>
     <w:basedOn w:val="Fontepargpadro"/>
     <w:rsid w:val="00F174E6"/>
+  </w:style>
+  <w:style w:type="character" w:customStyle="1" w:styleId="hljs-string">
+    <w:name w:val="hljs-string"/>
+    <w:basedOn w:val="Fontepargpadro"/>
+    <w:rsid w:val="00053F6C"/>
   </w:style>
 </w:styles>
 </file>

</xml_diff>

<commit_message>
CSV file created: reports\invoice_results.csv
</commit_message>
<xml_diff>
--- a/Info_project/AI + ML + Automation + Data Project.docx
+++ b/Info_project/AI + ML + Automation + Data Project.docx
@@ -10292,6 +10292,771 @@
         </w:rPr>
         <w:t>"""Check invoice fields and return status, risk score, and reasons."""</w:t>
       </w:r>
+    </w:p>
+    <w:p>
+      <w:pPr>
+        <w:pBdr>
+          <w:bottom w:val="single" w:sz="12" w:space="1" w:color="auto"/>
+        </w:pBdr>
+        <w:spacing w:line="240" w:lineRule="auto"/>
+        <w:rPr>
+          <w:lang w:val="en-US"/>
+        </w:rPr>
+      </w:pPr>
+    </w:p>
+    <w:p>
+      <w:r>
+        <w:rPr>
+          <w:rStyle w:val="Forte"/>
+          <w:rFonts w:ascii="Segoe UI" w:hAnsi="Segoe UI" w:cs="Segoe UI"/>
+          <w:color w:val="FFFFFF"/>
+          <w:sz w:val="21"/>
+          <w:szCs w:val="21"/>
+          <w:bdr w:val="single" w:sz="2" w:space="0" w:color="auto" w:frame="1"/>
+          <w:shd w:val="clear" w:color="auto" w:fill="181818"/>
+        </w:rPr>
+        <w:t>Como O Projeto Vai Ficar</w:t>
+      </w:r>
+      <w:r>
+        <w:rPr>
+          <w:rFonts w:ascii="Segoe UI" w:hAnsi="Segoe UI" w:cs="Segoe UI"/>
+          <w:color w:val="FFFFFF"/>
+          <w:sz w:val="21"/>
+          <w:szCs w:val="21"/>
+        </w:rPr>
+        <w:br/>
+      </w:r>
+      <w:r>
+        <w:rPr>
+          <w:rFonts w:ascii="Segoe UI" w:hAnsi="Segoe UI" w:cs="Segoe UI"/>
+          <w:color w:val="FFFFFF"/>
+          <w:sz w:val="21"/>
+          <w:szCs w:val="21"/>
+          <w:shd w:val="clear" w:color="auto" w:fill="181818"/>
+        </w:rPr>
+        <w:t>A visão profissional seria:</w:t>
+      </w:r>
+    </w:p>
+    <w:p>
+      <w:pPr>
+        <w:spacing w:line="240" w:lineRule="auto"/>
+      </w:pPr>
+      <w:r>
+        <w:t>1. Entrada organizada por ano/mês</w:t>
+      </w:r>
+    </w:p>
+    <w:p>
+      <w:pPr>
+        <w:spacing w:line="240" w:lineRule="auto"/>
+      </w:pPr>
+      <w:r>
+        <w:t>2. Processamento automático dos documentos</w:t>
+      </w:r>
+    </w:p>
+    <w:p>
+      <w:pPr>
+        <w:spacing w:line="240" w:lineRule="auto"/>
+      </w:pPr>
+      <w:r>
+        <w:t>3. CSV detalhado com todos os resultados</w:t>
+      </w:r>
+    </w:p>
+    <w:p>
+      <w:pPr>
+        <w:spacing w:line="240" w:lineRule="auto"/>
+      </w:pPr>
+      <w:r>
+        <w:t>4. Pandas cria resumo geral</w:t>
+      </w:r>
+    </w:p>
+    <w:p>
+      <w:pPr>
+        <w:spacing w:line="240" w:lineRule="auto"/>
+      </w:pPr>
+      <w:r>
+        <w:t>5. Pandas cria resumo por mês/ano</w:t>
+      </w:r>
+    </w:p>
+    <w:p>
+      <w:pPr>
+        <w:spacing w:line="240" w:lineRule="auto"/>
+      </w:pPr>
+      <w:r>
+        <w:t xml:space="preserve">6. JSON alimenta futura API </w:t>
+      </w:r>
+      <w:proofErr w:type="spellStart"/>
+      <w:r>
+        <w:t>Flask</w:t>
+      </w:r>
+      <w:proofErr w:type="spellEnd"/>
+    </w:p>
+    <w:p>
+      <w:pPr>
+        <w:spacing w:line="240" w:lineRule="auto"/>
+      </w:pPr>
+      <w:r>
+        <w:t xml:space="preserve">7. </w:t>
+      </w:r>
+      <w:proofErr w:type="spellStart"/>
+      <w:r>
+        <w:t>Dashboard</w:t>
+      </w:r>
+      <w:proofErr w:type="spellEnd"/>
+      <w:r>
+        <w:t xml:space="preserve"> mostra filtros por período</w:t>
+      </w:r>
+    </w:p>
+    <w:p>
+      <w:pPr>
+        <w:spacing w:line="240" w:lineRule="auto"/>
+      </w:pPr>
+    </w:p>
+    <w:p>
+      <w:pPr>
+        <w:spacing w:line="240" w:lineRule="auto"/>
+      </w:pPr>
+      <w:r>
+        <w:rPr>
+          <w:rFonts w:ascii="Segoe UI" w:hAnsi="Segoe UI" w:cs="Segoe UI"/>
+          <w:color w:val="FFFFFF"/>
+          <w:sz w:val="21"/>
+          <w:szCs w:val="21"/>
+          <w:shd w:val="clear" w:color="auto" w:fill="181818"/>
+        </w:rPr>
+        <w:t>Isso é muito bom para portfólio, porque mostra:</w:t>
+      </w:r>
+    </w:p>
+    <w:p>
+      <w:pPr>
+        <w:spacing w:line="240" w:lineRule="auto"/>
+        <w:rPr>
+          <w:lang w:val="en-US"/>
+        </w:rPr>
+      </w:pPr>
+      <w:proofErr w:type="gramStart"/>
+      <w:r>
+        <w:rPr>
+          <w:lang w:val="en-US"/>
+        </w:rPr>
+        <w:lastRenderedPageBreak/>
+        <w:t>automation</w:t>
+      </w:r>
+      <w:proofErr w:type="gramEnd"/>
+    </w:p>
+    <w:p>
+      <w:pPr>
+        <w:spacing w:line="240" w:lineRule="auto"/>
+        <w:rPr>
+          <w:lang w:val="en-US"/>
+        </w:rPr>
+      </w:pPr>
+      <w:proofErr w:type="gramStart"/>
+      <w:r>
+        <w:rPr>
+          <w:lang w:val="en-US"/>
+        </w:rPr>
+        <w:t>data</w:t>
+      </w:r>
+      <w:proofErr w:type="gramEnd"/>
+      <w:r>
+        <w:rPr>
+          <w:lang w:val="en-US"/>
+        </w:rPr>
+        <w:t xml:space="preserve"> pipeline</w:t>
+      </w:r>
+    </w:p>
+    <w:p>
+      <w:pPr>
+        <w:spacing w:line="240" w:lineRule="auto"/>
+        <w:rPr>
+          <w:lang w:val="en-US"/>
+        </w:rPr>
+      </w:pPr>
+      <w:proofErr w:type="gramStart"/>
+      <w:r>
+        <w:rPr>
+          <w:lang w:val="en-US"/>
+        </w:rPr>
+        <w:t>file</w:t>
+      </w:r>
+      <w:proofErr w:type="gramEnd"/>
+      <w:r>
+        <w:rPr>
+          <w:lang w:val="en-US"/>
+        </w:rPr>
+        <w:t xml:space="preserve"> organization</w:t>
+      </w:r>
+    </w:p>
+    <w:p>
+      <w:pPr>
+        <w:spacing w:line="240" w:lineRule="auto"/>
+        <w:rPr>
+          <w:lang w:val="en-US"/>
+        </w:rPr>
+      </w:pPr>
+      <w:proofErr w:type="gramStart"/>
+      <w:r>
+        <w:rPr>
+          <w:lang w:val="en-US"/>
+        </w:rPr>
+        <w:t>business</w:t>
+      </w:r>
+      <w:proofErr w:type="gramEnd"/>
+      <w:r>
+        <w:rPr>
+          <w:lang w:val="en-US"/>
+        </w:rPr>
+        <w:t xml:space="preserve"> reports</w:t>
+      </w:r>
+    </w:p>
+    <w:p>
+      <w:pPr>
+        <w:spacing w:line="240" w:lineRule="auto"/>
+      </w:pPr>
+      <w:r>
+        <w:t xml:space="preserve">Pandas </w:t>
+      </w:r>
+      <w:proofErr w:type="spellStart"/>
+      <w:r>
+        <w:t>analytics</w:t>
+      </w:r>
+      <w:proofErr w:type="spellEnd"/>
+    </w:p>
+    <w:p>
+      <w:pPr>
+        <w:pBdr>
+          <w:bottom w:val="single" w:sz="12" w:space="1" w:color="auto"/>
+        </w:pBdr>
+        <w:spacing w:line="240" w:lineRule="auto"/>
+      </w:pPr>
+      <w:proofErr w:type="gramStart"/>
+      <w:r>
+        <w:t>future</w:t>
+      </w:r>
+      <w:proofErr w:type="gramEnd"/>
+      <w:r>
+        <w:t xml:space="preserve"> </w:t>
+      </w:r>
+      <w:proofErr w:type="spellStart"/>
+      <w:r>
+        <w:t>dashboard</w:t>
+      </w:r>
+      <w:proofErr w:type="spellEnd"/>
+      <w:r>
+        <w:t xml:space="preserve"> </w:t>
+      </w:r>
+      <w:proofErr w:type="spellStart"/>
+      <w:r>
+        <w:t>filters</w:t>
+      </w:r>
+      <w:proofErr w:type="spellEnd"/>
+    </w:p>
+    <w:p>
+      <w:pPr>
+        <w:spacing w:line="240" w:lineRule="auto"/>
+      </w:pPr>
+      <w:proofErr w:type="spellStart"/>
+      <w:proofErr w:type="gramStart"/>
+      <w:r>
+        <w:t>glob</w:t>
+      </w:r>
+      <w:proofErr w:type="spellEnd"/>
+      <w:proofErr w:type="gramEnd"/>
+      <w:r>
+        <w:t xml:space="preserve"> </w:t>
+      </w:r>
+      <w:proofErr w:type="spellStart"/>
+      <w:r>
+        <w:t>reads</w:t>
+      </w:r>
+      <w:proofErr w:type="spellEnd"/>
+      <w:r>
+        <w:t xml:space="preserve"> </w:t>
+      </w:r>
+      <w:proofErr w:type="spellStart"/>
+      <w:r>
+        <w:t>one</w:t>
+      </w:r>
+      <w:proofErr w:type="spellEnd"/>
+      <w:r>
+        <w:t xml:space="preserve"> folder.</w:t>
+      </w:r>
+    </w:p>
+    <w:p>
+      <w:pPr>
+        <w:pBdr>
+          <w:bottom w:val="single" w:sz="12" w:space="1" w:color="auto"/>
+        </w:pBdr>
+        <w:spacing w:line="240" w:lineRule="auto"/>
+        <w:rPr>
+          <w:lang w:val="en-US"/>
+        </w:rPr>
+      </w:pPr>
+      <w:proofErr w:type="spellStart"/>
+      <w:proofErr w:type="gramStart"/>
+      <w:r>
+        <w:rPr>
+          <w:lang w:val="en-US"/>
+        </w:rPr>
+        <w:t>rglob</w:t>
+      </w:r>
+      <w:proofErr w:type="spellEnd"/>
+      <w:proofErr w:type="gramEnd"/>
+      <w:r>
+        <w:rPr>
+          <w:lang w:val="en-US"/>
+        </w:rPr>
+        <w:t xml:space="preserve"> reads this folder and all subfolders.</w:t>
+      </w:r>
+    </w:p>
+    <w:p>
+      <w:pPr>
+        <w:pBdr>
+          <w:top w:val="single" w:sz="2" w:space="0" w:color="auto"/>
+          <w:left w:val="single" w:sz="2" w:space="0" w:color="auto"/>
+          <w:bottom w:val="single" w:sz="2" w:space="0" w:color="auto"/>
+          <w:right w:val="single" w:sz="2" w:space="0" w:color="auto"/>
+        </w:pBdr>
+        <w:shd w:val="clear" w:color="auto" w:fill="181818"/>
+        <w:spacing w:beforeAutospacing="1" w:after="0" w:afterAutospacing="1" w:line="330" w:lineRule="atLeast"/>
+        <w:rPr>
+          <w:rFonts w:ascii="Segoe UI" w:eastAsia="Times New Roman" w:hAnsi="Segoe UI" w:cs="Segoe UI"/>
+          <w:color w:val="FFFFFF"/>
+          <w:sz w:val="21"/>
+          <w:szCs w:val="21"/>
+          <w:lang w:eastAsia="pt-BR"/>
+        </w:rPr>
+      </w:pPr>
+      <w:r>
+        <w:rPr>
+          <w:rFonts w:ascii="Segoe UI" w:eastAsia="Times New Roman" w:hAnsi="Segoe UI" w:cs="Segoe UI"/>
+          <w:b/>
+          <w:bCs/>
+          <w:color w:val="FFFFFF"/>
+          <w:sz w:val="21"/>
+          <w:szCs w:val="21"/>
+          <w:bdr w:val="single" w:sz="2" w:space="0" w:color="auto" w:frame="1"/>
+          <w:lang w:eastAsia="pt-BR"/>
+        </w:rPr>
+        <w:t>Como Isso Se Enquadra No Mercado De TI</w:t>
+      </w:r>
+      <w:r>
+        <w:rPr>
+          <w:rFonts w:ascii="Segoe UI" w:eastAsia="Times New Roman" w:hAnsi="Segoe UI" w:cs="Segoe UI"/>
+          <w:color w:val="FFFFFF"/>
+          <w:sz w:val="21"/>
+          <w:szCs w:val="21"/>
+          <w:lang w:eastAsia="pt-BR"/>
+        </w:rPr>
+        <w:br/>
+        <w:t>Esse projeto começa a tocar várias áreas:</w:t>
+      </w:r>
+    </w:p>
+    <w:p>
+      <w:pPr>
+        <w:pBdr>
+          <w:top w:val="single" w:sz="2" w:space="0" w:color="auto"/>
+          <w:left w:val="single" w:sz="2" w:space="0" w:color="auto"/>
+          <w:bottom w:val="single" w:sz="2" w:space="0" w:color="auto"/>
+          <w:right w:val="single" w:sz="2" w:space="0" w:color="auto"/>
+        </w:pBdr>
+        <w:shd w:val="clear" w:color="auto" w:fill="181818"/>
+        <w:spacing w:beforeAutospacing="1" w:after="0" w:afterAutospacing="1" w:line="330" w:lineRule="atLeast"/>
+        <w:rPr>
+          <w:rFonts w:ascii="Segoe UI" w:eastAsia="Times New Roman" w:hAnsi="Segoe UI" w:cs="Segoe UI"/>
+          <w:color w:val="FFFFFF"/>
+          <w:sz w:val="21"/>
+          <w:szCs w:val="21"/>
+          <w:lang w:eastAsia="pt-BR"/>
+        </w:rPr>
+      </w:pPr>
+      <w:r>
+        <w:rPr>
+          <w:rFonts w:ascii="Segoe UI" w:eastAsia="Times New Roman" w:hAnsi="Segoe UI" w:cs="Segoe UI"/>
+          <w:b/>
+          <w:bCs/>
+          <w:color w:val="FFFFFF"/>
+          <w:sz w:val="21"/>
+          <w:szCs w:val="21"/>
+          <w:bdr w:val="single" w:sz="2" w:space="0" w:color="auto" w:frame="1"/>
+          <w:lang w:eastAsia="pt-BR"/>
+        </w:rPr>
+        <w:t xml:space="preserve">Data </w:t>
+      </w:r>
+      <w:proofErr w:type="spellStart"/>
+      <w:r>
+        <w:rPr>
+          <w:rFonts w:ascii="Segoe UI" w:eastAsia="Times New Roman" w:hAnsi="Segoe UI" w:cs="Segoe UI"/>
+          <w:b/>
+          <w:bCs/>
+          <w:color w:val="FFFFFF"/>
+          <w:sz w:val="21"/>
+          <w:szCs w:val="21"/>
+          <w:bdr w:val="single" w:sz="2" w:space="0" w:color="auto" w:frame="1"/>
+          <w:lang w:eastAsia="pt-BR"/>
+        </w:rPr>
+        <w:t>Analyst</w:t>
+      </w:r>
+      <w:proofErr w:type="spellEnd"/>
+      <w:r>
+        <w:rPr>
+          <w:rFonts w:ascii="Segoe UI" w:eastAsia="Times New Roman" w:hAnsi="Segoe UI" w:cs="Segoe UI"/>
+          <w:color w:val="FFFFFF"/>
+          <w:sz w:val="21"/>
+          <w:szCs w:val="21"/>
+          <w:lang w:eastAsia="pt-BR"/>
+        </w:rPr>
+        <w:br/>
+        <w:t>Porque você usa Pandas, métricas, CSV, gráficos e insights.</w:t>
+      </w:r>
+    </w:p>
+    <w:p>
+      <w:pPr>
+        <w:pBdr>
+          <w:top w:val="single" w:sz="2" w:space="0" w:color="auto"/>
+          <w:left w:val="single" w:sz="2" w:space="0" w:color="auto"/>
+          <w:bottom w:val="single" w:sz="2" w:space="0" w:color="auto"/>
+          <w:right w:val="single" w:sz="2" w:space="0" w:color="auto"/>
+        </w:pBdr>
+        <w:shd w:val="clear" w:color="auto" w:fill="181818"/>
+        <w:spacing w:beforeAutospacing="1" w:after="0" w:afterAutospacing="1" w:line="330" w:lineRule="atLeast"/>
+        <w:rPr>
+          <w:rFonts w:ascii="Segoe UI" w:eastAsia="Times New Roman" w:hAnsi="Segoe UI" w:cs="Segoe UI"/>
+          <w:color w:val="FFFFFF"/>
+          <w:sz w:val="21"/>
+          <w:szCs w:val="21"/>
+          <w:lang w:eastAsia="pt-BR"/>
+        </w:rPr>
+      </w:pPr>
+      <w:r>
+        <w:rPr>
+          <w:rFonts w:ascii="Segoe UI" w:eastAsia="Times New Roman" w:hAnsi="Segoe UI" w:cs="Segoe UI"/>
+          <w:b/>
+          <w:bCs/>
+          <w:color w:val="FFFFFF"/>
+          <w:sz w:val="21"/>
+          <w:szCs w:val="21"/>
+          <w:bdr w:val="single" w:sz="2" w:space="0" w:color="auto" w:frame="1"/>
+          <w:lang w:eastAsia="pt-BR"/>
+        </w:rPr>
+        <w:t xml:space="preserve">Automation </w:t>
+      </w:r>
+      <w:proofErr w:type="spellStart"/>
+      <w:r>
+        <w:rPr>
+          <w:rFonts w:ascii="Segoe UI" w:eastAsia="Times New Roman" w:hAnsi="Segoe UI" w:cs="Segoe UI"/>
+          <w:b/>
+          <w:bCs/>
+          <w:color w:val="FFFFFF"/>
+          <w:sz w:val="21"/>
+          <w:szCs w:val="21"/>
+          <w:bdr w:val="single" w:sz="2" w:space="0" w:color="auto" w:frame="1"/>
+          <w:lang w:eastAsia="pt-BR"/>
+        </w:rPr>
+        <w:t>Developer</w:t>
+      </w:r>
+      <w:proofErr w:type="spellEnd"/>
+      <w:r>
+        <w:rPr>
+          <w:rFonts w:ascii="Segoe UI" w:eastAsia="Times New Roman" w:hAnsi="Segoe UI" w:cs="Segoe UI"/>
+          <w:color w:val="FFFFFF"/>
+          <w:sz w:val="21"/>
+          <w:szCs w:val="21"/>
+          <w:lang w:eastAsia="pt-BR"/>
+        </w:rPr>
+        <w:br/>
+        <w:t>Porque você automatiza leitura, validação e relatório.</w:t>
+      </w:r>
+    </w:p>
+    <w:p>
+      <w:pPr>
+        <w:pBdr>
+          <w:top w:val="single" w:sz="2" w:space="0" w:color="auto"/>
+          <w:left w:val="single" w:sz="2" w:space="0" w:color="auto"/>
+          <w:bottom w:val="single" w:sz="2" w:space="0" w:color="auto"/>
+          <w:right w:val="single" w:sz="2" w:space="0" w:color="auto"/>
+        </w:pBdr>
+        <w:shd w:val="clear" w:color="auto" w:fill="181818"/>
+        <w:spacing w:beforeAutospacing="1" w:after="0" w:afterAutospacing="1" w:line="330" w:lineRule="atLeast"/>
+        <w:rPr>
+          <w:rFonts w:ascii="Segoe UI" w:eastAsia="Times New Roman" w:hAnsi="Segoe UI" w:cs="Segoe UI"/>
+          <w:color w:val="FFFFFF"/>
+          <w:sz w:val="21"/>
+          <w:szCs w:val="21"/>
+          <w:lang w:eastAsia="pt-BR"/>
+        </w:rPr>
+      </w:pPr>
+      <w:r>
+        <w:rPr>
+          <w:rFonts w:ascii="Segoe UI" w:eastAsia="Times New Roman" w:hAnsi="Segoe UI" w:cs="Segoe UI"/>
+          <w:b/>
+          <w:bCs/>
+          <w:color w:val="FFFFFF"/>
+          <w:sz w:val="21"/>
+          <w:szCs w:val="21"/>
+          <w:bdr w:val="single" w:sz="2" w:space="0" w:color="auto" w:frame="1"/>
+          <w:lang w:eastAsia="pt-BR"/>
+        </w:rPr>
+        <w:t xml:space="preserve">Junior Python </w:t>
+      </w:r>
+      <w:proofErr w:type="spellStart"/>
+      <w:r>
+        <w:rPr>
+          <w:rFonts w:ascii="Segoe UI" w:eastAsia="Times New Roman" w:hAnsi="Segoe UI" w:cs="Segoe UI"/>
+          <w:b/>
+          <w:bCs/>
+          <w:color w:val="FFFFFF"/>
+          <w:sz w:val="21"/>
+          <w:szCs w:val="21"/>
+          <w:bdr w:val="single" w:sz="2" w:space="0" w:color="auto" w:frame="1"/>
+          <w:lang w:eastAsia="pt-BR"/>
+        </w:rPr>
+        <w:t>Developer</w:t>
+      </w:r>
+      <w:proofErr w:type="spellEnd"/>
+      <w:r>
+        <w:rPr>
+          <w:rFonts w:ascii="Segoe UI" w:eastAsia="Times New Roman" w:hAnsi="Segoe UI" w:cs="Segoe UI"/>
+          <w:color w:val="FFFFFF"/>
+          <w:sz w:val="21"/>
+          <w:szCs w:val="21"/>
+          <w:lang w:eastAsia="pt-BR"/>
+        </w:rPr>
+        <w:br/>
+        <w:t>Porque você cria funções, organiza arquivos e processa dados.</w:t>
+      </w:r>
+    </w:p>
+    <w:p>
+      <w:pPr>
+        <w:pBdr>
+          <w:top w:val="single" w:sz="2" w:space="0" w:color="auto"/>
+          <w:left w:val="single" w:sz="2" w:space="0" w:color="auto"/>
+          <w:bottom w:val="single" w:sz="2" w:space="0" w:color="auto"/>
+          <w:right w:val="single" w:sz="2" w:space="0" w:color="auto"/>
+        </w:pBdr>
+        <w:shd w:val="clear" w:color="auto" w:fill="181818"/>
+        <w:spacing w:beforeAutospacing="1" w:after="0" w:afterAutospacing="1" w:line="330" w:lineRule="atLeast"/>
+        <w:rPr>
+          <w:rFonts w:ascii="Segoe UI" w:eastAsia="Times New Roman" w:hAnsi="Segoe UI" w:cs="Segoe UI"/>
+          <w:color w:val="FFFFFF"/>
+          <w:sz w:val="21"/>
+          <w:szCs w:val="21"/>
+          <w:lang w:eastAsia="pt-BR"/>
+        </w:rPr>
+      </w:pPr>
+      <w:r>
+        <w:rPr>
+          <w:rFonts w:ascii="Segoe UI" w:eastAsia="Times New Roman" w:hAnsi="Segoe UI" w:cs="Segoe UI"/>
+          <w:b/>
+          <w:bCs/>
+          <w:color w:val="FFFFFF"/>
+          <w:sz w:val="21"/>
+          <w:szCs w:val="21"/>
+          <w:bdr w:val="single" w:sz="2" w:space="0" w:color="auto" w:frame="1"/>
+          <w:lang w:eastAsia="pt-BR"/>
+        </w:rPr>
+        <w:t xml:space="preserve">Business </w:t>
+      </w:r>
+      <w:proofErr w:type="spellStart"/>
+      <w:r>
+        <w:rPr>
+          <w:rFonts w:ascii="Segoe UI" w:eastAsia="Times New Roman" w:hAnsi="Segoe UI" w:cs="Segoe UI"/>
+          <w:b/>
+          <w:bCs/>
+          <w:color w:val="FFFFFF"/>
+          <w:sz w:val="21"/>
+          <w:szCs w:val="21"/>
+          <w:bdr w:val="single" w:sz="2" w:space="0" w:color="auto" w:frame="1"/>
+          <w:lang w:eastAsia="pt-BR"/>
+        </w:rPr>
+        <w:t>Intelligence</w:t>
+      </w:r>
+      <w:proofErr w:type="spellEnd"/>
+      <w:r>
+        <w:rPr>
+          <w:rFonts w:ascii="Segoe UI" w:eastAsia="Times New Roman" w:hAnsi="Segoe UI" w:cs="Segoe UI"/>
+          <w:color w:val="FFFFFF"/>
+          <w:sz w:val="21"/>
+          <w:szCs w:val="21"/>
+          <w:lang w:eastAsia="pt-BR"/>
+        </w:rPr>
+        <w:br/>
+        <w:t>Porque você cria resumo por mês/ano e gráficos.</w:t>
+      </w:r>
+    </w:p>
+    <w:p>
+      <w:pPr>
+        <w:pBdr>
+          <w:top w:val="single" w:sz="2" w:space="0" w:color="auto"/>
+          <w:left w:val="single" w:sz="2" w:space="0" w:color="auto"/>
+          <w:bottom w:val="single" w:sz="2" w:space="0" w:color="auto"/>
+          <w:right w:val="single" w:sz="2" w:space="0" w:color="auto"/>
+        </w:pBdr>
+        <w:shd w:val="clear" w:color="auto" w:fill="181818"/>
+        <w:spacing w:beforeAutospacing="1" w:after="0" w:afterAutospacing="1" w:line="330" w:lineRule="atLeast"/>
+        <w:rPr>
+          <w:rFonts w:ascii="Segoe UI" w:eastAsia="Times New Roman" w:hAnsi="Segoe UI" w:cs="Segoe UI"/>
+          <w:color w:val="FFFFFF"/>
+          <w:sz w:val="21"/>
+          <w:szCs w:val="21"/>
+          <w:lang w:eastAsia="pt-BR"/>
+        </w:rPr>
+      </w:pPr>
+      <w:r>
+        <w:rPr>
+          <w:rFonts w:ascii="Segoe UI" w:eastAsia="Times New Roman" w:hAnsi="Segoe UI" w:cs="Segoe UI"/>
+          <w:b/>
+          <w:bCs/>
+          <w:color w:val="FFFFFF"/>
+          <w:sz w:val="21"/>
+          <w:szCs w:val="21"/>
+          <w:bdr w:val="single" w:sz="2" w:space="0" w:color="auto" w:frame="1"/>
+          <w:lang w:eastAsia="pt-BR"/>
+        </w:rPr>
+        <w:t>AI/ML Future</w:t>
+      </w:r>
+      <w:r>
+        <w:rPr>
+          <w:rFonts w:ascii="Segoe UI" w:eastAsia="Times New Roman" w:hAnsi="Segoe UI" w:cs="Segoe UI"/>
+          <w:color w:val="FFFFFF"/>
+          <w:sz w:val="21"/>
+          <w:szCs w:val="21"/>
+          <w:lang w:eastAsia="pt-BR"/>
+        </w:rPr>
+        <w:br/>
+        <w:t>Porque depois o sistema pode classificar documentos e sugerir riscos automaticamente.</w:t>
+      </w:r>
+    </w:p>
+    <w:p>
+      <w:pPr>
+        <w:pBdr>
+          <w:top w:val="single" w:sz="2" w:space="0" w:color="auto"/>
+          <w:left w:val="single" w:sz="2" w:space="0" w:color="auto"/>
+          <w:bottom w:val="single" w:sz="2" w:space="0" w:color="auto"/>
+          <w:right w:val="single" w:sz="2" w:space="0" w:color="auto"/>
+        </w:pBdr>
+        <w:shd w:val="clear" w:color="auto" w:fill="181818"/>
+        <w:spacing w:beforeAutospacing="1" w:after="0" w:afterAutospacing="1" w:line="330" w:lineRule="atLeast"/>
+        <w:rPr>
+          <w:rFonts w:ascii="Segoe UI" w:eastAsia="Times New Roman" w:hAnsi="Segoe UI" w:cs="Segoe UI"/>
+          <w:color w:val="FFFFFF"/>
+          <w:sz w:val="21"/>
+          <w:szCs w:val="21"/>
+          <w:lang w:eastAsia="pt-BR"/>
+        </w:rPr>
+      </w:pPr>
+      <w:r>
+        <w:rPr>
+          <w:rFonts w:ascii="Segoe UI" w:eastAsia="Times New Roman" w:hAnsi="Segoe UI" w:cs="Segoe UI"/>
+          <w:b/>
+          <w:bCs/>
+          <w:color w:val="FFFFFF"/>
+          <w:sz w:val="21"/>
+          <w:szCs w:val="21"/>
+          <w:bdr w:val="single" w:sz="2" w:space="0" w:color="auto" w:frame="1"/>
+          <w:lang w:eastAsia="pt-BR"/>
+        </w:rPr>
+        <w:t xml:space="preserve">RPA / </w:t>
+      </w:r>
+      <w:proofErr w:type="spellStart"/>
+      <w:r>
+        <w:rPr>
+          <w:rFonts w:ascii="Segoe UI" w:eastAsia="Times New Roman" w:hAnsi="Segoe UI" w:cs="Segoe UI"/>
+          <w:b/>
+          <w:bCs/>
+          <w:color w:val="FFFFFF"/>
+          <w:sz w:val="21"/>
+          <w:szCs w:val="21"/>
+          <w:bdr w:val="single" w:sz="2" w:space="0" w:color="auto" w:frame="1"/>
+          <w:lang w:eastAsia="pt-BR"/>
+        </w:rPr>
+        <w:t>Operations</w:t>
+      </w:r>
+      <w:proofErr w:type="spellEnd"/>
+      <w:r>
+        <w:rPr>
+          <w:rFonts w:ascii="Segoe UI" w:eastAsia="Times New Roman" w:hAnsi="Segoe UI" w:cs="Segoe UI"/>
+          <w:b/>
+          <w:bCs/>
+          <w:color w:val="FFFFFF"/>
+          <w:sz w:val="21"/>
+          <w:szCs w:val="21"/>
+          <w:bdr w:val="single" w:sz="2" w:space="0" w:color="auto" w:frame="1"/>
+          <w:lang w:eastAsia="pt-BR"/>
+        </w:rPr>
+        <w:t xml:space="preserve"> Automation</w:t>
+      </w:r>
+      <w:r>
+        <w:rPr>
+          <w:rFonts w:ascii="Segoe UI" w:eastAsia="Times New Roman" w:hAnsi="Segoe UI" w:cs="Segoe UI"/>
+          <w:color w:val="FFFFFF"/>
+          <w:sz w:val="21"/>
+          <w:szCs w:val="21"/>
+          <w:lang w:eastAsia="pt-BR"/>
+        </w:rPr>
+        <w:br/>
+        <w:t>Porque automatiza um processo manual de empresa.</w:t>
+      </w:r>
+    </w:p>
+    <w:p>
+      <w:pPr>
+        <w:pBdr>
+          <w:top w:val="single" w:sz="2" w:space="0" w:color="auto"/>
+          <w:left w:val="single" w:sz="2" w:space="0" w:color="auto"/>
+          <w:bottom w:val="single" w:sz="2" w:space="0" w:color="auto"/>
+          <w:right w:val="single" w:sz="2" w:space="0" w:color="auto"/>
+        </w:pBdr>
+        <w:shd w:val="clear" w:color="auto" w:fill="181818"/>
+        <w:spacing w:before="100" w:beforeAutospacing="1" w:after="100" w:afterAutospacing="1" w:line="330" w:lineRule="atLeast"/>
+        <w:rPr>
+          <w:rFonts w:ascii="Segoe UI" w:eastAsia="Times New Roman" w:hAnsi="Segoe UI" w:cs="Segoe UI"/>
+          <w:color w:val="FFFFFF"/>
+          <w:sz w:val="21"/>
+          <w:szCs w:val="21"/>
+          <w:lang w:eastAsia="pt-BR"/>
+        </w:rPr>
+      </w:pPr>
+      <w:r>
+        <w:rPr>
+          <w:rFonts w:ascii="Segoe UI" w:eastAsia="Times New Roman" w:hAnsi="Segoe UI" w:cs="Segoe UI"/>
+          <w:color w:val="FFFFFF"/>
+          <w:sz w:val="21"/>
+          <w:szCs w:val="21"/>
+          <w:lang w:eastAsia="pt-BR"/>
+        </w:rPr>
+        <w:t>A frase para portfólio ficaria muito mais forte:</w:t>
+      </w:r>
+    </w:p>
+    <w:p>
+      <w:pPr>
+        <w:pBdr>
+          <w:top w:val="single" w:sz="2" w:space="0" w:color="auto"/>
+          <w:left w:val="single" w:sz="2" w:space="0" w:color="auto"/>
+          <w:bottom w:val="single" w:sz="2" w:space="0" w:color="auto"/>
+          <w:right w:val="single" w:sz="2" w:space="0" w:color="auto"/>
+        </w:pBdr>
+        <w:shd w:val="clear" w:color="auto" w:fill="181818"/>
+        <w:spacing w:after="120" w:line="330" w:lineRule="atLeast"/>
+        <w:rPr>
+          <w:rFonts w:ascii="Segoe UI" w:eastAsia="Times New Roman" w:hAnsi="Segoe UI" w:cs="Segoe UI"/>
+          <w:color w:val="FFFFFF"/>
+          <w:sz w:val="21"/>
+          <w:szCs w:val="21"/>
+          <w:lang w:val="en-US" w:eastAsia="pt-BR"/>
+        </w:rPr>
+      </w:pPr>
+      <w:proofErr w:type="gramStart"/>
+      <w:r>
+        <w:rPr>
+          <w:rFonts w:ascii="Segoe UI" w:eastAsia="Times New Roman" w:hAnsi="Segoe UI" w:cs="Segoe UI"/>
+          <w:color w:val="FFFFFF"/>
+          <w:sz w:val="21"/>
+          <w:szCs w:val="21"/>
+          <w:lang w:val="en-US" w:eastAsia="pt-BR"/>
+        </w:rPr>
+        <w:t>Built an intelligent document automation system that processes invoices, detects missing fields and risk, generates monthly business reports, and provides data-driven recommendations.</w:t>
+      </w:r>
+      <w:proofErr w:type="gramEnd"/>
     </w:p>
     <w:p>
       <w:pPr>

</xml_diff>

<commit_message>
20_BUSINESS RECOMMENDATION_The recommendation helps business decisions. add img
</commit_message>
<xml_diff>
--- a/Info_project/AI + ML + Automation + Data Project.docx
+++ b/Info_project/AI + ML + Automation + Data Project.docx
@@ -11068,6 +11068,65 @@
           <w:lang w:val="en-US"/>
         </w:rPr>
       </w:pPr>
+    </w:p>
+    <w:p>
+      <w:pPr>
+        <w:spacing w:line="240" w:lineRule="auto"/>
+        <w:rPr>
+          <w:lang w:val="en-US"/>
+        </w:rPr>
+      </w:pPr>
+      <w:r>
+        <w:rPr>
+          <w:lang w:val="en-US"/>
+        </w:rPr>
+        <w:t>The app reads the metrics.</w:t>
+      </w:r>
+    </w:p>
+    <w:p>
+      <w:pPr>
+        <w:spacing w:line="240" w:lineRule="auto"/>
+        <w:rPr>
+          <w:lang w:val="en-US"/>
+        </w:rPr>
+      </w:pPr>
+      <w:r>
+        <w:rPr>
+          <w:lang w:val="en-US"/>
+        </w:rPr>
+        <w:t>The app checks the percentage.</w:t>
+      </w:r>
+    </w:p>
+    <w:p>
+      <w:pPr>
+        <w:spacing w:line="240" w:lineRule="auto"/>
+        <w:rPr>
+          <w:lang w:val="en-US"/>
+        </w:rPr>
+      </w:pPr>
+      <w:r>
+        <w:rPr>
+          <w:lang w:val="en-US"/>
+        </w:rPr>
+        <w:t>The app creates a recommendation.</w:t>
+      </w:r>
+    </w:p>
+    <w:p>
+      <w:pPr>
+        <w:pBdr>
+          <w:bottom w:val="single" w:sz="12" w:space="1" w:color="auto"/>
+        </w:pBdr>
+        <w:spacing w:line="240" w:lineRule="auto"/>
+        <w:rPr>
+          <w:lang w:val="en-US"/>
+        </w:rPr>
+      </w:pPr>
+      <w:r>
+        <w:rPr>
+          <w:lang w:val="en-US"/>
+        </w:rPr>
+        <w:t>The recommendation helps business decisions.</w:t>
+      </w:r>
     </w:p>
     <w:p>
       <w:pPr>

</xml_diff>

<commit_message>
remov file not use and add inf_project
</commit_message>
<xml_diff>
--- a/Info_project/AI + ML + Automation + Data Project.docx
+++ b/Info_project/AI + ML + Automation + Data Project.docx
@@ -11132,19 +11132,853 @@
       <w:pPr>
         <w:spacing w:line="240" w:lineRule="auto"/>
         <w:rPr>
+          <w:rFonts w:ascii="Segoe UI" w:hAnsi="Segoe UI" w:cs="Segoe UI"/>
+          <w:color w:val="FFFFFF"/>
+          <w:sz w:val="21"/>
+          <w:szCs w:val="21"/>
+          <w:shd w:val="clear" w:color="auto" w:fill="181818"/>
+        </w:rPr>
+      </w:pPr>
+      <w:r>
+        <w:rPr>
+          <w:rFonts w:ascii="Segoe UI" w:hAnsi="Segoe UI" w:cs="Segoe UI"/>
+          <w:color w:val="FFFFFF"/>
+          <w:sz w:val="21"/>
+          <w:szCs w:val="21"/>
+          <w:shd w:val="clear" w:color="auto" w:fill="181818"/>
+        </w:rPr>
+        <w:t>Exemplo de estrutura futura:</w:t>
+      </w:r>
+    </w:p>
+    <w:p>
+      <w:pPr>
+        <w:spacing w:line="240" w:lineRule="auto"/>
+        <w:rPr>
+          <w:rFonts w:ascii="Segoe UI" w:hAnsi="Segoe UI" w:cs="Segoe UI"/>
+          <w:color w:val="FFFFFF"/>
+          <w:sz w:val="21"/>
+          <w:szCs w:val="21"/>
+          <w:shd w:val="clear" w:color="auto" w:fill="181818"/>
+        </w:rPr>
+      </w:pPr>
+    </w:p>
+    <w:p>
+      <w:pPr>
+        <w:spacing w:line="240" w:lineRule="auto"/>
+        <w:rPr>
+          <w:lang w:val="en-US"/>
+        </w:rPr>
+      </w:pPr>
+      <w:proofErr w:type="spellStart"/>
+      <w:proofErr w:type="gramStart"/>
+      <w:r>
+        <w:rPr>
+          <w:lang w:val="en-US"/>
+        </w:rPr>
+        <w:t>def</w:t>
+      </w:r>
+      <w:proofErr w:type="spellEnd"/>
+      <w:proofErr w:type="gramEnd"/>
+      <w:r>
+        <w:rPr>
+          <w:lang w:val="en-US"/>
+        </w:rPr>
+        <w:t xml:space="preserve"> </w:t>
+      </w:r>
+      <w:proofErr w:type="spellStart"/>
+      <w:r>
+        <w:rPr>
+          <w:lang w:val="en-US"/>
+        </w:rPr>
+        <w:t>load_invoice_data</w:t>
+      </w:r>
+      <w:proofErr w:type="spellEnd"/>
+      <w:r>
+        <w:rPr>
+          <w:lang w:val="en-US"/>
+        </w:rPr>
+        <w:t>():</w:t>
+      </w:r>
+      <w:r>
+        <w:rPr>
+          <w:lang w:val="en-US"/>
+        </w:rPr>
+        <w:t xml:space="preserve"> </w:t>
+      </w:r>
+      <w:r>
+        <w:rPr>
+          <w:lang w:val="en-US"/>
+        </w:rPr>
+        <w:t xml:space="preserve">    """Load invoice results from CSV."""</w:t>
+      </w:r>
+    </w:p>
+    <w:p>
+      <w:pPr>
+        <w:spacing w:line="240" w:lineRule="auto"/>
+        <w:rPr>
+          <w:lang w:val="en-US"/>
+        </w:rPr>
+      </w:pPr>
+      <w:r>
+        <w:rPr>
+          <w:lang w:val="en-US"/>
+        </w:rPr>
+        <w:lastRenderedPageBreak/>
+        <w:t xml:space="preserve">    ...</w:t>
+      </w:r>
+    </w:p>
+    <w:p>
+      <w:pPr>
+        <w:spacing w:line="240" w:lineRule="auto"/>
+        <w:rPr>
+          <w:lang w:val="en-US"/>
+        </w:rPr>
+      </w:pPr>
+    </w:p>
+    <w:p>
+      <w:pPr>
+        <w:spacing w:line="240" w:lineRule="auto"/>
+        <w:rPr>
+          <w:lang w:val="en-US"/>
+        </w:rPr>
+      </w:pPr>
+      <w:proofErr w:type="spellStart"/>
+      <w:proofErr w:type="gramStart"/>
+      <w:r>
+        <w:rPr>
+          <w:lang w:val="en-US"/>
+        </w:rPr>
+        <w:t>def</w:t>
+      </w:r>
+      <w:proofErr w:type="spellEnd"/>
+      <w:proofErr w:type="gramEnd"/>
+      <w:r>
+        <w:rPr>
+          <w:lang w:val="en-US"/>
+        </w:rPr>
+        <w:t xml:space="preserve"> </w:t>
+      </w:r>
+      <w:proofErr w:type="spellStart"/>
+      <w:r>
+        <w:rPr>
+          <w:lang w:val="en-US"/>
+        </w:rPr>
+        <w:t>add_date_columns</w:t>
+      </w:r>
+      <w:proofErr w:type="spellEnd"/>
+      <w:r>
+        <w:rPr>
+          <w:lang w:val="en-US"/>
+        </w:rPr>
+        <w:t>(</w:t>
+      </w:r>
+      <w:proofErr w:type="spellStart"/>
+      <w:r>
+        <w:rPr>
+          <w:lang w:val="en-US"/>
+        </w:rPr>
+        <w:t>df</w:t>
+      </w:r>
+      <w:proofErr w:type="spellEnd"/>
+      <w:r>
+        <w:rPr>
+          <w:lang w:val="en-US"/>
+        </w:rPr>
+        <w:t>):</w:t>
+      </w:r>
+      <w:r>
+        <w:rPr>
+          <w:lang w:val="en-US"/>
+        </w:rPr>
+        <w:t xml:space="preserve"> </w:t>
+      </w:r>
+      <w:r>
+        <w:rPr>
+          <w:lang w:val="en-US"/>
+        </w:rPr>
+        <w:t xml:space="preserve">    """Add year and month columns."""</w:t>
+      </w:r>
+    </w:p>
+    <w:p>
+      <w:pPr>
+        <w:spacing w:line="240" w:lineRule="auto"/>
+        <w:rPr>
+          <w:lang w:val="en-US"/>
+        </w:rPr>
+      </w:pPr>
+      <w:r>
+        <w:rPr>
+          <w:lang w:val="en-US"/>
+        </w:rPr>
+        <w:t xml:space="preserve">    ...</w:t>
+      </w:r>
+    </w:p>
+    <w:p>
+      <w:pPr>
+        <w:spacing w:line="240" w:lineRule="auto"/>
+        <w:rPr>
+          <w:lang w:val="en-US"/>
+        </w:rPr>
+      </w:pPr>
+      <w:proofErr w:type="spellStart"/>
+      <w:proofErr w:type="gramStart"/>
+      <w:r>
+        <w:rPr>
+          <w:lang w:val="en-US"/>
+        </w:rPr>
+        <w:t>def</w:t>
+      </w:r>
+      <w:proofErr w:type="spellEnd"/>
+      <w:proofErr w:type="gramEnd"/>
+      <w:r>
+        <w:rPr>
+          <w:lang w:val="en-US"/>
+        </w:rPr>
+        <w:t xml:space="preserve"> </w:t>
+      </w:r>
+      <w:proofErr w:type="spellStart"/>
+      <w:r>
+        <w:rPr>
+          <w:lang w:val="en-US"/>
+        </w:rPr>
+        <w:t>calculate_business_metrics</w:t>
+      </w:r>
+      <w:proofErr w:type="spellEnd"/>
+      <w:r>
+        <w:rPr>
+          <w:lang w:val="en-US"/>
+        </w:rPr>
+        <w:t>(</w:t>
+      </w:r>
+      <w:proofErr w:type="spellStart"/>
+      <w:r>
+        <w:rPr>
+          <w:lang w:val="en-US"/>
+        </w:rPr>
+        <w:t>df</w:t>
+      </w:r>
+      <w:proofErr w:type="spellEnd"/>
+      <w:r>
+        <w:rPr>
+          <w:lang w:val="en-US"/>
+        </w:rPr>
+        <w:t>):</w:t>
+      </w:r>
+      <w:r>
+        <w:rPr>
+          <w:lang w:val="en-US"/>
+        </w:rPr>
+        <w:t xml:space="preserve"> </w:t>
+      </w:r>
+      <w:r>
+        <w:rPr>
+          <w:lang w:val="en-US"/>
+        </w:rPr>
+        <w:t xml:space="preserve">    """Calculate business metrics."""</w:t>
+      </w:r>
+    </w:p>
+    <w:p>
+      <w:pPr>
+        <w:spacing w:line="240" w:lineRule="auto"/>
+        <w:rPr>
+          <w:lang w:val="en-US"/>
+        </w:rPr>
+      </w:pPr>
+      <w:r>
+        <w:rPr>
+          <w:lang w:val="en-US"/>
+        </w:rPr>
+        <w:t xml:space="preserve">    ...</w:t>
+      </w:r>
+    </w:p>
+    <w:p>
+      <w:pPr>
+        <w:spacing w:line="240" w:lineRule="auto"/>
+        <w:rPr>
+          <w:lang w:val="en-US"/>
+        </w:rPr>
+      </w:pPr>
+      <w:proofErr w:type="spellStart"/>
+      <w:proofErr w:type="gramStart"/>
+      <w:r>
+        <w:rPr>
+          <w:lang w:val="en-US"/>
+        </w:rPr>
+        <w:t>def</w:t>
+      </w:r>
+      <w:proofErr w:type="spellEnd"/>
+      <w:proofErr w:type="gramEnd"/>
+      <w:r>
+        <w:rPr>
+          <w:lang w:val="en-US"/>
+        </w:rPr>
+        <w:t xml:space="preserve"> </w:t>
+      </w:r>
+      <w:proofErr w:type="spellStart"/>
+      <w:r>
+        <w:rPr>
+          <w:lang w:val="en-US"/>
+        </w:rPr>
+        <w:t>create_monthly_summary</w:t>
+      </w:r>
+      <w:proofErr w:type="spellEnd"/>
+      <w:r>
+        <w:rPr>
+          <w:lang w:val="en-US"/>
+        </w:rPr>
+        <w:t>(</w:t>
+      </w:r>
+      <w:proofErr w:type="spellStart"/>
+      <w:r>
+        <w:rPr>
+          <w:lang w:val="en-US"/>
+        </w:rPr>
+        <w:t>df</w:t>
+      </w:r>
+      <w:proofErr w:type="spellEnd"/>
+      <w:r>
+        <w:rPr>
+          <w:lang w:val="en-US"/>
+        </w:rPr>
+        <w:t>):</w:t>
+      </w:r>
+      <w:r>
+        <w:rPr>
+          <w:lang w:val="en-US"/>
+        </w:rPr>
+        <w:t xml:space="preserve"> </w:t>
+      </w:r>
+      <w:r>
+        <w:rPr>
+          <w:lang w:val="en-US"/>
+        </w:rPr>
+        <w:t xml:space="preserve">    """Create monthly summary."""</w:t>
+      </w:r>
+    </w:p>
+    <w:p>
+      <w:pPr>
+        <w:spacing w:line="240" w:lineRule="auto"/>
+        <w:rPr>
+          <w:lang w:val="en-US"/>
+        </w:rPr>
+      </w:pPr>
+      <w:r>
+        <w:rPr>
+          <w:lang w:val="en-US"/>
+        </w:rPr>
+        <w:t xml:space="preserve">    ...</w:t>
+      </w:r>
+    </w:p>
+    <w:p>
+      <w:pPr>
+        <w:spacing w:line="240" w:lineRule="auto"/>
+        <w:rPr>
+          <w:lang w:val="en-US"/>
+        </w:rPr>
+      </w:pPr>
+      <w:proofErr w:type="spellStart"/>
+      <w:proofErr w:type="gramStart"/>
+      <w:r>
+        <w:rPr>
+          <w:lang w:val="en-US"/>
+        </w:rPr>
+        <w:t>def</w:t>
+      </w:r>
+      <w:proofErr w:type="spellEnd"/>
+      <w:proofErr w:type="gramEnd"/>
+      <w:r>
+        <w:rPr>
+          <w:lang w:val="en-US"/>
+        </w:rPr>
+        <w:t xml:space="preserve"> </w:t>
+      </w:r>
+      <w:proofErr w:type="spellStart"/>
+      <w:r>
+        <w:rPr>
+          <w:lang w:val="en-US"/>
+        </w:rPr>
+        <w:t>create_charts</w:t>
+      </w:r>
+      <w:proofErr w:type="spellEnd"/>
+      <w:r>
+        <w:rPr>
+          <w:lang w:val="en-US"/>
+        </w:rPr>
+        <w:t>(</w:t>
+      </w:r>
+      <w:proofErr w:type="spellStart"/>
+      <w:r>
+        <w:rPr>
+          <w:lang w:val="en-US"/>
+        </w:rPr>
+        <w:t>df</w:t>
+      </w:r>
+      <w:proofErr w:type="spellEnd"/>
+      <w:r>
+        <w:rPr>
+          <w:lang w:val="en-US"/>
+        </w:rPr>
+        <w:t xml:space="preserve">, </w:t>
+      </w:r>
+      <w:proofErr w:type="spellStart"/>
+      <w:r>
+        <w:rPr>
+          <w:lang w:val="en-US"/>
+        </w:rPr>
+        <w:t>status_counts</w:t>
+      </w:r>
+      <w:proofErr w:type="spellEnd"/>
+      <w:r>
+        <w:rPr>
+          <w:lang w:val="en-US"/>
+        </w:rPr>
+        <w:t>):</w:t>
+      </w:r>
+      <w:r>
+        <w:rPr>
+          <w:lang w:val="en-US"/>
+        </w:rPr>
+        <w:t xml:space="preserve"> </w:t>
+      </w:r>
+      <w:r>
+        <w:rPr>
+          <w:lang w:val="en-US"/>
+        </w:rPr>
+        <w:t xml:space="preserve">    """Create chart image files."""</w:t>
+      </w:r>
+    </w:p>
+    <w:p>
+      <w:pPr>
+        <w:spacing w:line="240" w:lineRule="auto"/>
+        <w:rPr>
+          <w:lang w:val="en-US"/>
+        </w:rPr>
+      </w:pPr>
+      <w:r>
+        <w:rPr>
+          <w:lang w:val="en-US"/>
+        </w:rPr>
+        <w:t xml:space="preserve">    ...</w:t>
+      </w:r>
+    </w:p>
+    <w:p>
+      <w:pPr>
+        <w:spacing w:line="240" w:lineRule="auto"/>
+        <w:rPr>
+          <w:lang w:val="en-US"/>
+        </w:rPr>
+      </w:pPr>
+      <w:proofErr w:type="spellStart"/>
+      <w:proofErr w:type="gramStart"/>
+      <w:r>
+        <w:rPr>
+          <w:lang w:val="en-US"/>
+        </w:rPr>
+        <w:t>def</w:t>
+      </w:r>
+      <w:proofErr w:type="spellEnd"/>
+      <w:proofErr w:type="gramEnd"/>
+      <w:r>
+        <w:rPr>
+          <w:lang w:val="en-US"/>
+        </w:rPr>
+        <w:t xml:space="preserve"> main():</w:t>
+      </w:r>
+      <w:r>
+        <w:rPr>
+          <w:lang w:val="en-US"/>
+        </w:rPr>
+        <w:t xml:space="preserve"> </w:t>
+      </w:r>
+    </w:p>
+    <w:p>
+      <w:pPr>
+        <w:spacing w:line="240" w:lineRule="auto"/>
+        <w:rPr>
+          <w:lang w:val="en-US"/>
+        </w:rPr>
+      </w:pPr>
+      <w:r>
+        <w:rPr>
+          <w:lang w:val="en-US"/>
+        </w:rPr>
+        <w:t xml:space="preserve">    """Run the data analysis workflow."""</w:t>
+      </w:r>
+    </w:p>
+    <w:p>
+      <w:pPr>
+        <w:spacing w:line="240" w:lineRule="auto"/>
+        <w:rPr>
+          <w:lang w:val="en-US"/>
+        </w:rPr>
+      </w:pPr>
+      <w:r>
+        <w:rPr>
+          <w:lang w:val="en-US"/>
+        </w:rPr>
+        <w:t xml:space="preserve">    </w:t>
+      </w:r>
+      <w:proofErr w:type="spellStart"/>
+      <w:proofErr w:type="gramStart"/>
+      <w:r>
+        <w:rPr>
+          <w:lang w:val="en-US"/>
+        </w:rPr>
+        <w:t>df</w:t>
+      </w:r>
+      <w:proofErr w:type="spellEnd"/>
+      <w:proofErr w:type="gramEnd"/>
+      <w:r>
+        <w:rPr>
+          <w:lang w:val="en-US"/>
+        </w:rPr>
+        <w:t xml:space="preserve"> = </w:t>
+      </w:r>
+      <w:proofErr w:type="spellStart"/>
+      <w:r>
+        <w:rPr>
+          <w:lang w:val="en-US"/>
+        </w:rPr>
+        <w:t>load_invoice_data</w:t>
+      </w:r>
+      <w:proofErr w:type="spellEnd"/>
+      <w:r>
+        <w:rPr>
+          <w:lang w:val="en-US"/>
+        </w:rPr>
+        <w:t>()</w:t>
+      </w:r>
+    </w:p>
+    <w:p>
+      <w:pPr>
+        <w:spacing w:line="240" w:lineRule="auto"/>
+        <w:rPr>
+          <w:lang w:val="en-US"/>
+        </w:rPr>
+      </w:pPr>
+      <w:r>
+        <w:rPr>
+          <w:lang w:val="en-US"/>
+        </w:rPr>
+        <w:t xml:space="preserve">    </w:t>
+      </w:r>
+      <w:proofErr w:type="spellStart"/>
+      <w:proofErr w:type="gramStart"/>
+      <w:r>
+        <w:rPr>
+          <w:lang w:val="en-US"/>
+        </w:rPr>
+        <w:t>df</w:t>
+      </w:r>
+      <w:proofErr w:type="spellEnd"/>
+      <w:proofErr w:type="gramEnd"/>
+      <w:r>
+        <w:rPr>
+          <w:lang w:val="en-US"/>
+        </w:rPr>
+        <w:t xml:space="preserve"> = </w:t>
+      </w:r>
+      <w:proofErr w:type="spellStart"/>
+      <w:r>
+        <w:rPr>
+          <w:lang w:val="en-US"/>
+        </w:rPr>
+        <w:t>add_date_columns</w:t>
+      </w:r>
+      <w:proofErr w:type="spellEnd"/>
+      <w:r>
+        <w:rPr>
+          <w:lang w:val="en-US"/>
+        </w:rPr>
+        <w:t>(</w:t>
+      </w:r>
+      <w:proofErr w:type="spellStart"/>
+      <w:r>
+        <w:rPr>
+          <w:lang w:val="en-US"/>
+        </w:rPr>
+        <w:t>df</w:t>
+      </w:r>
+      <w:proofErr w:type="spellEnd"/>
+      <w:r>
+        <w:rPr>
+          <w:lang w:val="en-US"/>
+        </w:rPr>
+        <w:t>)</w:t>
+      </w:r>
+    </w:p>
+    <w:p>
+      <w:pPr>
+        <w:spacing w:line="240" w:lineRule="auto"/>
+        <w:rPr>
+          <w:lang w:val="en-US"/>
+        </w:rPr>
+      </w:pPr>
+      <w:r>
+        <w:rPr>
+          <w:lang w:val="en-US"/>
+        </w:rPr>
+        <w:t xml:space="preserve">    </w:t>
+      </w:r>
+      <w:proofErr w:type="gramStart"/>
+      <w:r>
+        <w:rPr>
+          <w:lang w:val="en-US"/>
+        </w:rPr>
+        <w:t>metrics</w:t>
+      </w:r>
+      <w:proofErr w:type="gramEnd"/>
+      <w:r>
+        <w:rPr>
+          <w:lang w:val="en-US"/>
+        </w:rPr>
+        <w:t xml:space="preserve"> = </w:t>
+      </w:r>
+      <w:proofErr w:type="spellStart"/>
+      <w:r>
+        <w:rPr>
+          <w:lang w:val="en-US"/>
+        </w:rPr>
+        <w:t>calculate_business_metrics</w:t>
+      </w:r>
+      <w:proofErr w:type="spellEnd"/>
+      <w:r>
+        <w:rPr>
+          <w:lang w:val="en-US"/>
+        </w:rPr>
+        <w:t>(</w:t>
+      </w:r>
+      <w:proofErr w:type="spellStart"/>
+      <w:r>
+        <w:rPr>
+          <w:lang w:val="en-US"/>
+        </w:rPr>
+        <w:t>df</w:t>
+      </w:r>
+      <w:proofErr w:type="spellEnd"/>
+      <w:r>
+        <w:rPr>
+          <w:lang w:val="en-US"/>
+        </w:rPr>
+        <w:t>)</w:t>
+      </w:r>
+    </w:p>
+    <w:p>
+      <w:pPr>
+        <w:spacing w:line="240" w:lineRule="auto"/>
+        <w:rPr>
+          <w:lang w:val="en-US"/>
+        </w:rPr>
+      </w:pPr>
+      <w:r>
+        <w:rPr>
+          <w:lang w:val="en-US"/>
+        </w:rPr>
+        <w:t xml:space="preserve">    </w:t>
+      </w:r>
+      <w:proofErr w:type="spellStart"/>
+      <w:r>
+        <w:rPr>
+          <w:lang w:val="en-US"/>
+        </w:rPr>
+        <w:t>monthly_summary</w:t>
+      </w:r>
+      <w:proofErr w:type="spellEnd"/>
+      <w:r>
+        <w:rPr>
+          <w:lang w:val="en-US"/>
+        </w:rPr>
+        <w:t xml:space="preserve"> = </w:t>
+      </w:r>
+      <w:proofErr w:type="spellStart"/>
+      <w:r>
+        <w:rPr>
+          <w:lang w:val="en-US"/>
+        </w:rPr>
+        <w:t>create_monthly_</w:t>
+      </w:r>
+      <w:proofErr w:type="gramStart"/>
+      <w:r>
+        <w:rPr>
+          <w:lang w:val="en-US"/>
+        </w:rPr>
+        <w:t>summary</w:t>
+      </w:r>
+      <w:proofErr w:type="spellEnd"/>
+      <w:r>
+        <w:rPr>
+          <w:lang w:val="en-US"/>
+        </w:rPr>
+        <w:t>(</w:t>
+      </w:r>
+      <w:proofErr w:type="spellStart"/>
+      <w:proofErr w:type="gramEnd"/>
+      <w:r>
+        <w:rPr>
+          <w:lang w:val="en-US"/>
+        </w:rPr>
+        <w:t>df</w:t>
+      </w:r>
+      <w:proofErr w:type="spellEnd"/>
+      <w:r>
+        <w:rPr>
+          <w:lang w:val="en-US"/>
+        </w:rPr>
+        <w:t>)</w:t>
+      </w:r>
+    </w:p>
+    <w:p>
+      <w:pPr>
+        <w:spacing w:line="240" w:lineRule="auto"/>
+        <w:rPr>
+          <w:lang w:val="en-US"/>
+        </w:rPr>
+      </w:pPr>
+      <w:r>
+        <w:rPr>
+          <w:lang w:val="en-US"/>
+        </w:rPr>
+        <w:t xml:space="preserve">    </w:t>
+      </w:r>
+      <w:proofErr w:type="spellStart"/>
+      <w:r>
+        <w:rPr>
+          <w:lang w:val="en-US"/>
+        </w:rPr>
+        <w:t>create_</w:t>
+      </w:r>
+      <w:proofErr w:type="gramStart"/>
+      <w:r>
+        <w:rPr>
+          <w:lang w:val="en-US"/>
+        </w:rPr>
+        <w:t>charts</w:t>
+      </w:r>
+      <w:proofErr w:type="spellEnd"/>
+      <w:r>
+        <w:rPr>
+          <w:lang w:val="en-US"/>
+        </w:rPr>
+        <w:t>(</w:t>
+      </w:r>
+      <w:proofErr w:type="spellStart"/>
+      <w:proofErr w:type="gramEnd"/>
+      <w:r>
+        <w:rPr>
+          <w:lang w:val="en-US"/>
+        </w:rPr>
+        <w:t>df</w:t>
+      </w:r>
+      <w:proofErr w:type="spellEnd"/>
+      <w:r>
+        <w:rPr>
+          <w:lang w:val="en-US"/>
+        </w:rPr>
+        <w:t>, metrics["</w:t>
+      </w:r>
+      <w:proofErr w:type="spellStart"/>
+      <w:r>
+        <w:rPr>
+          <w:lang w:val="en-US"/>
+        </w:rPr>
+        <w:t>status_counts</w:t>
+      </w:r>
+      <w:proofErr w:type="spellEnd"/>
+      <w:r>
+        <w:rPr>
+          <w:lang w:val="en-US"/>
+        </w:rPr>
+        <w:t>"])</w:t>
+      </w:r>
+    </w:p>
+    <w:p>
+      <w:pPr>
+        <w:spacing w:line="240" w:lineRule="auto"/>
+        <w:rPr>
+          <w:lang w:val="en-US"/>
+        </w:rPr>
+      </w:pPr>
+    </w:p>
+    <w:p>
+      <w:pPr>
+        <w:spacing w:line="240" w:lineRule="auto"/>
+        <w:rPr>
+          <w:b/>
+          <w:color w:val="FF0000"/>
+          <w:lang w:val="en-US"/>
+        </w:rPr>
+      </w:pPr>
+      <w:r>
+        <w:rPr>
+          <w:b/>
+          <w:color w:val="FF0000"/>
+          <w:lang w:val="en-US"/>
+        </w:rPr>
+        <w:t>Functions organize the code.</w:t>
+      </w:r>
+      <w:r>
+        <w:rPr>
+          <w:b/>
+          <w:color w:val="FF0000"/>
+          <w:lang w:val="en-US"/>
+        </w:rPr>
+        <w:t xml:space="preserve"> </w:t>
+      </w:r>
+      <w:proofErr w:type="gramStart"/>
+      <w:r>
+        <w:rPr>
+          <w:b/>
+          <w:color w:val="FF0000"/>
+          <w:lang w:val="en-US"/>
+        </w:rPr>
+        <w:t>main</w:t>
+      </w:r>
+      <w:proofErr w:type="gramEnd"/>
+      <w:r>
+        <w:rPr>
+          <w:b/>
+          <w:color w:val="FF0000"/>
+          <w:lang w:val="en-US"/>
+        </w:rPr>
+        <w:t xml:space="preserve"> controls the workflow.</w:t>
+      </w:r>
+      <w:r>
+        <w:rPr>
+          <w:b/>
+          <w:color w:val="FF0000"/>
+          <w:lang w:val="en-US"/>
+        </w:rPr>
+        <w:t xml:space="preserve"> </w:t>
+      </w:r>
+      <w:r>
+        <w:rPr>
+          <w:b/>
+          <w:color w:val="FF0000"/>
+          <w:lang w:val="en-US"/>
+        </w:rPr>
+        <w:t>This makes the project easier to change.</w:t>
+      </w:r>
+    </w:p>
+    <w:p>
+      <w:pPr>
+        <w:pBdr>
+          <w:bottom w:val="single" w:sz="12" w:space="1" w:color="auto"/>
+        </w:pBdr>
+        <w:spacing w:line="240" w:lineRule="auto"/>
+        <w:rPr>
+          <w:lang w:val="en-US"/>
+        </w:rPr>
+      </w:pPr>
+    </w:p>
+    <w:p>
+      <w:pPr>
+        <w:spacing w:line="240" w:lineRule="auto"/>
+        <w:rPr>
           <w:lang w:val="en-US"/>
         </w:rPr>
       </w:pPr>
       <w:bookmarkStart w:id="0" w:name="_GoBack"/>
       <w:bookmarkEnd w:id="0"/>
-    </w:p>
-    <w:p>
-      <w:pPr>
-        <w:spacing w:line="240" w:lineRule="auto"/>
-        <w:rPr>
-          <w:lang w:val="en-US"/>
-        </w:rPr>
-      </w:pPr>
     </w:p>
     <w:sectPr>
       <w:pgSz w:w="11906" w:h="16838"/>

</xml_diff>

<commit_message>
add /services and file services is a Python package. __init__.py and services/document_loader.py
</commit_message>
<xml_diff>
--- a/Info_project/AI + ML + Automation + Data Project.docx
+++ b/Info_project/AI + ML + Automation + Data Project.docx
@@ -6800,57 +6800,23 @@
       </w:r>
       <w:proofErr w:type="gramEnd"/>
       <w:r>
-        <w:t xml:space="preserve"> de 50 = precisa revisão</w:t>
-      </w:r>
-      <w:r>
-        <w:t xml:space="preserve"> / </w:t>
-      </w:r>
-      <w:r>
-        <w:t>50 ou mais = alto risco</w:t>
-      </w:r>
-    </w:p>
-    <w:p>
-      <w:pPr>
-        <w:spacing w:line="240" w:lineRule="auto"/>
-        <w:rPr>
-          <w:b/>
-          <w:lang w:val="en-US"/>
-        </w:rPr>
-      </w:pPr>
-      <w:r>
-        <w:rPr>
-          <w:b/>
-          <w:lang w:val="en-US"/>
-        </w:rPr>
-        <w:t>Now the app stores results in memory.</w:t>
-      </w:r>
-      <w:r>
-        <w:rPr>
-          <w:b/>
-          <w:lang w:val="en-US"/>
-        </w:rPr>
-        <w:t xml:space="preserve"> / </w:t>
-      </w:r>
-      <w:r>
-        <w:rPr>
-          <w:b/>
-          <w:lang w:val="en-US"/>
-        </w:rPr>
-        <w:t>Later the app will store results in a database.</w:t>
-      </w:r>
-      <w:r>
-        <w:rPr>
-          <w:b/>
-          <w:lang w:val="en-US"/>
-        </w:rPr>
-        <w:t xml:space="preserve"> / </w:t>
-      </w:r>
-      <w:r>
-        <w:rPr>
-          <w:b/>
-          <w:lang w:val="en-US"/>
-        </w:rPr>
-        <w:t>Memory is temporary.</w:t>
+        <w:t xml:space="preserve"> de 50 = precisa revisão / 50 ou mais = alto risco</w:t>
+      </w:r>
+    </w:p>
+    <w:p>
+      <w:pPr>
+        <w:spacing w:line="240" w:lineRule="auto"/>
+        <w:rPr>
+          <w:b/>
+          <w:lang w:val="en-US"/>
+        </w:rPr>
+      </w:pPr>
+      <w:r>
+        <w:rPr>
+          <w:b/>
+          <w:lang w:val="en-US"/>
+        </w:rPr>
+        <w:t>Now the app stores results in memory. / Later the app will store results in a database. / Memory is temporary.</w:t>
       </w:r>
     </w:p>
     <w:p>
@@ -8645,67 +8611,43 @@
           <w:color w:val="FF0000"/>
           <w:lang w:val="en-US"/>
         </w:rPr>
-        <w:t xml:space="preserve"> the CSV file.</w:t>
-      </w:r>
+        <w:t xml:space="preserve"> the CSV file. </w:t>
+      </w:r>
+      <w:proofErr w:type="gramStart"/>
       <w:r>
         <w:rPr>
           <w:b/>
           <w:color w:val="FF0000"/>
           <w:lang w:val="en-US"/>
         </w:rPr>
-        <w:t xml:space="preserve"> </w:t>
-      </w:r>
-      <w:proofErr w:type="gramStart"/>
+        <w:t>Pandas creates</w:t>
+      </w:r>
+      <w:proofErr w:type="gramEnd"/>
       <w:r>
         <w:rPr>
           <w:b/>
           <w:color w:val="FF0000"/>
           <w:lang w:val="en-US"/>
         </w:rPr>
-        <w:t>Pandas creates</w:t>
-      </w:r>
-      <w:proofErr w:type="gramEnd"/>
+        <w:t xml:space="preserve"> a </w:t>
+      </w:r>
+      <w:proofErr w:type="spellStart"/>
       <w:r>
         <w:rPr>
           <w:b/>
           <w:color w:val="FF0000"/>
           <w:lang w:val="en-US"/>
         </w:rPr>
-        <w:t xml:space="preserve"> a </w:t>
-      </w:r>
-      <w:proofErr w:type="spellStart"/>
+        <w:t>DataFrame</w:t>
+      </w:r>
+      <w:proofErr w:type="spellEnd"/>
       <w:r>
         <w:rPr>
           <w:b/>
           <w:color w:val="FF0000"/>
           <w:lang w:val="en-US"/>
         </w:rPr>
-        <w:t>DataFrame</w:t>
-      </w:r>
-      <w:proofErr w:type="spellEnd"/>
-      <w:r>
-        <w:rPr>
-          <w:b/>
-          <w:color w:val="FF0000"/>
-          <w:lang w:val="en-US"/>
-        </w:rPr>
-        <w:t>.</w:t>
-      </w:r>
-      <w:r>
-        <w:rPr>
-          <w:b/>
-          <w:color w:val="FF0000"/>
-          <w:lang w:val="en-US"/>
-        </w:rPr>
-        <w:t xml:space="preserve"> </w:t>
-      </w:r>
-      <w:r>
-        <w:rPr>
-          <w:b/>
-          <w:color w:val="FF0000"/>
-          <w:lang w:val="en-US"/>
-        </w:rPr>
-        <w:t xml:space="preserve">A </w:t>
+        <w:t xml:space="preserve">. A </w:t>
       </w:r>
       <w:proofErr w:type="spellStart"/>
       <w:r>
@@ -11914,49 +11856,25 @@
           <w:color w:val="FF0000"/>
           <w:lang w:val="en-US"/>
         </w:rPr>
-        <w:t>Functions organize the code.</w:t>
-      </w:r>
+        <w:t xml:space="preserve">Functions organize the code. </w:t>
+      </w:r>
+      <w:proofErr w:type="gramStart"/>
       <w:r>
         <w:rPr>
           <w:b/>
           <w:color w:val="FF0000"/>
           <w:lang w:val="en-US"/>
         </w:rPr>
-        <w:t xml:space="preserve"> </w:t>
-      </w:r>
-      <w:proofErr w:type="gramStart"/>
+        <w:t>main</w:t>
+      </w:r>
+      <w:proofErr w:type="gramEnd"/>
       <w:r>
         <w:rPr>
           <w:b/>
           <w:color w:val="FF0000"/>
           <w:lang w:val="en-US"/>
         </w:rPr>
-        <w:t>main</w:t>
-      </w:r>
-      <w:proofErr w:type="gramEnd"/>
-      <w:r>
-        <w:rPr>
-          <w:b/>
-          <w:color w:val="FF0000"/>
-          <w:lang w:val="en-US"/>
-        </w:rPr>
-        <w:t xml:space="preserve"> controls the workflow.</w:t>
-      </w:r>
-      <w:r>
-        <w:rPr>
-          <w:b/>
-          <w:color w:val="FF0000"/>
-          <w:lang w:val="en-US"/>
-        </w:rPr>
-        <w:t xml:space="preserve"> </w:t>
-      </w:r>
-      <w:r>
-        <w:rPr>
-          <w:b/>
-          <w:color w:val="FF0000"/>
-          <w:lang w:val="en-US"/>
-        </w:rPr>
-        <w:t>This makes the project easier to change.</w:t>
+        <w:t xml:space="preserve"> controls the workflow. This makes the project easier to change.</w:t>
       </w:r>
     </w:p>
     <w:p>
@@ -11976,6 +11894,1482 @@
         <w:rPr>
           <w:lang w:val="en-US"/>
         </w:rPr>
+      </w:pPr>
+      <w:r>
+        <w:rPr>
+          <w:lang w:val="en-US"/>
+        </w:rPr>
+        <w:t>E o invoice_data_analysis.py </w:t>
+      </w:r>
+      <w:proofErr w:type="spellStart"/>
+      <w:r>
+        <w:rPr>
+          <w:lang w:val="en-US"/>
+        </w:rPr>
+        <w:t>vira</w:t>
+      </w:r>
+      <w:proofErr w:type="spellEnd"/>
+      <w:r>
+        <w:rPr>
+          <w:lang w:val="en-US"/>
+        </w:rPr>
+        <w:t xml:space="preserve"> </w:t>
+      </w:r>
+      <w:proofErr w:type="spellStart"/>
+      <w:r>
+        <w:rPr>
+          <w:lang w:val="en-US"/>
+        </w:rPr>
+        <w:t>só</w:t>
+      </w:r>
+      <w:proofErr w:type="spellEnd"/>
+      <w:r>
+        <w:rPr>
+          <w:lang w:val="en-US"/>
+        </w:rPr>
+        <w:t xml:space="preserve"> o </w:t>
+      </w:r>
+      <w:proofErr w:type="spellStart"/>
+      <w:r>
+        <w:rPr>
+          <w:lang w:val="en-US"/>
+        </w:rPr>
+        <w:t>controlador</w:t>
+      </w:r>
+      <w:proofErr w:type="spellEnd"/>
+      <w:r>
+        <w:rPr>
+          <w:lang w:val="en-US"/>
+        </w:rPr>
+        <w:t>:</w:t>
+      </w:r>
+    </w:p>
+    <w:p>
+      <w:pPr>
+        <w:spacing w:line="240" w:lineRule="auto"/>
+        <w:rPr>
+          <w:lang w:val="en-US"/>
+        </w:rPr>
+      </w:pPr>
+      <w:proofErr w:type="gramStart"/>
+      <w:r>
+        <w:rPr>
+          <w:lang w:val="en-US"/>
+        </w:rPr>
+        <w:t>from</w:t>
+      </w:r>
+      <w:proofErr w:type="gramEnd"/>
+      <w:r>
+        <w:rPr>
+          <w:lang w:val="en-US"/>
+        </w:rPr>
+        <w:t xml:space="preserve"> </w:t>
+      </w:r>
+      <w:proofErr w:type="spellStart"/>
+      <w:r>
+        <w:rPr>
+          <w:lang w:val="en-US"/>
+        </w:rPr>
+        <w:t>services.data_loader</w:t>
+      </w:r>
+      <w:proofErr w:type="spellEnd"/>
+      <w:r>
+        <w:rPr>
+          <w:lang w:val="en-US"/>
+        </w:rPr>
+        <w:t xml:space="preserve"> import </w:t>
+      </w:r>
+      <w:proofErr w:type="spellStart"/>
+      <w:r>
+        <w:rPr>
+          <w:lang w:val="en-US"/>
+        </w:rPr>
+        <w:t>load_invoice_data</w:t>
+      </w:r>
+      <w:proofErr w:type="spellEnd"/>
+      <w:r>
+        <w:rPr>
+          <w:lang w:val="en-US"/>
+        </w:rPr>
+        <w:t xml:space="preserve">, </w:t>
+      </w:r>
+      <w:proofErr w:type="spellStart"/>
+      <w:r>
+        <w:rPr>
+          <w:lang w:val="en-US"/>
+        </w:rPr>
+        <w:t>add_date_columns</w:t>
+      </w:r>
+      <w:proofErr w:type="spellEnd"/>
+    </w:p>
+    <w:p>
+      <w:pPr>
+        <w:spacing w:line="240" w:lineRule="auto"/>
+        <w:rPr>
+          <w:lang w:val="en-US"/>
+        </w:rPr>
+      </w:pPr>
+      <w:proofErr w:type="gramStart"/>
+      <w:r>
+        <w:rPr>
+          <w:lang w:val="en-US"/>
+        </w:rPr>
+        <w:t>from</w:t>
+      </w:r>
+      <w:proofErr w:type="gramEnd"/>
+      <w:r>
+        <w:rPr>
+          <w:lang w:val="en-US"/>
+        </w:rPr>
+        <w:t xml:space="preserve"> </w:t>
+      </w:r>
+      <w:proofErr w:type="spellStart"/>
+      <w:r>
+        <w:rPr>
+          <w:lang w:val="en-US"/>
+        </w:rPr>
+        <w:t>services.metrics</w:t>
+      </w:r>
+      <w:proofErr w:type="spellEnd"/>
+      <w:r>
+        <w:rPr>
+          <w:lang w:val="en-US"/>
+        </w:rPr>
+        <w:t xml:space="preserve"> import </w:t>
+      </w:r>
+      <w:proofErr w:type="spellStart"/>
+      <w:r>
+        <w:rPr>
+          <w:lang w:val="en-US"/>
+        </w:rPr>
+        <w:t>calculate_status_counts</w:t>
+      </w:r>
+      <w:proofErr w:type="spellEnd"/>
+      <w:r>
+        <w:rPr>
+          <w:lang w:val="en-US"/>
+        </w:rPr>
+        <w:t xml:space="preserve">, </w:t>
+      </w:r>
+      <w:proofErr w:type="spellStart"/>
+      <w:r>
+        <w:rPr>
+          <w:lang w:val="en-US"/>
+        </w:rPr>
+        <w:t>calculate_business_metrics</w:t>
+      </w:r>
+      <w:proofErr w:type="spellEnd"/>
+    </w:p>
+    <w:p>
+      <w:pPr>
+        <w:spacing w:line="240" w:lineRule="auto"/>
+        <w:rPr>
+          <w:lang w:val="en-US"/>
+        </w:rPr>
+      </w:pPr>
+      <w:proofErr w:type="gramStart"/>
+      <w:r>
+        <w:rPr>
+          <w:lang w:val="en-US"/>
+        </w:rPr>
+        <w:t>from</w:t>
+      </w:r>
+      <w:proofErr w:type="gramEnd"/>
+      <w:r>
+        <w:rPr>
+          <w:lang w:val="en-US"/>
+        </w:rPr>
+        <w:t xml:space="preserve"> </w:t>
+      </w:r>
+      <w:proofErr w:type="spellStart"/>
+      <w:r>
+        <w:rPr>
+          <w:lang w:val="en-US"/>
+        </w:rPr>
+        <w:t>services.recommendations</w:t>
+      </w:r>
+      <w:proofErr w:type="spellEnd"/>
+      <w:r>
+        <w:rPr>
+          <w:lang w:val="en-US"/>
+        </w:rPr>
+        <w:t xml:space="preserve"> import </w:t>
+      </w:r>
+      <w:proofErr w:type="spellStart"/>
+      <w:r>
+        <w:rPr>
+          <w:lang w:val="en-US"/>
+        </w:rPr>
+        <w:t>create_recommendation</w:t>
+      </w:r>
+      <w:proofErr w:type="spellEnd"/>
+    </w:p>
+    <w:p>
+      <w:pPr>
+        <w:spacing w:line="240" w:lineRule="auto"/>
+        <w:rPr>
+          <w:lang w:val="en-US"/>
+        </w:rPr>
+      </w:pPr>
+      <w:proofErr w:type="gramStart"/>
+      <w:r>
+        <w:rPr>
+          <w:lang w:val="en-US"/>
+        </w:rPr>
+        <w:t>from</w:t>
+      </w:r>
+      <w:proofErr w:type="gramEnd"/>
+      <w:r>
+        <w:rPr>
+          <w:lang w:val="en-US"/>
+        </w:rPr>
+        <w:t xml:space="preserve"> </w:t>
+      </w:r>
+      <w:proofErr w:type="spellStart"/>
+      <w:r>
+        <w:rPr>
+          <w:lang w:val="en-US"/>
+        </w:rPr>
+        <w:t>services.summaries</w:t>
+      </w:r>
+      <w:proofErr w:type="spellEnd"/>
+      <w:r>
+        <w:rPr>
+          <w:lang w:val="en-US"/>
+        </w:rPr>
+        <w:t xml:space="preserve"> import </w:t>
+      </w:r>
+      <w:proofErr w:type="spellStart"/>
+      <w:r>
+        <w:rPr>
+          <w:lang w:val="en-US"/>
+        </w:rPr>
+        <w:t>create_monthly_summary</w:t>
+      </w:r>
+      <w:proofErr w:type="spellEnd"/>
+      <w:r>
+        <w:rPr>
+          <w:lang w:val="en-US"/>
+        </w:rPr>
+        <w:t xml:space="preserve">, </w:t>
+      </w:r>
+      <w:proofErr w:type="spellStart"/>
+      <w:r>
+        <w:rPr>
+          <w:lang w:val="en-US"/>
+        </w:rPr>
+        <w:t>create_monthly_status_summary</w:t>
+      </w:r>
+      <w:proofErr w:type="spellEnd"/>
+    </w:p>
+    <w:p>
+      <w:pPr>
+        <w:spacing w:line="240" w:lineRule="auto"/>
+        <w:rPr>
+          <w:lang w:val="en-US"/>
+        </w:rPr>
+      </w:pPr>
+      <w:proofErr w:type="gramStart"/>
+      <w:r>
+        <w:rPr>
+          <w:lang w:val="en-US"/>
+        </w:rPr>
+        <w:t>from</w:t>
+      </w:r>
+      <w:proofErr w:type="gramEnd"/>
+      <w:r>
+        <w:rPr>
+          <w:lang w:val="en-US"/>
+        </w:rPr>
+        <w:t xml:space="preserve"> </w:t>
+      </w:r>
+      <w:proofErr w:type="spellStart"/>
+      <w:r>
+        <w:rPr>
+          <w:lang w:val="en-US"/>
+        </w:rPr>
+        <w:t>services.exporters</w:t>
+      </w:r>
+      <w:proofErr w:type="spellEnd"/>
+      <w:r>
+        <w:rPr>
+          <w:lang w:val="en-US"/>
+        </w:rPr>
+        <w:t xml:space="preserve"> import </w:t>
+      </w:r>
+      <w:proofErr w:type="spellStart"/>
+      <w:r>
+        <w:rPr>
+          <w:lang w:val="en-US"/>
+        </w:rPr>
+        <w:t>save_monthly_reports</w:t>
+      </w:r>
+      <w:proofErr w:type="spellEnd"/>
+      <w:r>
+        <w:rPr>
+          <w:lang w:val="en-US"/>
+        </w:rPr>
+        <w:t xml:space="preserve">, </w:t>
+      </w:r>
+      <w:proofErr w:type="spellStart"/>
+      <w:r>
+        <w:rPr>
+          <w:lang w:val="en-US"/>
+        </w:rPr>
+        <w:t>save_summary_files</w:t>
+      </w:r>
+      <w:proofErr w:type="spellEnd"/>
+    </w:p>
+    <w:p>
+      <w:pPr>
+        <w:spacing w:line="240" w:lineRule="auto"/>
+        <w:rPr>
+          <w:lang w:val="en-US"/>
+        </w:rPr>
+      </w:pPr>
+      <w:proofErr w:type="gramStart"/>
+      <w:r>
+        <w:rPr>
+          <w:lang w:val="en-US"/>
+        </w:rPr>
+        <w:t>from</w:t>
+      </w:r>
+      <w:proofErr w:type="gramEnd"/>
+      <w:r>
+        <w:rPr>
+          <w:lang w:val="en-US"/>
+        </w:rPr>
+        <w:t xml:space="preserve"> </w:t>
+      </w:r>
+      <w:proofErr w:type="spellStart"/>
+      <w:r>
+        <w:rPr>
+          <w:lang w:val="en-US"/>
+        </w:rPr>
+        <w:t>services.charts</w:t>
+      </w:r>
+      <w:proofErr w:type="spellEnd"/>
+      <w:r>
+        <w:rPr>
+          <w:lang w:val="en-US"/>
+        </w:rPr>
+        <w:t xml:space="preserve"> import </w:t>
+      </w:r>
+      <w:proofErr w:type="spellStart"/>
+      <w:r>
+        <w:rPr>
+          <w:lang w:val="en-US"/>
+        </w:rPr>
+        <w:t>create_status_chart</w:t>
+      </w:r>
+      <w:proofErr w:type="spellEnd"/>
+      <w:r>
+        <w:rPr>
+          <w:lang w:val="en-US"/>
+        </w:rPr>
+        <w:t xml:space="preserve">, </w:t>
+      </w:r>
+      <w:proofErr w:type="spellStart"/>
+      <w:r>
+        <w:rPr>
+          <w:lang w:val="en-US"/>
+        </w:rPr>
+        <w:t>create_risk_score_chart</w:t>
+      </w:r>
+      <w:proofErr w:type="spellEnd"/>
+      <w:r>
+        <w:rPr>
+          <w:lang w:val="en-US"/>
+        </w:rPr>
+        <w:t xml:space="preserve">, </w:t>
+      </w:r>
+      <w:proofErr w:type="spellStart"/>
+      <w:r>
+        <w:rPr>
+          <w:lang w:val="en-US"/>
+        </w:rPr>
+        <w:t>create_monthly_status_chart</w:t>
+      </w:r>
+      <w:proofErr w:type="spellEnd"/>
+    </w:p>
+    <w:p>
+      <w:pPr>
+        <w:spacing w:line="240" w:lineRule="auto"/>
+        <w:rPr>
+          <w:lang w:val="en-US"/>
+        </w:rPr>
+      </w:pPr>
+    </w:p>
+    <w:p>
+      <w:pPr>
+        <w:spacing w:line="240" w:lineRule="auto"/>
+        <w:rPr>
+          <w:lang w:val="en-US"/>
+        </w:rPr>
+      </w:pPr>
+    </w:p>
+    <w:p>
+      <w:pPr>
+        <w:spacing w:line="240" w:lineRule="auto"/>
+        <w:rPr>
+          <w:lang w:val="en-US"/>
+        </w:rPr>
+      </w:pPr>
+      <w:proofErr w:type="spellStart"/>
+      <w:proofErr w:type="gramStart"/>
+      <w:r>
+        <w:rPr>
+          <w:lang w:val="en-US"/>
+        </w:rPr>
+        <w:t>def</w:t>
+      </w:r>
+      <w:proofErr w:type="spellEnd"/>
+      <w:proofErr w:type="gramEnd"/>
+      <w:r>
+        <w:rPr>
+          <w:lang w:val="en-US"/>
+        </w:rPr>
+        <w:t xml:space="preserve"> main():</w:t>
+      </w:r>
+    </w:p>
+    <w:p>
+      <w:pPr>
+        <w:spacing w:line="240" w:lineRule="auto"/>
+        <w:rPr>
+          <w:lang w:val="en-US"/>
+        </w:rPr>
+      </w:pPr>
+      <w:r>
+        <w:rPr>
+          <w:lang w:val="en-US"/>
+        </w:rPr>
+        <w:t xml:space="preserve">    </w:t>
+      </w:r>
+      <w:proofErr w:type="spellStart"/>
+      <w:proofErr w:type="gramStart"/>
+      <w:r>
+        <w:rPr>
+          <w:lang w:val="en-US"/>
+        </w:rPr>
+        <w:t>df</w:t>
+      </w:r>
+      <w:proofErr w:type="spellEnd"/>
+      <w:proofErr w:type="gramEnd"/>
+      <w:r>
+        <w:rPr>
+          <w:lang w:val="en-US"/>
+        </w:rPr>
+        <w:t xml:space="preserve"> = </w:t>
+      </w:r>
+      <w:proofErr w:type="spellStart"/>
+      <w:r>
+        <w:rPr>
+          <w:lang w:val="en-US"/>
+        </w:rPr>
+        <w:t>load_invoice_data</w:t>
+      </w:r>
+      <w:proofErr w:type="spellEnd"/>
+      <w:r>
+        <w:rPr>
+          <w:lang w:val="en-US"/>
+        </w:rPr>
+        <w:t>()</w:t>
+      </w:r>
+    </w:p>
+    <w:p>
+      <w:pPr>
+        <w:spacing w:line="240" w:lineRule="auto"/>
+        <w:rPr>
+          <w:lang w:val="en-US"/>
+        </w:rPr>
+      </w:pPr>
+      <w:r>
+        <w:rPr>
+          <w:lang w:val="en-US"/>
+        </w:rPr>
+        <w:t xml:space="preserve">    </w:t>
+      </w:r>
+      <w:proofErr w:type="spellStart"/>
+      <w:proofErr w:type="gramStart"/>
+      <w:r>
+        <w:rPr>
+          <w:lang w:val="en-US"/>
+        </w:rPr>
+        <w:t>df</w:t>
+      </w:r>
+      <w:proofErr w:type="spellEnd"/>
+      <w:proofErr w:type="gramEnd"/>
+      <w:r>
+        <w:rPr>
+          <w:lang w:val="en-US"/>
+        </w:rPr>
+        <w:t xml:space="preserve"> = </w:t>
+      </w:r>
+      <w:proofErr w:type="spellStart"/>
+      <w:r>
+        <w:rPr>
+          <w:lang w:val="en-US"/>
+        </w:rPr>
+        <w:t>add_date_columns</w:t>
+      </w:r>
+      <w:proofErr w:type="spellEnd"/>
+      <w:r>
+        <w:rPr>
+          <w:lang w:val="en-US"/>
+        </w:rPr>
+        <w:t>(</w:t>
+      </w:r>
+      <w:proofErr w:type="spellStart"/>
+      <w:r>
+        <w:rPr>
+          <w:lang w:val="en-US"/>
+        </w:rPr>
+        <w:t>df</w:t>
+      </w:r>
+      <w:proofErr w:type="spellEnd"/>
+      <w:r>
+        <w:rPr>
+          <w:lang w:val="en-US"/>
+        </w:rPr>
+        <w:t>)</w:t>
+      </w:r>
+    </w:p>
+    <w:p>
+      <w:pPr>
+        <w:spacing w:line="240" w:lineRule="auto"/>
+        <w:rPr>
+          <w:lang w:val="en-US"/>
+        </w:rPr>
+      </w:pPr>
+      <w:r>
+        <w:rPr>
+          <w:lang w:val="en-US"/>
+        </w:rPr>
+        <w:t xml:space="preserve">    </w:t>
+      </w:r>
+      <w:proofErr w:type="spellStart"/>
+      <w:r>
+        <w:rPr>
+          <w:lang w:val="en-US"/>
+        </w:rPr>
+        <w:t>status_counts</w:t>
+      </w:r>
+      <w:proofErr w:type="spellEnd"/>
+      <w:r>
+        <w:rPr>
+          <w:lang w:val="en-US"/>
+        </w:rPr>
+        <w:t xml:space="preserve"> = </w:t>
+      </w:r>
+      <w:proofErr w:type="spellStart"/>
+      <w:r>
+        <w:rPr>
+          <w:lang w:val="en-US"/>
+        </w:rPr>
+        <w:t>calculate_status_</w:t>
+      </w:r>
+      <w:proofErr w:type="gramStart"/>
+      <w:r>
+        <w:rPr>
+          <w:lang w:val="en-US"/>
+        </w:rPr>
+        <w:t>counts</w:t>
+      </w:r>
+      <w:proofErr w:type="spellEnd"/>
+      <w:r>
+        <w:rPr>
+          <w:lang w:val="en-US"/>
+        </w:rPr>
+        <w:t>(</w:t>
+      </w:r>
+      <w:proofErr w:type="spellStart"/>
+      <w:proofErr w:type="gramEnd"/>
+      <w:r>
+        <w:rPr>
+          <w:lang w:val="en-US"/>
+        </w:rPr>
+        <w:t>df</w:t>
+      </w:r>
+      <w:proofErr w:type="spellEnd"/>
+      <w:r>
+        <w:rPr>
+          <w:lang w:val="en-US"/>
+        </w:rPr>
+        <w:t>)</w:t>
+      </w:r>
+    </w:p>
+    <w:p>
+      <w:pPr>
+        <w:spacing w:line="240" w:lineRule="auto"/>
+        <w:rPr>
+          <w:lang w:val="en-US"/>
+        </w:rPr>
+      </w:pPr>
+      <w:r>
+        <w:rPr>
+          <w:lang w:val="en-US"/>
+        </w:rPr>
+        <w:t xml:space="preserve">    </w:t>
+      </w:r>
+      <w:proofErr w:type="gramStart"/>
+      <w:r>
+        <w:rPr>
+          <w:lang w:val="en-US"/>
+        </w:rPr>
+        <w:t>metrics</w:t>
+      </w:r>
+      <w:proofErr w:type="gramEnd"/>
+      <w:r>
+        <w:rPr>
+          <w:lang w:val="en-US"/>
+        </w:rPr>
+        <w:t xml:space="preserve"> = </w:t>
+      </w:r>
+      <w:proofErr w:type="spellStart"/>
+      <w:r>
+        <w:rPr>
+          <w:lang w:val="en-US"/>
+        </w:rPr>
+        <w:t>calculate_business_metrics</w:t>
+      </w:r>
+      <w:proofErr w:type="spellEnd"/>
+      <w:r>
+        <w:rPr>
+          <w:lang w:val="en-US"/>
+        </w:rPr>
+        <w:t>(</w:t>
+      </w:r>
+      <w:proofErr w:type="spellStart"/>
+      <w:r>
+        <w:rPr>
+          <w:lang w:val="en-US"/>
+        </w:rPr>
+        <w:t>df</w:t>
+      </w:r>
+      <w:proofErr w:type="spellEnd"/>
+      <w:r>
+        <w:rPr>
+          <w:lang w:val="en-US"/>
+        </w:rPr>
+        <w:t xml:space="preserve">, </w:t>
+      </w:r>
+      <w:proofErr w:type="spellStart"/>
+      <w:r>
+        <w:rPr>
+          <w:lang w:val="en-US"/>
+        </w:rPr>
+        <w:t>status_counts</w:t>
+      </w:r>
+      <w:proofErr w:type="spellEnd"/>
+      <w:r>
+        <w:rPr>
+          <w:lang w:val="en-US"/>
+        </w:rPr>
+        <w:t>)</w:t>
+      </w:r>
+    </w:p>
+    <w:p>
+      <w:pPr>
+        <w:spacing w:line="240" w:lineRule="auto"/>
+        <w:rPr>
+          <w:lang w:val="en-US"/>
+        </w:rPr>
+      </w:pPr>
+      <w:r>
+        <w:rPr>
+          <w:lang w:val="en-US"/>
+        </w:rPr>
+        <w:lastRenderedPageBreak/>
+        <w:t xml:space="preserve">    </w:t>
+      </w:r>
+      <w:proofErr w:type="gramStart"/>
+      <w:r>
+        <w:rPr>
+          <w:lang w:val="en-US"/>
+        </w:rPr>
+        <w:t>recommendation</w:t>
+      </w:r>
+      <w:proofErr w:type="gramEnd"/>
+      <w:r>
+        <w:rPr>
+          <w:lang w:val="en-US"/>
+        </w:rPr>
+        <w:t xml:space="preserve"> = </w:t>
+      </w:r>
+      <w:proofErr w:type="spellStart"/>
+      <w:r>
+        <w:rPr>
+          <w:lang w:val="en-US"/>
+        </w:rPr>
+        <w:t>create_recommendation</w:t>
+      </w:r>
+      <w:proofErr w:type="spellEnd"/>
+      <w:r>
+        <w:rPr>
+          <w:lang w:val="en-US"/>
+        </w:rPr>
+        <w:t>(metrics)</w:t>
+      </w:r>
+    </w:p>
+    <w:p>
+      <w:pPr>
+        <w:spacing w:line="240" w:lineRule="auto"/>
+        <w:rPr>
+          <w:lang w:val="en-US"/>
+        </w:rPr>
+      </w:pPr>
+      <w:r>
+        <w:rPr>
+          <w:lang w:val="en-US"/>
+        </w:rPr>
+        <w:t xml:space="preserve">    </w:t>
+      </w:r>
+      <w:proofErr w:type="spellStart"/>
+      <w:r>
+        <w:rPr>
+          <w:lang w:val="en-US"/>
+        </w:rPr>
+        <w:t>monthly_summary</w:t>
+      </w:r>
+      <w:proofErr w:type="spellEnd"/>
+      <w:r>
+        <w:rPr>
+          <w:lang w:val="en-US"/>
+        </w:rPr>
+        <w:t xml:space="preserve"> = </w:t>
+      </w:r>
+      <w:proofErr w:type="spellStart"/>
+      <w:r>
+        <w:rPr>
+          <w:lang w:val="en-US"/>
+        </w:rPr>
+        <w:t>create_monthly_</w:t>
+      </w:r>
+      <w:proofErr w:type="gramStart"/>
+      <w:r>
+        <w:rPr>
+          <w:lang w:val="en-US"/>
+        </w:rPr>
+        <w:t>summary</w:t>
+      </w:r>
+      <w:proofErr w:type="spellEnd"/>
+      <w:r>
+        <w:rPr>
+          <w:lang w:val="en-US"/>
+        </w:rPr>
+        <w:t>(</w:t>
+      </w:r>
+      <w:proofErr w:type="spellStart"/>
+      <w:proofErr w:type="gramEnd"/>
+      <w:r>
+        <w:rPr>
+          <w:lang w:val="en-US"/>
+        </w:rPr>
+        <w:t>df</w:t>
+      </w:r>
+      <w:proofErr w:type="spellEnd"/>
+      <w:r>
+        <w:rPr>
+          <w:lang w:val="en-US"/>
+        </w:rPr>
+        <w:t>)</w:t>
+      </w:r>
+    </w:p>
+    <w:p>
+      <w:pPr>
+        <w:spacing w:line="240" w:lineRule="auto"/>
+        <w:rPr>
+          <w:lang w:val="en-US"/>
+        </w:rPr>
+      </w:pPr>
+      <w:r>
+        <w:rPr>
+          <w:lang w:val="en-US"/>
+        </w:rPr>
+        <w:t xml:space="preserve">    </w:t>
+      </w:r>
+      <w:proofErr w:type="spellStart"/>
+      <w:r>
+        <w:rPr>
+          <w:lang w:val="en-US"/>
+        </w:rPr>
+        <w:t>monthly_status_summary</w:t>
+      </w:r>
+      <w:proofErr w:type="spellEnd"/>
+      <w:r>
+        <w:rPr>
+          <w:lang w:val="en-US"/>
+        </w:rPr>
+        <w:t xml:space="preserve"> = </w:t>
+      </w:r>
+      <w:proofErr w:type="spellStart"/>
+      <w:r>
+        <w:rPr>
+          <w:lang w:val="en-US"/>
+        </w:rPr>
+        <w:t>create_monthly_status_</w:t>
+      </w:r>
+      <w:proofErr w:type="gramStart"/>
+      <w:r>
+        <w:rPr>
+          <w:lang w:val="en-US"/>
+        </w:rPr>
+        <w:t>summary</w:t>
+      </w:r>
+      <w:proofErr w:type="spellEnd"/>
+      <w:r>
+        <w:rPr>
+          <w:lang w:val="en-US"/>
+        </w:rPr>
+        <w:t>(</w:t>
+      </w:r>
+      <w:proofErr w:type="spellStart"/>
+      <w:proofErr w:type="gramEnd"/>
+      <w:r>
+        <w:rPr>
+          <w:lang w:val="en-US"/>
+        </w:rPr>
+        <w:t>df</w:t>
+      </w:r>
+      <w:proofErr w:type="spellEnd"/>
+      <w:r>
+        <w:rPr>
+          <w:lang w:val="en-US"/>
+        </w:rPr>
+        <w:t>)</w:t>
+      </w:r>
+    </w:p>
+    <w:p>
+      <w:pPr>
+        <w:spacing w:line="240" w:lineRule="auto"/>
+        <w:rPr>
+          <w:lang w:val="en-US"/>
+        </w:rPr>
+      </w:pPr>
+      <w:r>
+        <w:rPr>
+          <w:lang w:val="en-US"/>
+        </w:rPr>
+        <w:t xml:space="preserve">    </w:t>
+      </w:r>
+      <w:proofErr w:type="spellStart"/>
+      <w:r>
+        <w:rPr>
+          <w:lang w:val="en-US"/>
+        </w:rPr>
+        <w:t>save_monthly_</w:t>
+      </w:r>
+      <w:proofErr w:type="gramStart"/>
+      <w:r>
+        <w:rPr>
+          <w:lang w:val="en-US"/>
+        </w:rPr>
+        <w:t>reports</w:t>
+      </w:r>
+      <w:proofErr w:type="spellEnd"/>
+      <w:r>
+        <w:rPr>
+          <w:lang w:val="en-US"/>
+        </w:rPr>
+        <w:t>(</w:t>
+      </w:r>
+      <w:proofErr w:type="spellStart"/>
+      <w:proofErr w:type="gramEnd"/>
+      <w:r>
+        <w:rPr>
+          <w:lang w:val="en-US"/>
+        </w:rPr>
+        <w:t>monthly_summary</w:t>
+      </w:r>
+      <w:proofErr w:type="spellEnd"/>
+      <w:r>
+        <w:rPr>
+          <w:lang w:val="en-US"/>
+        </w:rPr>
+        <w:t xml:space="preserve">, </w:t>
+      </w:r>
+      <w:proofErr w:type="spellStart"/>
+      <w:r>
+        <w:rPr>
+          <w:lang w:val="en-US"/>
+        </w:rPr>
+        <w:t>monthly_status_summary</w:t>
+      </w:r>
+      <w:proofErr w:type="spellEnd"/>
+      <w:r>
+        <w:rPr>
+          <w:lang w:val="en-US"/>
+        </w:rPr>
+        <w:t>)</w:t>
+      </w:r>
+    </w:p>
+    <w:p>
+      <w:pPr>
+        <w:spacing w:line="240" w:lineRule="auto"/>
+        <w:rPr>
+          <w:lang w:val="en-US"/>
+        </w:rPr>
+      </w:pPr>
+      <w:r>
+        <w:rPr>
+          <w:lang w:val="en-US"/>
+        </w:rPr>
+        <w:t xml:space="preserve">    </w:t>
+      </w:r>
+      <w:proofErr w:type="spellStart"/>
+      <w:r>
+        <w:rPr>
+          <w:lang w:val="en-US"/>
+        </w:rPr>
+        <w:t>save_summary_</w:t>
+      </w:r>
+      <w:proofErr w:type="gramStart"/>
+      <w:r>
+        <w:rPr>
+          <w:lang w:val="en-US"/>
+        </w:rPr>
+        <w:t>files</w:t>
+      </w:r>
+      <w:proofErr w:type="spellEnd"/>
+      <w:r>
+        <w:rPr>
+          <w:lang w:val="en-US"/>
+        </w:rPr>
+        <w:t>(</w:t>
+      </w:r>
+      <w:proofErr w:type="spellStart"/>
+      <w:proofErr w:type="gramEnd"/>
+      <w:r>
+        <w:rPr>
+          <w:lang w:val="en-US"/>
+        </w:rPr>
+        <w:t>df</w:t>
+      </w:r>
+      <w:proofErr w:type="spellEnd"/>
+      <w:r>
+        <w:rPr>
+          <w:lang w:val="en-US"/>
+        </w:rPr>
+        <w:t xml:space="preserve">, </w:t>
+      </w:r>
+      <w:proofErr w:type="spellStart"/>
+      <w:r>
+        <w:rPr>
+          <w:lang w:val="en-US"/>
+        </w:rPr>
+        <w:t>status_counts</w:t>
+      </w:r>
+      <w:proofErr w:type="spellEnd"/>
+      <w:r>
+        <w:rPr>
+          <w:lang w:val="en-US"/>
+        </w:rPr>
+        <w:t>, metrics, recommendation)</w:t>
+      </w:r>
+    </w:p>
+    <w:p>
+      <w:pPr>
+        <w:spacing w:line="240" w:lineRule="auto"/>
+        <w:rPr>
+          <w:lang w:val="en-US"/>
+        </w:rPr>
+      </w:pPr>
+      <w:r>
+        <w:rPr>
+          <w:lang w:val="en-US"/>
+        </w:rPr>
+        <w:t xml:space="preserve">    </w:t>
+      </w:r>
+      <w:proofErr w:type="spellStart"/>
+      <w:r>
+        <w:rPr>
+          <w:lang w:val="en-US"/>
+        </w:rPr>
+        <w:t>create_status_</w:t>
+      </w:r>
+      <w:proofErr w:type="gramStart"/>
+      <w:r>
+        <w:rPr>
+          <w:lang w:val="en-US"/>
+        </w:rPr>
+        <w:t>chart</w:t>
+      </w:r>
+      <w:proofErr w:type="spellEnd"/>
+      <w:r>
+        <w:rPr>
+          <w:lang w:val="en-US"/>
+        </w:rPr>
+        <w:t>(</w:t>
+      </w:r>
+      <w:proofErr w:type="spellStart"/>
+      <w:proofErr w:type="gramEnd"/>
+      <w:r>
+        <w:rPr>
+          <w:lang w:val="en-US"/>
+        </w:rPr>
+        <w:t>status_counts</w:t>
+      </w:r>
+      <w:proofErr w:type="spellEnd"/>
+      <w:r>
+        <w:rPr>
+          <w:lang w:val="en-US"/>
+        </w:rPr>
+        <w:t>)</w:t>
+      </w:r>
+    </w:p>
+    <w:p>
+      <w:pPr>
+        <w:spacing w:line="240" w:lineRule="auto"/>
+        <w:rPr>
+          <w:lang w:val="en-US"/>
+        </w:rPr>
+      </w:pPr>
+      <w:r>
+        <w:rPr>
+          <w:lang w:val="en-US"/>
+        </w:rPr>
+        <w:t xml:space="preserve">    </w:t>
+      </w:r>
+      <w:proofErr w:type="spellStart"/>
+      <w:r>
+        <w:rPr>
+          <w:lang w:val="en-US"/>
+        </w:rPr>
+        <w:t>create_risk_score_</w:t>
+      </w:r>
+      <w:proofErr w:type="gramStart"/>
+      <w:r>
+        <w:rPr>
+          <w:lang w:val="en-US"/>
+        </w:rPr>
+        <w:t>chart</w:t>
+      </w:r>
+      <w:proofErr w:type="spellEnd"/>
+      <w:r>
+        <w:rPr>
+          <w:lang w:val="en-US"/>
+        </w:rPr>
+        <w:t>(</w:t>
+      </w:r>
+      <w:proofErr w:type="spellStart"/>
+      <w:proofErr w:type="gramEnd"/>
+      <w:r>
+        <w:rPr>
+          <w:lang w:val="en-US"/>
+        </w:rPr>
+        <w:t>df</w:t>
+      </w:r>
+      <w:proofErr w:type="spellEnd"/>
+      <w:r>
+        <w:rPr>
+          <w:lang w:val="en-US"/>
+        </w:rPr>
+        <w:t>)</w:t>
+      </w:r>
+    </w:p>
+    <w:p>
+      <w:pPr>
+        <w:spacing w:line="240" w:lineRule="auto"/>
+        <w:rPr>
+          <w:lang w:val="en-US"/>
+        </w:rPr>
+      </w:pPr>
+      <w:r>
+        <w:rPr>
+          <w:lang w:val="en-US"/>
+        </w:rPr>
+        <w:t xml:space="preserve">    </w:t>
+      </w:r>
+      <w:proofErr w:type="spellStart"/>
+      <w:r>
+        <w:rPr>
+          <w:lang w:val="en-US"/>
+        </w:rPr>
+        <w:t>create_monthly_status_</w:t>
+      </w:r>
+      <w:proofErr w:type="gramStart"/>
+      <w:r>
+        <w:rPr>
+          <w:lang w:val="en-US"/>
+        </w:rPr>
+        <w:t>chart</w:t>
+      </w:r>
+      <w:proofErr w:type="spellEnd"/>
+      <w:r>
+        <w:rPr>
+          <w:lang w:val="en-US"/>
+        </w:rPr>
+        <w:t>(</w:t>
+      </w:r>
+      <w:proofErr w:type="spellStart"/>
+      <w:proofErr w:type="gramEnd"/>
+      <w:r>
+        <w:rPr>
+          <w:lang w:val="en-US"/>
+        </w:rPr>
+        <w:t>monthly_status_summary</w:t>
+      </w:r>
+      <w:proofErr w:type="spellEnd"/>
+      <w:r>
+        <w:rPr>
+          <w:lang w:val="en-US"/>
+        </w:rPr>
+        <w:t>)</w:t>
+      </w:r>
+    </w:p>
+    <w:p>
+      <w:pPr>
+        <w:spacing w:line="240" w:lineRule="auto"/>
+        <w:rPr>
+          <w:lang w:val="en-US"/>
+        </w:rPr>
+      </w:pPr>
+    </w:p>
+    <w:p>
+      <w:pPr>
+        <w:spacing w:line="240" w:lineRule="auto"/>
+        <w:rPr>
+          <w:lang w:val="en-US"/>
+        </w:rPr>
+      </w:pPr>
+    </w:p>
+    <w:p>
+      <w:pPr>
+        <w:spacing w:line="240" w:lineRule="auto"/>
+        <w:rPr>
+          <w:lang w:val="en-US"/>
+        </w:rPr>
+      </w:pPr>
+      <w:proofErr w:type="gramStart"/>
+      <w:r>
+        <w:rPr>
+          <w:lang w:val="en-US"/>
+        </w:rPr>
+        <w:t>if</w:t>
+      </w:r>
+      <w:proofErr w:type="gramEnd"/>
+      <w:r>
+        <w:rPr>
+          <w:lang w:val="en-US"/>
+        </w:rPr>
+        <w:t xml:space="preserve"> __name__ == "__main__":</w:t>
+      </w:r>
+    </w:p>
+    <w:p>
+      <w:pPr>
+        <w:spacing w:line="240" w:lineRule="auto"/>
+        <w:rPr>
+          <w:lang w:val="en-US"/>
+        </w:rPr>
+      </w:pPr>
+      <w:r>
+        <w:rPr>
+          <w:lang w:val="en-US"/>
+        </w:rPr>
+        <w:t xml:space="preserve">    </w:t>
+      </w:r>
+      <w:proofErr w:type="gramStart"/>
+      <w:r>
+        <w:rPr>
+          <w:lang w:val="en-US"/>
+        </w:rPr>
+        <w:t>main()</w:t>
+      </w:r>
+      <w:proofErr w:type="gramEnd"/>
+    </w:p>
+    <w:p>
+      <w:pPr>
+        <w:pBdr>
+          <w:bottom w:val="single" w:sz="12" w:space="1" w:color="auto"/>
+        </w:pBdr>
+        <w:spacing w:line="240" w:lineRule="auto"/>
+        <w:rPr>
+          <w:lang w:val="en-US"/>
+        </w:rPr>
+      </w:pPr>
+    </w:p>
+    <w:p>
+      <w:pPr>
+        <w:spacing w:line="240" w:lineRule="auto"/>
+        <w:rPr>
+          <w:rFonts w:ascii="Segoe UI" w:hAnsi="Segoe UI" w:cs="Segoe UI"/>
+          <w:color w:val="FFFFFF"/>
+          <w:sz w:val="21"/>
+          <w:szCs w:val="21"/>
+          <w:shd w:val="clear" w:color="auto" w:fill="181818"/>
+        </w:rPr>
+      </w:pPr>
+      <w:r>
+        <w:rPr>
+          <w:rFonts w:ascii="Segoe UI" w:hAnsi="Segoe UI" w:cs="Segoe UI"/>
+          <w:color w:val="FFFFFF"/>
+          <w:sz w:val="21"/>
+          <w:szCs w:val="21"/>
+          <w:shd w:val="clear" w:color="auto" w:fill="181818"/>
+        </w:rPr>
+        <w:t>A futura separação vai ficar assim:</w:t>
+      </w:r>
+    </w:p>
+    <w:p>
+      <w:pPr>
+        <w:spacing w:line="240" w:lineRule="auto"/>
+        <w:rPr>
+          <w:u w:val="single"/>
+          <w:lang w:val="en-US"/>
+        </w:rPr>
+      </w:pPr>
+      <w:proofErr w:type="gramStart"/>
+      <w:r>
+        <w:rPr>
+          <w:u w:val="single"/>
+          <w:lang w:val="en-US"/>
+        </w:rPr>
+        <w:t>services</w:t>
+      </w:r>
+      <w:proofErr w:type="gramEnd"/>
+      <w:r>
+        <w:rPr>
+          <w:u w:val="single"/>
+          <w:lang w:val="en-US"/>
+        </w:rPr>
+        <w:t>/</w:t>
+      </w:r>
+    </w:p>
+    <w:p>
+      <w:pPr>
+        <w:spacing w:line="240" w:lineRule="auto"/>
+        <w:rPr>
+          <w:u w:val="single"/>
+          <w:lang w:val="en-US"/>
+        </w:rPr>
+      </w:pPr>
+      <w:r>
+        <w:rPr>
+          <w:rFonts w:ascii="Arial" w:hAnsi="Arial" w:cs="Arial"/>
+          <w:u w:val="single"/>
+          <w:lang w:val="en-US"/>
+        </w:rPr>
+        <w:t>├</w:t>
+      </w:r>
+      <w:r>
+        <w:rPr>
+          <w:rFonts w:ascii="Calibri" w:hAnsi="Calibri" w:cs="Calibri"/>
+          <w:u w:val="single"/>
+          <w:lang w:val="en-US"/>
+        </w:rPr>
+        <w:t>──</w:t>
+      </w:r>
+      <w:r>
+        <w:rPr>
+          <w:u w:val="single"/>
+          <w:lang w:val="en-US"/>
+        </w:rPr>
+        <w:t xml:space="preserve"> document_loader.py</w:t>
+      </w:r>
+    </w:p>
+    <w:p>
+      <w:pPr>
+        <w:spacing w:line="240" w:lineRule="auto"/>
+        <w:rPr>
+          <w:u w:val="single"/>
+          <w:lang w:val="en-US"/>
+        </w:rPr>
+      </w:pPr>
+      <w:r>
+        <w:rPr>
+          <w:rFonts w:ascii="Arial" w:hAnsi="Arial" w:cs="Arial"/>
+          <w:u w:val="single"/>
+          <w:lang w:val="en-US"/>
+        </w:rPr>
+        <w:t>├</w:t>
+      </w:r>
+      <w:r>
+        <w:rPr>
+          <w:rFonts w:ascii="Calibri" w:hAnsi="Calibri" w:cs="Calibri"/>
+          <w:u w:val="single"/>
+          <w:lang w:val="en-US"/>
+        </w:rPr>
+        <w:t>──</w:t>
+      </w:r>
+      <w:r>
+        <w:rPr>
+          <w:u w:val="single"/>
+          <w:lang w:val="en-US"/>
+        </w:rPr>
+        <w:t xml:space="preserve"> extractor.py</w:t>
+      </w:r>
+    </w:p>
+    <w:p>
+      <w:pPr>
+        <w:spacing w:line="240" w:lineRule="auto"/>
+        <w:rPr>
+          <w:u w:val="single"/>
+        </w:rPr>
+      </w:pPr>
+      <w:r>
+        <w:rPr>
+          <w:rFonts w:ascii="Arial" w:hAnsi="Arial" w:cs="Arial"/>
+          <w:u w:val="single"/>
+        </w:rPr>
+        <w:t>├</w:t>
+      </w:r>
+      <w:r>
+        <w:rPr>
+          <w:rFonts w:ascii="Calibri" w:hAnsi="Calibri" w:cs="Calibri"/>
+          <w:u w:val="single"/>
+        </w:rPr>
+        <w:t>──</w:t>
+      </w:r>
+      <w:r>
+        <w:rPr>
+          <w:u w:val="single"/>
+        </w:rPr>
+        <w:t xml:space="preserve"> </w:t>
+      </w:r>
+      <w:proofErr w:type="gramStart"/>
+      <w:r>
+        <w:rPr>
+          <w:u w:val="single"/>
+        </w:rPr>
+        <w:t>validator.</w:t>
+      </w:r>
+      <w:proofErr w:type="gramEnd"/>
+      <w:r>
+        <w:rPr>
+          <w:u w:val="single"/>
+        </w:rPr>
+        <w:t>py</w:t>
+      </w:r>
+    </w:p>
+    <w:p>
+      <w:pPr>
+        <w:spacing w:line="240" w:lineRule="auto"/>
+        <w:rPr>
+          <w:u w:val="single"/>
+        </w:rPr>
+      </w:pPr>
+      <w:r>
+        <w:rPr>
+          <w:rFonts w:ascii="Arial" w:hAnsi="Arial" w:cs="Arial"/>
+          <w:u w:val="single"/>
+        </w:rPr>
+        <w:t>├</w:t>
+      </w:r>
+      <w:r>
+        <w:rPr>
+          <w:rFonts w:ascii="Calibri" w:hAnsi="Calibri" w:cs="Calibri"/>
+          <w:u w:val="single"/>
+        </w:rPr>
+        <w:t>──</w:t>
+      </w:r>
+      <w:r>
+        <w:rPr>
+          <w:u w:val="single"/>
+        </w:rPr>
+        <w:t xml:space="preserve"> </w:t>
+      </w:r>
+      <w:proofErr w:type="gramStart"/>
+      <w:r>
+        <w:rPr>
+          <w:u w:val="single"/>
+        </w:rPr>
+        <w:t>reporter.</w:t>
+      </w:r>
+      <w:proofErr w:type="gramEnd"/>
+      <w:r>
+        <w:rPr>
+          <w:u w:val="single"/>
+        </w:rPr>
+        <w:t>py</w:t>
+      </w:r>
+    </w:p>
+    <w:p>
+      <w:pPr>
+        <w:pBdr>
+          <w:bottom w:val="single" w:sz="12" w:space="1" w:color="auto"/>
+        </w:pBdr>
+        <w:spacing w:line="240" w:lineRule="auto"/>
+        <w:rPr>
+          <w:u w:val="single"/>
+        </w:rPr>
+      </w:pPr>
+      <w:r>
+        <w:rPr>
+          <w:u w:val="single"/>
+        </w:rPr>
+        <w:t xml:space="preserve">└── </w:t>
+      </w:r>
+      <w:proofErr w:type="gramStart"/>
+      <w:r>
+        <w:rPr>
+          <w:u w:val="single"/>
+        </w:rPr>
+        <w:t>csv_exporter.</w:t>
+      </w:r>
+      <w:proofErr w:type="gramEnd"/>
+      <w:r>
+        <w:rPr>
+          <w:u w:val="single"/>
+        </w:rPr>
+        <w:t>py</w:t>
+      </w:r>
+    </w:p>
+    <w:p>
+      <w:pPr>
+        <w:spacing w:line="240" w:lineRule="auto"/>
+        <w:rPr>
+          <w:lang w:val="en-US"/>
+        </w:rPr>
+      </w:pPr>
+      <w:r>
+        <w:rPr>
+          <w:lang w:val="en-US"/>
+        </w:rPr>
+        <w:t>invoice_analyzer.py -&gt; controls the workflow</w:t>
+      </w:r>
+    </w:p>
+    <w:p>
+      <w:pPr>
+        <w:pBdr>
+          <w:bottom w:val="single" w:sz="12" w:space="1" w:color="auto"/>
+        </w:pBdr>
+        <w:spacing w:line="240" w:lineRule="auto"/>
+      </w:pPr>
+      <w:proofErr w:type="spellStart"/>
+      <w:proofErr w:type="gramStart"/>
+      <w:r>
+        <w:t>services</w:t>
+      </w:r>
+      <w:proofErr w:type="spellEnd"/>
+      <w:proofErr w:type="gramEnd"/>
+      <w:r>
+        <w:t xml:space="preserve">/ -&gt; </w:t>
+      </w:r>
+      <w:proofErr w:type="spellStart"/>
+      <w:r>
+        <w:t>stores</w:t>
+      </w:r>
+      <w:proofErr w:type="spellEnd"/>
+      <w:r>
+        <w:t xml:space="preserve"> </w:t>
+      </w:r>
+      <w:proofErr w:type="spellStart"/>
+      <w:r>
+        <w:t>reusable</w:t>
+      </w:r>
+      <w:proofErr w:type="spellEnd"/>
+      <w:r>
+        <w:t xml:space="preserve"> </w:t>
+      </w:r>
+      <w:proofErr w:type="spellStart"/>
+      <w:r>
+        <w:t>functions</w:t>
+      </w:r>
+      <w:proofErr w:type="spellEnd"/>
+    </w:p>
+    <w:p>
+      <w:pPr>
+        <w:spacing w:line="240" w:lineRule="auto"/>
       </w:pPr>
       <w:bookmarkStart w:id="0" w:name="_GoBack"/>
       <w:bookmarkEnd w:id="0"/>

</xml_diff>

<commit_message>
add analysis_loader.py and Imports first. Constants after imports. Functions after constants. main at the end.
</commit_message>
<xml_diff>
--- a/Info_project/AI + ML + Automation + Data Project.docx
+++ b/Info_project/AI + ML + Automation + Data Project.docx
@@ -13370,9 +13370,340 @@
     <w:p>
       <w:pPr>
         <w:spacing w:line="240" w:lineRule="auto"/>
+        <w:rPr>
+          <w:lang w:val="en-US"/>
+        </w:rPr>
+      </w:pPr>
+      <w:r>
+        <w:rPr>
+          <w:lang w:val="en-US"/>
+        </w:rPr>
+        <w:t>O que temos agora:</w:t>
+      </w:r>
+    </w:p>
+    <w:p>
+      <w:pPr>
+        <w:spacing w:line="240" w:lineRule="auto"/>
+        <w:rPr>
+          <w:lang w:val="en-US"/>
+        </w:rPr>
+      </w:pPr>
+      <w:proofErr w:type="spellStart"/>
+      <w:r>
+        <w:rPr>
+          <w:lang w:val="en-US"/>
+        </w:rPr>
+        <w:t>sample_documents</w:t>
+      </w:r>
+      <w:proofErr w:type="spellEnd"/>
+      <w:r>
+        <w:rPr>
+          <w:lang w:val="en-US"/>
+        </w:rPr>
+        <w:t>/*.</w:t>
+      </w:r>
+      <w:proofErr w:type="spellStart"/>
+      <w:r>
+        <w:rPr>
+          <w:lang w:val="en-US"/>
+        </w:rPr>
+        <w:t>txt</w:t>
+      </w:r>
+      <w:proofErr w:type="spellEnd"/>
+      <w:r>
+        <w:rPr>
+          <w:lang w:val="en-US"/>
+        </w:rPr>
+        <w:t xml:space="preserve"> </w:t>
+      </w:r>
+    </w:p>
+    <w:p>
+      <w:pPr>
+        <w:spacing w:line="240" w:lineRule="auto"/>
+        <w:rPr>
+          <w:lang w:val="en-US"/>
+        </w:rPr>
+      </w:pPr>
+      <w:r>
+        <w:rPr>
+          <w:lang w:val="en-US"/>
+        </w:rPr>
+        <w:t xml:space="preserve">↓ invoice_analyzer.py </w:t>
+      </w:r>
+    </w:p>
+    <w:p>
+      <w:pPr>
+        <w:spacing w:line="240" w:lineRule="auto"/>
+        <w:rPr>
+          <w:lang w:val="en-US"/>
+        </w:rPr>
+      </w:pPr>
+      <w:r>
+        <w:rPr>
+          <w:lang w:val="en-US"/>
+        </w:rPr>
+        <w:t xml:space="preserve">↓ </w:t>
+      </w:r>
+      <w:proofErr w:type="spellStart"/>
+      <w:proofErr w:type="gramStart"/>
+      <w:r>
+        <w:rPr>
+          <w:lang w:val="en-US"/>
+        </w:rPr>
+        <w:t>services</w:t>
+      </w:r>
+      <w:proofErr w:type="spellEnd"/>
+      <w:proofErr w:type="gramEnd"/>
+      <w:r>
+        <w:rPr>
+          <w:lang w:val="en-US"/>
+        </w:rPr>
+        <w:t xml:space="preserve">/ </w:t>
+      </w:r>
+    </w:p>
+    <w:p>
+      <w:pPr>
+        <w:spacing w:line="240" w:lineRule="auto"/>
+        <w:rPr>
+          <w:lang w:val="en-US"/>
+        </w:rPr>
+      </w:pPr>
+      <w:r>
+        <w:rPr>
+          <w:lang w:val="en-US"/>
+        </w:rPr>
+        <w:t xml:space="preserve">↓ </w:t>
+      </w:r>
+      <w:proofErr w:type="spellStart"/>
+      <w:r>
+        <w:rPr>
+          <w:lang w:val="en-US"/>
+        </w:rPr>
+        <w:t>reports</w:t>
+      </w:r>
+      <w:proofErr w:type="spellEnd"/>
+      <w:r>
+        <w:rPr>
+          <w:lang w:val="en-US"/>
+        </w:rPr>
+        <w:t xml:space="preserve">/invoice_results.csv </w:t>
+      </w:r>
+    </w:p>
+    <w:p>
+      <w:pPr>
+        <w:spacing w:line="240" w:lineRule="auto"/>
+        <w:rPr>
+          <w:lang w:val="en-US"/>
+        </w:rPr>
+      </w:pPr>
+      <w:r>
+        <w:rPr>
+          <w:lang w:val="en-US"/>
+        </w:rPr>
+        <w:t xml:space="preserve">↓ invoice_data_analysis.py </w:t>
+      </w:r>
+    </w:p>
+    <w:p>
+      <w:pPr>
+        <w:pBdr>
+          <w:bottom w:val="single" w:sz="12" w:space="1" w:color="auto"/>
+        </w:pBdr>
+        <w:spacing w:line="240" w:lineRule="auto"/>
+        <w:rPr>
+          <w:lang w:val="en-US"/>
+        </w:rPr>
+      </w:pPr>
+      <w:r>
+        <w:rPr>
+          <w:lang w:val="en-US"/>
+        </w:rPr>
+        <w:t xml:space="preserve">↓ </w:t>
+      </w:r>
+      <w:proofErr w:type="spellStart"/>
+      <w:r>
+        <w:rPr>
+          <w:lang w:val="en-US"/>
+        </w:rPr>
+        <w:t>reports</w:t>
+      </w:r>
+      <w:proofErr w:type="spellEnd"/>
+      <w:r>
+        <w:rPr>
+          <w:lang w:val="en-US"/>
+        </w:rPr>
+        <w:t xml:space="preserve"> CSV + JSON + charts</w:t>
+      </w:r>
+    </w:p>
+    <w:p>
+      <w:pPr>
+        <w:spacing w:line="240" w:lineRule="auto"/>
+        <w:rPr>
+          <w:lang w:val="en-US"/>
+        </w:rPr>
+      </w:pPr>
+    </w:p>
+    <w:p>
+      <w:pPr>
+        <w:spacing w:line="240" w:lineRule="auto"/>
+        <w:rPr>
+          <w:lang w:val="en-US"/>
+        </w:rPr>
+      </w:pPr>
+      <w:r>
+        <w:rPr>
+          <w:lang w:val="en-US"/>
+        </w:rPr>
+        <w:t>Próximo passo natural: fazer a mesma separação para </w:t>
+      </w:r>
+      <w:proofErr w:type="gramStart"/>
+      <w:r>
+        <w:rPr>
+          <w:lang w:val="en-US"/>
+        </w:rPr>
+        <w:t>invoice_data_analysis.</w:t>
+      </w:r>
+      <w:proofErr w:type="gramEnd"/>
+      <w:r>
+        <w:rPr>
+          <w:lang w:val="en-US"/>
+        </w:rPr>
+        <w:t>py, criando serviços como:</w:t>
+      </w:r>
+    </w:p>
+    <w:p>
+      <w:pPr>
+        <w:spacing w:line="240" w:lineRule="auto"/>
+        <w:rPr>
+          <w:lang w:val="en-US"/>
+        </w:rPr>
+      </w:pPr>
+      <w:proofErr w:type="gramStart"/>
+      <w:r>
+        <w:rPr>
+          <w:lang w:val="en-US"/>
+        </w:rPr>
+        <w:t>services/data_loader.py</w:t>
+      </w:r>
+      <w:proofErr w:type="gramEnd"/>
+      <w:r>
+        <w:rPr>
+          <w:lang w:val="en-US"/>
+        </w:rPr>
+        <w:t xml:space="preserve"> s</w:t>
+      </w:r>
+    </w:p>
+    <w:p>
+      <w:pPr>
+        <w:spacing w:line="240" w:lineRule="auto"/>
+        <w:rPr>
+          <w:lang w:val="en-US"/>
+        </w:rPr>
+      </w:pPr>
+      <w:proofErr w:type="gramStart"/>
+      <w:r>
+        <w:rPr>
+          <w:lang w:val="en-US"/>
+        </w:rPr>
+        <w:t>ervices/analytics.py</w:t>
+      </w:r>
+      <w:proofErr w:type="gramEnd"/>
+      <w:r>
+        <w:rPr>
+          <w:lang w:val="en-US"/>
+        </w:rPr>
+        <w:t xml:space="preserve"> </w:t>
+      </w:r>
+    </w:p>
+    <w:p>
+      <w:pPr>
+        <w:spacing w:line="240" w:lineRule="auto"/>
+        <w:rPr>
+          <w:lang w:val="en-US"/>
+        </w:rPr>
+      </w:pPr>
+      <w:proofErr w:type="gramStart"/>
+      <w:r>
+        <w:rPr>
+          <w:lang w:val="en-US"/>
+        </w:rPr>
+        <w:t>services/recommendations.py</w:t>
+      </w:r>
+      <w:proofErr w:type="gramEnd"/>
+      <w:r>
+        <w:rPr>
+          <w:lang w:val="en-US"/>
+        </w:rPr>
+        <w:t xml:space="preserve"> </w:t>
+      </w:r>
+    </w:p>
+    <w:p>
+      <w:pPr>
+        <w:spacing w:line="240" w:lineRule="auto"/>
+        <w:rPr>
+          <w:lang w:val="en-US"/>
+        </w:rPr>
+      </w:pPr>
+      <w:proofErr w:type="gramStart"/>
+      <w:r>
+        <w:rPr>
+          <w:lang w:val="en-US"/>
+        </w:rPr>
+        <w:lastRenderedPageBreak/>
+        <w:t>services/charts.py</w:t>
+      </w:r>
+      <w:proofErr w:type="gramEnd"/>
+      <w:r>
+        <w:rPr>
+          <w:lang w:val="en-US"/>
+        </w:rPr>
+        <w:t xml:space="preserve"> s</w:t>
+      </w:r>
+    </w:p>
+    <w:p>
+      <w:pPr>
+        <w:pBdr>
+          <w:bottom w:val="single" w:sz="12" w:space="1" w:color="auto"/>
+        </w:pBdr>
+        <w:spacing w:line="240" w:lineRule="auto"/>
+        <w:rPr>
+          <w:lang w:val="en-US"/>
+        </w:rPr>
+      </w:pPr>
+      <w:proofErr w:type="gramStart"/>
+      <w:r>
+        <w:rPr>
+          <w:lang w:val="en-US"/>
+        </w:rPr>
+        <w:t>ervices/report_exporter.py</w:t>
+      </w:r>
+      <w:proofErr w:type="gramEnd"/>
+    </w:p>
+    <w:p>
+      <w:pPr>
+        <w:spacing w:line="240" w:lineRule="auto"/>
+        <w:rPr>
+          <w:lang w:val="en-US"/>
+        </w:rPr>
       </w:pPr>
       <w:bookmarkStart w:id="0" w:name="_GoBack"/>
       <w:bookmarkEnd w:id="0"/>
+    </w:p>
+    <w:p>
+      <w:pPr>
+        <w:spacing w:line="240" w:lineRule="auto"/>
+        <w:rPr>
+          <w:u w:val="single"/>
+          <w:lang w:val="en-US"/>
+        </w:rPr>
+      </w:pPr>
+    </w:p>
+    <w:p>
+      <w:pPr>
+        <w:spacing w:line="240" w:lineRule="auto"/>
+        <w:rPr>
+          <w:lang w:val="en-US"/>
+        </w:rPr>
+      </w:pPr>
     </w:p>
     <w:sectPr>
       <w:pgSz w:w="11906" w:h="16838"/>

</xml_diff>